<commit_message>
Ajustes do orientador: periodo de busca sem restricao, categoria Software/Aplicativo pela Ficha da Area Interdisciplinar, licenca GPLv3 como no repositorio; sem marcadores PENDENTE
Co-Authored-By: Claude Sonnet 5.5 <noreply@anthropic.com>
</commit_message>
<xml_diff>
--- a/redacao/UCP/saida/Raphael_Eiras-Decomposicao_por_aspecto_do_sentimento_em_avaliacoes_do_airbnb_rj-ucp_2026-UCP.docx
+++ b/redacao/UCP/saida/Raphael_Eiras-Decomposicao_por_aspecto_do_sentimento_em_avaliacoes_do_airbnb_rj-ucp_2026-UCP.docx
@@ -504,7 +504,7 @@
       <w:r>
         <w:fldChar w:fldCharType="separate"/>
       </w:r>
-      <w:hyperlink w:anchor="_Toc243082397" w:history="1">
+      <w:hyperlink w:anchor="_Toc243083402" w:history="1">
         <w:r>
           <w:rPr>
             <w:rStyle w:val="Hyperlink"/>
@@ -531,7 +531,7 @@
             <w:noProof/>
             <w:webHidden/>
           </w:rPr>
-          <w:instrText xml:space="preserve"> PAGEREF _Toc243082397 \h </w:instrText>
+          <w:instrText xml:space="preserve"> PAGEREF _Toc243083402 \h </w:instrText>
         </w:r>
         <w:r>
           <w:rPr>
@@ -577,7 +577,7 @@
           <w14:ligatures w14:val="standardContextual"/>
         </w:rPr>
       </w:pPr>
-      <w:hyperlink w:anchor="_Toc243082398" w:history="1">
+      <w:hyperlink w:anchor="_Toc243083403" w:history="1">
         <w:r>
           <w:rPr>
             <w:rStyle w:val="Hyperlink"/>
@@ -627,7 +627,7 @@
             <w:noProof/>
             <w:webHidden/>
           </w:rPr>
-          <w:instrText xml:space="preserve"> PAGEREF _Toc243082398 \h </w:instrText>
+          <w:instrText xml:space="preserve"> PAGEREF _Toc243083403 \h </w:instrText>
         </w:r>
         <w:r>
           <w:rPr>
@@ -673,7 +673,7 @@
           <w14:ligatures w14:val="standardContextual"/>
         </w:rPr>
       </w:pPr>
-      <w:hyperlink w:anchor="_Toc243082399" w:history="1">
+      <w:hyperlink w:anchor="_Toc243083404" w:history="1">
         <w:r>
           <w:rPr>
             <w:rStyle w:val="Hyperlink"/>
@@ -700,7 +700,7 @@
             <w:noProof/>
             <w:webHidden/>
           </w:rPr>
-          <w:instrText xml:space="preserve"> PAGEREF _Toc243082399 \h </w:instrText>
+          <w:instrText xml:space="preserve"> PAGEREF _Toc243083404 \h </w:instrText>
         </w:r>
         <w:r>
           <w:rPr>
@@ -746,7 +746,7 @@
           <w14:ligatures w14:val="standardContextual"/>
         </w:rPr>
       </w:pPr>
-      <w:hyperlink w:anchor="_Toc243082400" w:history="1">
+      <w:hyperlink w:anchor="_Toc243083405" w:history="1">
         <w:r>
           <w:rPr>
             <w:rStyle w:val="Hyperlink"/>
@@ -773,7 +773,7 @@
             <w:noProof/>
             <w:webHidden/>
           </w:rPr>
-          <w:instrText xml:space="preserve"> PAGEREF _Toc243082400 \h </w:instrText>
+          <w:instrText xml:space="preserve"> PAGEREF _Toc243083405 \h </w:instrText>
         </w:r>
         <w:r>
           <w:rPr>
@@ -819,7 +819,7 @@
           <w14:ligatures w14:val="standardContextual"/>
         </w:rPr>
       </w:pPr>
-      <w:hyperlink w:anchor="_Toc243082401" w:history="1">
+      <w:hyperlink w:anchor="_Toc243083406" w:history="1">
         <w:r>
           <w:rPr>
             <w:rStyle w:val="Hyperlink"/>
@@ -846,7 +846,7 @@
             <w:noProof/>
             <w:webHidden/>
           </w:rPr>
-          <w:instrText xml:space="preserve"> PAGEREF _Toc243082401 \h </w:instrText>
+          <w:instrText xml:space="preserve"> PAGEREF _Toc243083406 \h </w:instrText>
         </w:r>
         <w:r>
           <w:rPr>
@@ -892,7 +892,7 @@
           <w14:ligatures w14:val="standardContextual"/>
         </w:rPr>
       </w:pPr>
-      <w:hyperlink w:anchor="_Toc243082402" w:history="1">
+      <w:hyperlink w:anchor="_Toc243083407" w:history="1">
         <w:r>
           <w:rPr>
             <w:rStyle w:val="Hyperlink"/>
@@ -919,7 +919,7 @@
             <w:noProof/>
             <w:webHidden/>
           </w:rPr>
-          <w:instrText xml:space="preserve"> PAGEREF _Toc243082402 \h </w:instrText>
+          <w:instrText xml:space="preserve"> PAGEREF _Toc243083407 \h </w:instrText>
         </w:r>
         <w:r>
           <w:rPr>
@@ -965,7 +965,7 @@
           <w14:ligatures w14:val="standardContextual"/>
         </w:rPr>
       </w:pPr>
-      <w:hyperlink w:anchor="_Toc243082403" w:history="1">
+      <w:hyperlink w:anchor="_Toc243083408" w:history="1">
         <w:r>
           <w:rPr>
             <w:rStyle w:val="Hyperlink"/>
@@ -992,7 +992,7 @@
             <w:noProof/>
             <w:webHidden/>
           </w:rPr>
-          <w:instrText xml:space="preserve"> PAGEREF _Toc243082403 \h </w:instrText>
+          <w:instrText xml:space="preserve"> PAGEREF _Toc243083408 \h </w:instrText>
         </w:r>
         <w:r>
           <w:rPr>
@@ -1038,7 +1038,7 @@
           <w14:ligatures w14:val="standardContextual"/>
         </w:rPr>
       </w:pPr>
-      <w:hyperlink w:anchor="_Toc243082404" w:history="1">
+      <w:hyperlink w:anchor="_Toc243083409" w:history="1">
         <w:r>
           <w:rPr>
             <w:rStyle w:val="Hyperlink"/>
@@ -1065,7 +1065,7 @@
             <w:noProof/>
             <w:webHidden/>
           </w:rPr>
-          <w:instrText xml:space="preserve"> PAGEREF _Toc243082404 \h </w:instrText>
+          <w:instrText xml:space="preserve"> PAGEREF _Toc243083409 \h </w:instrText>
         </w:r>
         <w:r>
           <w:rPr>
@@ -1111,7 +1111,7 @@
           <w14:ligatures w14:val="standardContextual"/>
         </w:rPr>
       </w:pPr>
-      <w:hyperlink w:anchor="_Toc243082405" w:history="1">
+      <w:hyperlink w:anchor="_Toc243083410" w:history="1">
         <w:r>
           <w:rPr>
             <w:rStyle w:val="Hyperlink"/>
@@ -1138,7 +1138,7 @@
             <w:noProof/>
             <w:webHidden/>
           </w:rPr>
-          <w:instrText xml:space="preserve"> PAGEREF _Toc243082405 \h </w:instrText>
+          <w:instrText xml:space="preserve"> PAGEREF _Toc243083410 \h </w:instrText>
         </w:r>
         <w:r>
           <w:rPr>
@@ -1184,7 +1184,7 @@
           <w14:ligatures w14:val="standardContextual"/>
         </w:rPr>
       </w:pPr>
-      <w:hyperlink w:anchor="_Toc243082406" w:history="1">
+      <w:hyperlink w:anchor="_Toc243083411" w:history="1">
         <w:r>
           <w:rPr>
             <w:rStyle w:val="Hyperlink"/>
@@ -1211,7 +1211,7 @@
             <w:noProof/>
             <w:webHidden/>
           </w:rPr>
-          <w:instrText xml:space="preserve"> PAGEREF _Toc243082406 \h </w:instrText>
+          <w:instrText xml:space="preserve"> PAGEREF _Toc243083411 \h </w:instrText>
         </w:r>
         <w:r>
           <w:rPr>
@@ -1257,7 +1257,7 @@
           <w14:ligatures w14:val="standardContextual"/>
         </w:rPr>
       </w:pPr>
-      <w:hyperlink w:anchor="_Toc243082407" w:history="1">
+      <w:hyperlink w:anchor="_Toc243083412" w:history="1">
         <w:r>
           <w:rPr>
             <w:rStyle w:val="Hyperlink"/>
@@ -1284,7 +1284,7 @@
             <w:noProof/>
             <w:webHidden/>
           </w:rPr>
-          <w:instrText xml:space="preserve"> PAGEREF _Toc243082407 \h </w:instrText>
+          <w:instrText xml:space="preserve"> PAGEREF _Toc243083412 \h </w:instrText>
         </w:r>
         <w:r>
           <w:rPr>
@@ -1361,7 +1361,7 @@
       <w:r>
         <w:fldChar w:fldCharType="separate"/>
       </w:r>
-      <w:hyperlink w:anchor="_Toc243082408" w:history="1">
+      <w:hyperlink w:anchor="_Toc243083413" w:history="1">
         <w:r>
           <w:rPr>
             <w:rStyle w:val="Hyperlink"/>
@@ -1388,7 +1388,7 @@
             <w:noProof/>
             <w:webHidden/>
           </w:rPr>
-          <w:instrText xml:space="preserve"> PAGEREF _Toc243082408 \h </w:instrText>
+          <w:instrText xml:space="preserve"> PAGEREF _Toc243083413 \h </w:instrText>
         </w:r>
         <w:r>
           <w:rPr>
@@ -1434,7 +1434,7 @@
           <w14:ligatures w14:val="standardContextual"/>
         </w:rPr>
       </w:pPr>
-      <w:hyperlink w:anchor="_Toc243082409" w:history="1">
+      <w:hyperlink w:anchor="_Toc243083414" w:history="1">
         <w:r>
           <w:rPr>
             <w:rStyle w:val="Hyperlink"/>
@@ -1461,7 +1461,7 @@
             <w:noProof/>
             <w:webHidden/>
           </w:rPr>
-          <w:instrText xml:space="preserve"> PAGEREF _Toc243082409 \h </w:instrText>
+          <w:instrText xml:space="preserve"> PAGEREF _Toc243083414 \h </w:instrText>
         </w:r>
         <w:r>
           <w:rPr>
@@ -1507,7 +1507,7 @@
           <w14:ligatures w14:val="standardContextual"/>
         </w:rPr>
       </w:pPr>
-      <w:hyperlink w:anchor="_Toc243082410" w:history="1">
+      <w:hyperlink w:anchor="_Toc243083415" w:history="1">
         <w:r>
           <w:rPr>
             <w:rStyle w:val="Hyperlink"/>
@@ -1534,7 +1534,7 @@
             <w:noProof/>
             <w:webHidden/>
           </w:rPr>
-          <w:instrText xml:space="preserve"> PAGEREF _Toc243082410 \h </w:instrText>
+          <w:instrText xml:space="preserve"> PAGEREF _Toc243083415 \h </w:instrText>
         </w:r>
         <w:r>
           <w:rPr>
@@ -1580,7 +1580,7 @@
           <w14:ligatures w14:val="standardContextual"/>
         </w:rPr>
       </w:pPr>
-      <w:hyperlink w:anchor="_Toc243082411" w:history="1">
+      <w:hyperlink w:anchor="_Toc243083416" w:history="1">
         <w:r>
           <w:rPr>
             <w:rStyle w:val="Hyperlink"/>
@@ -1607,7 +1607,7 @@
             <w:noProof/>
             <w:webHidden/>
           </w:rPr>
-          <w:instrText xml:space="preserve"> PAGEREF _Toc243082411 \h </w:instrText>
+          <w:instrText xml:space="preserve"> PAGEREF _Toc243083416 \h </w:instrText>
         </w:r>
         <w:r>
           <w:rPr>
@@ -1653,7 +1653,7 @@
           <w14:ligatures w14:val="standardContextual"/>
         </w:rPr>
       </w:pPr>
-      <w:hyperlink w:anchor="_Toc243082412" w:history="1">
+      <w:hyperlink w:anchor="_Toc243083417" w:history="1">
         <w:r>
           <w:rPr>
             <w:rStyle w:val="Hyperlink"/>
@@ -1703,7 +1703,7 @@
             <w:noProof/>
             <w:webHidden/>
           </w:rPr>
-          <w:instrText xml:space="preserve"> PAGEREF _Toc243082412 \h </w:instrText>
+          <w:instrText xml:space="preserve"> PAGEREF _Toc243083417 \h </w:instrText>
         </w:r>
         <w:r>
           <w:rPr>
@@ -1749,7 +1749,7 @@
           <w14:ligatures w14:val="standardContextual"/>
         </w:rPr>
       </w:pPr>
-      <w:hyperlink w:anchor="_Toc243082413" w:history="1">
+      <w:hyperlink w:anchor="_Toc243083418" w:history="1">
         <w:r>
           <w:rPr>
             <w:rStyle w:val="Hyperlink"/>
@@ -1776,7 +1776,7 @@
             <w:noProof/>
             <w:webHidden/>
           </w:rPr>
-          <w:instrText xml:space="preserve"> PAGEREF _Toc243082413 \h </w:instrText>
+          <w:instrText xml:space="preserve"> PAGEREF _Toc243083418 \h </w:instrText>
         </w:r>
         <w:r>
           <w:rPr>
@@ -1822,7 +1822,7 @@
           <w14:ligatures w14:val="standardContextual"/>
         </w:rPr>
       </w:pPr>
-      <w:hyperlink w:anchor="_Toc243082414" w:history="1">
+      <w:hyperlink w:anchor="_Toc243083419" w:history="1">
         <w:r>
           <w:rPr>
             <w:rStyle w:val="Hyperlink"/>
@@ -1872,7 +1872,7 @@
             <w:noProof/>
             <w:webHidden/>
           </w:rPr>
-          <w:instrText xml:space="preserve"> PAGEREF _Toc243082414 \h </w:instrText>
+          <w:instrText xml:space="preserve"> PAGEREF _Toc243083419 \h </w:instrText>
         </w:r>
         <w:r>
           <w:rPr>
@@ -1918,7 +1918,7 @@
           <w14:ligatures w14:val="standardContextual"/>
         </w:rPr>
       </w:pPr>
-      <w:hyperlink w:anchor="_Toc243082415" w:history="1">
+      <w:hyperlink w:anchor="_Toc243083420" w:history="1">
         <w:r>
           <w:rPr>
             <w:rStyle w:val="Hyperlink"/>
@@ -1945,7 +1945,7 @@
             <w:noProof/>
             <w:webHidden/>
           </w:rPr>
-          <w:instrText xml:space="preserve"> PAGEREF _Toc243082415 \h </w:instrText>
+          <w:instrText xml:space="preserve"> PAGEREF _Toc243083420 \h </w:instrText>
         </w:r>
         <w:r>
           <w:rPr>
@@ -1991,7 +1991,7 @@
           <w14:ligatures w14:val="standardContextual"/>
         </w:rPr>
       </w:pPr>
-      <w:hyperlink w:anchor="_Toc243082416" w:history="1">
+      <w:hyperlink w:anchor="_Toc243083421" w:history="1">
         <w:r>
           <w:rPr>
             <w:rStyle w:val="Hyperlink"/>
@@ -2041,7 +2041,7 @@
             <w:noProof/>
             <w:webHidden/>
           </w:rPr>
-          <w:instrText xml:space="preserve"> PAGEREF _Toc243082416 \h </w:instrText>
+          <w:instrText xml:space="preserve"> PAGEREF _Toc243083421 \h </w:instrText>
         </w:r>
         <w:r>
           <w:rPr>
@@ -2087,7 +2087,7 @@
           <w14:ligatures w14:val="standardContextual"/>
         </w:rPr>
       </w:pPr>
-      <w:hyperlink w:anchor="_Toc243082417" w:history="1">
+      <w:hyperlink w:anchor="_Toc243083422" w:history="1">
         <w:r>
           <w:rPr>
             <w:rStyle w:val="Hyperlink"/>
@@ -2114,7 +2114,7 @@
             <w:noProof/>
             <w:webHidden/>
           </w:rPr>
-          <w:instrText xml:space="preserve"> PAGEREF _Toc243082417 \h </w:instrText>
+          <w:instrText xml:space="preserve"> PAGEREF _Toc243083422 \h </w:instrText>
         </w:r>
         <w:r>
           <w:rPr>
@@ -2160,7 +2160,7 @@
           <w14:ligatures w14:val="standardContextual"/>
         </w:rPr>
       </w:pPr>
-      <w:hyperlink w:anchor="_Toc243082418" w:history="1">
+      <w:hyperlink w:anchor="_Toc243083423" w:history="1">
         <w:r>
           <w:rPr>
             <w:rStyle w:val="Hyperlink"/>
@@ -2187,7 +2187,7 @@
             <w:noProof/>
             <w:webHidden/>
           </w:rPr>
-          <w:instrText xml:space="preserve"> PAGEREF _Toc243082418 \h </w:instrText>
+          <w:instrText xml:space="preserve"> PAGEREF _Toc243083423 \h </w:instrText>
         </w:r>
         <w:r>
           <w:rPr>
@@ -2233,7 +2233,7 @@
           <w14:ligatures w14:val="standardContextual"/>
         </w:rPr>
       </w:pPr>
-      <w:hyperlink w:anchor="_Toc243082419" w:history="1">
+      <w:hyperlink w:anchor="_Toc243083424" w:history="1">
         <w:r>
           <w:rPr>
             <w:rStyle w:val="Hyperlink"/>
@@ -2260,7 +2260,7 @@
             <w:noProof/>
             <w:webHidden/>
           </w:rPr>
-          <w:instrText xml:space="preserve"> PAGEREF _Toc243082419 \h </w:instrText>
+          <w:instrText xml:space="preserve"> PAGEREF _Toc243083424 \h </w:instrText>
         </w:r>
         <w:r>
           <w:rPr>
@@ -2306,7 +2306,7 @@
           <w14:ligatures w14:val="standardContextual"/>
         </w:rPr>
       </w:pPr>
-      <w:hyperlink w:anchor="_Toc243082420" w:history="1">
+      <w:hyperlink w:anchor="_Toc243083425" w:history="1">
         <w:r>
           <w:rPr>
             <w:rStyle w:val="Hyperlink"/>
@@ -2356,7 +2356,7 @@
             <w:noProof/>
             <w:webHidden/>
           </w:rPr>
-          <w:instrText xml:space="preserve"> PAGEREF _Toc243082420 \h </w:instrText>
+          <w:instrText xml:space="preserve"> PAGEREF _Toc243083425 \h </w:instrText>
         </w:r>
         <w:r>
           <w:rPr>
@@ -2402,7 +2402,7 @@
           <w14:ligatures w14:val="standardContextual"/>
         </w:rPr>
       </w:pPr>
-      <w:hyperlink w:anchor="_Toc243082421" w:history="1">
+      <w:hyperlink w:anchor="_Toc243083426" w:history="1">
         <w:r>
           <w:rPr>
             <w:rStyle w:val="Hyperlink"/>
@@ -2429,7 +2429,7 @@
             <w:noProof/>
             <w:webHidden/>
           </w:rPr>
-          <w:instrText xml:space="preserve"> PAGEREF _Toc243082421 \h </w:instrText>
+          <w:instrText xml:space="preserve"> PAGEREF _Toc243083426 \h </w:instrText>
         </w:r>
         <w:r>
           <w:rPr>
@@ -2475,7 +2475,7 @@
           <w14:ligatures w14:val="standardContextual"/>
         </w:rPr>
       </w:pPr>
-      <w:hyperlink w:anchor="_Toc243082422" w:history="1">
+      <w:hyperlink w:anchor="_Toc243083427" w:history="1">
         <w:r>
           <w:rPr>
             <w:rStyle w:val="Hyperlink"/>
@@ -2502,7 +2502,7 @@
             <w:noProof/>
             <w:webHidden/>
           </w:rPr>
-          <w:instrText xml:space="preserve"> PAGEREF _Toc243082422 \h </w:instrText>
+          <w:instrText xml:space="preserve"> PAGEREF _Toc243083427 \h </w:instrText>
         </w:r>
         <w:r>
           <w:rPr>
@@ -2548,7 +2548,7 @@
           <w14:ligatures w14:val="standardContextual"/>
         </w:rPr>
       </w:pPr>
-      <w:hyperlink w:anchor="_Toc243082423" w:history="1">
+      <w:hyperlink w:anchor="_Toc243083428" w:history="1">
         <w:r>
           <w:rPr>
             <w:rStyle w:val="Hyperlink"/>
@@ -2575,7 +2575,7 @@
             <w:noProof/>
             <w:webHidden/>
           </w:rPr>
-          <w:instrText xml:space="preserve"> PAGEREF _Toc243082423 \h </w:instrText>
+          <w:instrText xml:space="preserve"> PAGEREF _Toc243083428 \h </w:instrText>
         </w:r>
         <w:r>
           <w:rPr>
@@ -2621,7 +2621,7 @@
           <w14:ligatures w14:val="standardContextual"/>
         </w:rPr>
       </w:pPr>
-      <w:hyperlink w:anchor="_Toc243082424" w:history="1">
+      <w:hyperlink w:anchor="_Toc243083429" w:history="1">
         <w:r>
           <w:rPr>
             <w:rStyle w:val="Hyperlink"/>
@@ -2671,7 +2671,7 @@
             <w:noProof/>
             <w:webHidden/>
           </w:rPr>
-          <w:instrText xml:space="preserve"> PAGEREF _Toc243082424 \h </w:instrText>
+          <w:instrText xml:space="preserve"> PAGEREF _Toc243083429 \h </w:instrText>
         </w:r>
         <w:r>
           <w:rPr>
@@ -3225,7 +3225,7 @@
       <w:r>
         <w:fldChar w:fldCharType="separate"/>
       </w:r>
-      <w:hyperlink w:anchor="_Toc243082348" w:history="1">
+      <w:hyperlink w:anchor="_Toc243083353" w:history="1">
         <w:r>
           <w:rPr>
             <w:rStyle w:val="Hyperlink"/>
@@ -3252,7 +3252,7 @@
             <w:noProof/>
             <w:webHidden/>
           </w:rPr>
-          <w:instrText xml:space="preserve"> PAGEREF _Toc243082348 \h </w:instrText>
+          <w:instrText xml:space="preserve"> PAGEREF _Toc243083353 \h </w:instrText>
         </w:r>
         <w:r>
           <w:rPr>
@@ -3298,7 +3298,7 @@
           <w14:ligatures w14:val="standardContextual"/>
         </w:rPr>
       </w:pPr>
-      <w:hyperlink w:anchor="_Toc243082349" w:history="1">
+      <w:hyperlink w:anchor="_Toc243083354" w:history="1">
         <w:r>
           <w:rPr>
             <w:rStyle w:val="Hyperlink"/>
@@ -3325,7 +3325,7 @@
             <w:noProof/>
             <w:webHidden/>
           </w:rPr>
-          <w:instrText xml:space="preserve"> PAGEREF _Toc243082349 \h </w:instrText>
+          <w:instrText xml:space="preserve"> PAGEREF _Toc243083354 \h </w:instrText>
         </w:r>
         <w:r>
           <w:rPr>
@@ -3371,7 +3371,7 @@
           <w14:ligatures w14:val="standardContextual"/>
         </w:rPr>
       </w:pPr>
-      <w:hyperlink w:anchor="_Toc243082350" w:history="1">
+      <w:hyperlink w:anchor="_Toc243083355" w:history="1">
         <w:r>
           <w:rPr>
             <w:rStyle w:val="Hyperlink"/>
@@ -3398,7 +3398,7 @@
             <w:noProof/>
             <w:webHidden/>
           </w:rPr>
-          <w:instrText xml:space="preserve"> PAGEREF _Toc243082350 \h </w:instrText>
+          <w:instrText xml:space="preserve"> PAGEREF _Toc243083355 \h </w:instrText>
         </w:r>
         <w:r>
           <w:rPr>
@@ -3444,7 +3444,7 @@
           <w14:ligatures w14:val="standardContextual"/>
         </w:rPr>
       </w:pPr>
-      <w:hyperlink w:anchor="_Toc243082351" w:history="1">
+      <w:hyperlink w:anchor="_Toc243083356" w:history="1">
         <w:r>
           <w:rPr>
             <w:rStyle w:val="Hyperlink"/>
@@ -3471,7 +3471,7 @@
             <w:noProof/>
             <w:webHidden/>
           </w:rPr>
-          <w:instrText xml:space="preserve"> PAGEREF _Toc243082351 \h </w:instrText>
+          <w:instrText xml:space="preserve"> PAGEREF _Toc243083356 \h </w:instrText>
         </w:r>
         <w:r>
           <w:rPr>
@@ -3517,7 +3517,7 @@
           <w14:ligatures w14:val="standardContextual"/>
         </w:rPr>
       </w:pPr>
-      <w:hyperlink w:anchor="_Toc243082352" w:history="1">
+      <w:hyperlink w:anchor="_Toc243083357" w:history="1">
         <w:r>
           <w:rPr>
             <w:rStyle w:val="Hyperlink"/>
@@ -3544,7 +3544,7 @@
             <w:noProof/>
             <w:webHidden/>
           </w:rPr>
-          <w:instrText xml:space="preserve"> PAGEREF _Toc243082352 \h </w:instrText>
+          <w:instrText xml:space="preserve"> PAGEREF _Toc243083357 \h </w:instrText>
         </w:r>
         <w:r>
           <w:rPr>
@@ -3590,7 +3590,7 @@
           <w14:ligatures w14:val="standardContextual"/>
         </w:rPr>
       </w:pPr>
-      <w:hyperlink w:anchor="_Toc243082353" w:history="1">
+      <w:hyperlink w:anchor="_Toc243083358" w:history="1">
         <w:r>
           <w:rPr>
             <w:rStyle w:val="Hyperlink"/>
@@ -3617,7 +3617,7 @@
             <w:noProof/>
             <w:webHidden/>
           </w:rPr>
-          <w:instrText xml:space="preserve"> PAGEREF _Toc243082353 \h </w:instrText>
+          <w:instrText xml:space="preserve"> PAGEREF _Toc243083358 \h </w:instrText>
         </w:r>
         <w:r>
           <w:rPr>
@@ -3663,7 +3663,7 @@
           <w14:ligatures w14:val="standardContextual"/>
         </w:rPr>
       </w:pPr>
-      <w:hyperlink w:anchor="_Toc243082354" w:history="1">
+      <w:hyperlink w:anchor="_Toc243083359" w:history="1">
         <w:r>
           <w:rPr>
             <w:rStyle w:val="Hyperlink"/>
@@ -3690,7 +3690,7 @@
             <w:noProof/>
             <w:webHidden/>
           </w:rPr>
-          <w:instrText xml:space="preserve"> PAGEREF _Toc243082354 \h </w:instrText>
+          <w:instrText xml:space="preserve"> PAGEREF _Toc243083359 \h </w:instrText>
         </w:r>
         <w:r>
           <w:rPr>
@@ -3736,7 +3736,7 @@
           <w14:ligatures w14:val="standardContextual"/>
         </w:rPr>
       </w:pPr>
-      <w:hyperlink w:anchor="_Toc243082355" w:history="1">
+      <w:hyperlink w:anchor="_Toc243083360" w:history="1">
         <w:r>
           <w:rPr>
             <w:rStyle w:val="Hyperlink"/>
@@ -3763,7 +3763,7 @@
             <w:noProof/>
             <w:webHidden/>
           </w:rPr>
-          <w:instrText xml:space="preserve"> PAGEREF _Toc243082355 \h </w:instrText>
+          <w:instrText xml:space="preserve"> PAGEREF _Toc243083360 \h </w:instrText>
         </w:r>
         <w:r>
           <w:rPr>
@@ -3809,7 +3809,7 @@
           <w14:ligatures w14:val="standardContextual"/>
         </w:rPr>
       </w:pPr>
-      <w:hyperlink w:anchor="_Toc243082356" w:history="1">
+      <w:hyperlink w:anchor="_Toc243083361" w:history="1">
         <w:r>
           <w:rPr>
             <w:rStyle w:val="Hyperlink"/>
@@ -3836,7 +3836,7 @@
             <w:noProof/>
             <w:webHidden/>
           </w:rPr>
-          <w:instrText xml:space="preserve"> PAGEREF _Toc243082356 \h </w:instrText>
+          <w:instrText xml:space="preserve"> PAGEREF _Toc243083361 \h </w:instrText>
         </w:r>
         <w:r>
           <w:rPr>
@@ -3882,7 +3882,7 @@
           <w14:ligatures w14:val="standardContextual"/>
         </w:rPr>
       </w:pPr>
-      <w:hyperlink w:anchor="_Toc243082357" w:history="1">
+      <w:hyperlink w:anchor="_Toc243083362" w:history="1">
         <w:r>
           <w:rPr>
             <w:rStyle w:val="Hyperlink"/>
@@ -3909,7 +3909,7 @@
             <w:noProof/>
             <w:webHidden/>
           </w:rPr>
-          <w:instrText xml:space="preserve"> PAGEREF _Toc243082357 \h </w:instrText>
+          <w:instrText xml:space="preserve"> PAGEREF _Toc243083362 \h </w:instrText>
         </w:r>
         <w:r>
           <w:rPr>
@@ -3955,7 +3955,7 @@
           <w14:ligatures w14:val="standardContextual"/>
         </w:rPr>
       </w:pPr>
-      <w:hyperlink w:anchor="_Toc243082358" w:history="1">
+      <w:hyperlink w:anchor="_Toc243083363" w:history="1">
         <w:r>
           <w:rPr>
             <w:rStyle w:val="Hyperlink"/>
@@ -3982,7 +3982,7 @@
             <w:noProof/>
             <w:webHidden/>
           </w:rPr>
-          <w:instrText xml:space="preserve"> PAGEREF _Toc243082358 \h </w:instrText>
+          <w:instrText xml:space="preserve"> PAGEREF _Toc243083363 \h </w:instrText>
         </w:r>
         <w:r>
           <w:rPr>
@@ -4028,7 +4028,7 @@
           <w14:ligatures w14:val="standardContextual"/>
         </w:rPr>
       </w:pPr>
-      <w:hyperlink w:anchor="_Toc243082359" w:history="1">
+      <w:hyperlink w:anchor="_Toc243083364" w:history="1">
         <w:r>
           <w:rPr>
             <w:rStyle w:val="Hyperlink"/>
@@ -4055,7 +4055,7 @@
             <w:noProof/>
             <w:webHidden/>
           </w:rPr>
-          <w:instrText xml:space="preserve"> PAGEREF _Toc243082359 \h </w:instrText>
+          <w:instrText xml:space="preserve"> PAGEREF _Toc243083364 \h </w:instrText>
         </w:r>
         <w:r>
           <w:rPr>
@@ -4101,7 +4101,7 @@
           <w14:ligatures w14:val="standardContextual"/>
         </w:rPr>
       </w:pPr>
-      <w:hyperlink w:anchor="_Toc243082360" w:history="1">
+      <w:hyperlink w:anchor="_Toc243083365" w:history="1">
         <w:r>
           <w:rPr>
             <w:rStyle w:val="Hyperlink"/>
@@ -4128,7 +4128,7 @@
             <w:noProof/>
             <w:webHidden/>
           </w:rPr>
-          <w:instrText xml:space="preserve"> PAGEREF _Toc243082360 \h </w:instrText>
+          <w:instrText xml:space="preserve"> PAGEREF _Toc243083365 \h </w:instrText>
         </w:r>
         <w:r>
           <w:rPr>
@@ -4174,7 +4174,7 @@
           <w14:ligatures w14:val="standardContextual"/>
         </w:rPr>
       </w:pPr>
-      <w:hyperlink w:anchor="_Toc243082361" w:history="1">
+      <w:hyperlink w:anchor="_Toc243083366" w:history="1">
         <w:r>
           <w:rPr>
             <w:rStyle w:val="Hyperlink"/>
@@ -4201,7 +4201,7 @@
             <w:noProof/>
             <w:webHidden/>
           </w:rPr>
-          <w:instrText xml:space="preserve"> PAGEREF _Toc243082361 \h </w:instrText>
+          <w:instrText xml:space="preserve"> PAGEREF _Toc243083366 \h </w:instrText>
         </w:r>
         <w:r>
           <w:rPr>
@@ -4247,7 +4247,7 @@
           <w14:ligatures w14:val="standardContextual"/>
         </w:rPr>
       </w:pPr>
-      <w:hyperlink w:anchor="_Toc243082362" w:history="1">
+      <w:hyperlink w:anchor="_Toc243083367" w:history="1">
         <w:r>
           <w:rPr>
             <w:rStyle w:val="Hyperlink"/>
@@ -4274,7 +4274,7 @@
             <w:noProof/>
             <w:webHidden/>
           </w:rPr>
-          <w:instrText xml:space="preserve"> PAGEREF _Toc243082362 \h </w:instrText>
+          <w:instrText xml:space="preserve"> PAGEREF _Toc243083367 \h </w:instrText>
         </w:r>
         <w:r>
           <w:rPr>
@@ -4320,7 +4320,7 @@
           <w14:ligatures w14:val="standardContextual"/>
         </w:rPr>
       </w:pPr>
-      <w:hyperlink w:anchor="_Toc243082363" w:history="1">
+      <w:hyperlink w:anchor="_Toc243083368" w:history="1">
         <w:r>
           <w:rPr>
             <w:rStyle w:val="Hyperlink"/>
@@ -4347,7 +4347,7 @@
             <w:noProof/>
             <w:webHidden/>
           </w:rPr>
-          <w:instrText xml:space="preserve"> PAGEREF _Toc243082363 \h </w:instrText>
+          <w:instrText xml:space="preserve"> PAGEREF _Toc243083368 \h </w:instrText>
         </w:r>
         <w:r>
           <w:rPr>
@@ -4393,7 +4393,7 @@
           <w14:ligatures w14:val="standardContextual"/>
         </w:rPr>
       </w:pPr>
-      <w:hyperlink w:anchor="_Toc243082364" w:history="1">
+      <w:hyperlink w:anchor="_Toc243083369" w:history="1">
         <w:r>
           <w:rPr>
             <w:rStyle w:val="Hyperlink"/>
@@ -4420,7 +4420,7 @@
             <w:noProof/>
             <w:webHidden/>
           </w:rPr>
-          <w:instrText xml:space="preserve"> PAGEREF _Toc243082364 \h </w:instrText>
+          <w:instrText xml:space="preserve"> PAGEREF _Toc243083369 \h </w:instrText>
         </w:r>
         <w:r>
           <w:rPr>
@@ -4466,7 +4466,7 @@
           <w14:ligatures w14:val="standardContextual"/>
         </w:rPr>
       </w:pPr>
-      <w:hyperlink w:anchor="_Toc243082365" w:history="1">
+      <w:hyperlink w:anchor="_Toc243083370" w:history="1">
         <w:r>
           <w:rPr>
             <w:rStyle w:val="Hyperlink"/>
@@ -4493,7 +4493,7 @@
             <w:noProof/>
             <w:webHidden/>
           </w:rPr>
-          <w:instrText xml:space="preserve"> PAGEREF _Toc243082365 \h </w:instrText>
+          <w:instrText xml:space="preserve"> PAGEREF _Toc243083370 \h </w:instrText>
         </w:r>
         <w:r>
           <w:rPr>
@@ -4539,7 +4539,7 @@
           <w14:ligatures w14:val="standardContextual"/>
         </w:rPr>
       </w:pPr>
-      <w:hyperlink w:anchor="_Toc243082366" w:history="1">
+      <w:hyperlink w:anchor="_Toc243083371" w:history="1">
         <w:r>
           <w:rPr>
             <w:rStyle w:val="Hyperlink"/>
@@ -4566,7 +4566,7 @@
             <w:noProof/>
             <w:webHidden/>
           </w:rPr>
-          <w:instrText xml:space="preserve"> PAGEREF _Toc243082366 \h </w:instrText>
+          <w:instrText xml:space="preserve"> PAGEREF _Toc243083371 \h </w:instrText>
         </w:r>
         <w:r>
           <w:rPr>
@@ -4612,7 +4612,7 @@
           <w14:ligatures w14:val="standardContextual"/>
         </w:rPr>
       </w:pPr>
-      <w:hyperlink w:anchor="_Toc243082367" w:history="1">
+      <w:hyperlink w:anchor="_Toc243083372" w:history="1">
         <w:r>
           <w:rPr>
             <w:rStyle w:val="Hyperlink"/>
@@ -4639,7 +4639,7 @@
             <w:noProof/>
             <w:webHidden/>
           </w:rPr>
-          <w:instrText xml:space="preserve"> PAGEREF _Toc243082367 \h </w:instrText>
+          <w:instrText xml:space="preserve"> PAGEREF _Toc243083372 \h </w:instrText>
         </w:r>
         <w:r>
           <w:rPr>
@@ -4685,7 +4685,7 @@
           <w14:ligatures w14:val="standardContextual"/>
         </w:rPr>
       </w:pPr>
-      <w:hyperlink w:anchor="_Toc243082368" w:history="1">
+      <w:hyperlink w:anchor="_Toc243083373" w:history="1">
         <w:r>
           <w:rPr>
             <w:rStyle w:val="Hyperlink"/>
@@ -4712,7 +4712,7 @@
             <w:noProof/>
             <w:webHidden/>
           </w:rPr>
-          <w:instrText xml:space="preserve"> PAGEREF _Toc243082368 \h </w:instrText>
+          <w:instrText xml:space="preserve"> PAGEREF _Toc243083373 \h </w:instrText>
         </w:r>
         <w:r>
           <w:rPr>
@@ -4758,7 +4758,7 @@
           <w14:ligatures w14:val="standardContextual"/>
         </w:rPr>
       </w:pPr>
-      <w:hyperlink w:anchor="_Toc243082369" w:history="1">
+      <w:hyperlink w:anchor="_Toc243083374" w:history="1">
         <w:r>
           <w:rPr>
             <w:rStyle w:val="Hyperlink"/>
@@ -4785,7 +4785,7 @@
             <w:noProof/>
             <w:webHidden/>
           </w:rPr>
-          <w:instrText xml:space="preserve"> PAGEREF _Toc243082369 \h </w:instrText>
+          <w:instrText xml:space="preserve"> PAGEREF _Toc243083374 \h </w:instrText>
         </w:r>
         <w:r>
           <w:rPr>
@@ -4831,7 +4831,7 @@
           <w14:ligatures w14:val="standardContextual"/>
         </w:rPr>
       </w:pPr>
-      <w:hyperlink w:anchor="_Toc243082370" w:history="1">
+      <w:hyperlink w:anchor="_Toc243083375" w:history="1">
         <w:r>
           <w:rPr>
             <w:rStyle w:val="Hyperlink"/>
@@ -4858,7 +4858,7 @@
             <w:noProof/>
             <w:webHidden/>
           </w:rPr>
-          <w:instrText xml:space="preserve"> PAGEREF _Toc243082370 \h </w:instrText>
+          <w:instrText xml:space="preserve"> PAGEREF _Toc243083375 \h </w:instrText>
         </w:r>
         <w:r>
           <w:rPr>
@@ -4904,7 +4904,7 @@
           <w14:ligatures w14:val="standardContextual"/>
         </w:rPr>
       </w:pPr>
-      <w:hyperlink w:anchor="_Toc243082371" w:history="1">
+      <w:hyperlink w:anchor="_Toc243083376" w:history="1">
         <w:r>
           <w:rPr>
             <w:rStyle w:val="Hyperlink"/>
@@ -4931,7 +4931,7 @@
             <w:noProof/>
             <w:webHidden/>
           </w:rPr>
-          <w:instrText xml:space="preserve"> PAGEREF _Toc243082371 \h </w:instrText>
+          <w:instrText xml:space="preserve"> PAGEREF _Toc243083376 \h </w:instrText>
         </w:r>
         <w:r>
           <w:rPr>
@@ -4977,7 +4977,7 @@
           <w14:ligatures w14:val="standardContextual"/>
         </w:rPr>
       </w:pPr>
-      <w:hyperlink w:anchor="_Toc243082372" w:history="1">
+      <w:hyperlink w:anchor="_Toc243083377" w:history="1">
         <w:r>
           <w:rPr>
             <w:rStyle w:val="Hyperlink"/>
@@ -5004,7 +5004,7 @@
             <w:noProof/>
             <w:webHidden/>
           </w:rPr>
-          <w:instrText xml:space="preserve"> PAGEREF _Toc243082372 \h </w:instrText>
+          <w:instrText xml:space="preserve"> PAGEREF _Toc243083377 \h </w:instrText>
         </w:r>
         <w:r>
           <w:rPr>
@@ -5050,7 +5050,7 @@
           <w14:ligatures w14:val="standardContextual"/>
         </w:rPr>
       </w:pPr>
-      <w:hyperlink w:anchor="_Toc243082373" w:history="1">
+      <w:hyperlink w:anchor="_Toc243083378" w:history="1">
         <w:r>
           <w:rPr>
             <w:rStyle w:val="Hyperlink"/>
@@ -5077,7 +5077,7 @@
             <w:noProof/>
             <w:webHidden/>
           </w:rPr>
-          <w:instrText xml:space="preserve"> PAGEREF _Toc243082373 \h </w:instrText>
+          <w:instrText xml:space="preserve"> PAGEREF _Toc243083378 \h </w:instrText>
         </w:r>
         <w:r>
           <w:rPr>
@@ -5123,7 +5123,7 @@
           <w14:ligatures w14:val="standardContextual"/>
         </w:rPr>
       </w:pPr>
-      <w:hyperlink w:anchor="_Toc243082374" w:history="1">
+      <w:hyperlink w:anchor="_Toc243083379" w:history="1">
         <w:r>
           <w:rPr>
             <w:rStyle w:val="Hyperlink"/>
@@ -5150,7 +5150,7 @@
             <w:noProof/>
             <w:webHidden/>
           </w:rPr>
-          <w:instrText xml:space="preserve"> PAGEREF _Toc243082374 \h </w:instrText>
+          <w:instrText xml:space="preserve"> PAGEREF _Toc243083379 \h </w:instrText>
         </w:r>
         <w:r>
           <w:rPr>
@@ -5196,7 +5196,7 @@
           <w14:ligatures w14:val="standardContextual"/>
         </w:rPr>
       </w:pPr>
-      <w:hyperlink w:anchor="_Toc243082375" w:history="1">
+      <w:hyperlink w:anchor="_Toc243083380" w:history="1">
         <w:r>
           <w:rPr>
             <w:rStyle w:val="Hyperlink"/>
@@ -5223,7 +5223,7 @@
             <w:noProof/>
             <w:webHidden/>
           </w:rPr>
-          <w:instrText xml:space="preserve"> PAGEREF _Toc243082375 \h </w:instrText>
+          <w:instrText xml:space="preserve"> PAGEREF _Toc243083380 \h </w:instrText>
         </w:r>
         <w:r>
           <w:rPr>
@@ -5269,7 +5269,7 @@
           <w14:ligatures w14:val="standardContextual"/>
         </w:rPr>
       </w:pPr>
-      <w:hyperlink w:anchor="_Toc243082376" w:history="1">
+      <w:hyperlink w:anchor="_Toc243083381" w:history="1">
         <w:r>
           <w:rPr>
             <w:rStyle w:val="Hyperlink"/>
@@ -5296,7 +5296,7 @@
             <w:noProof/>
             <w:webHidden/>
           </w:rPr>
-          <w:instrText xml:space="preserve"> PAGEREF _Toc243082376 \h </w:instrText>
+          <w:instrText xml:space="preserve"> PAGEREF _Toc243083381 \h </w:instrText>
         </w:r>
         <w:r>
           <w:rPr>
@@ -5342,7 +5342,7 @@
           <w14:ligatures w14:val="standardContextual"/>
         </w:rPr>
       </w:pPr>
-      <w:hyperlink w:anchor="_Toc243082377" w:history="1">
+      <w:hyperlink w:anchor="_Toc243083382" w:history="1">
         <w:r>
           <w:rPr>
             <w:rStyle w:val="Hyperlink"/>
@@ -5369,7 +5369,7 @@
             <w:noProof/>
             <w:webHidden/>
           </w:rPr>
-          <w:instrText xml:space="preserve"> PAGEREF _Toc243082377 \h </w:instrText>
+          <w:instrText xml:space="preserve"> PAGEREF _Toc243083382 \h </w:instrText>
         </w:r>
         <w:r>
           <w:rPr>
@@ -5415,7 +5415,7 @@
           <w14:ligatures w14:val="standardContextual"/>
         </w:rPr>
       </w:pPr>
-      <w:hyperlink w:anchor="_Toc243082378" w:history="1">
+      <w:hyperlink w:anchor="_Toc243083383" w:history="1">
         <w:r>
           <w:rPr>
             <w:rStyle w:val="Hyperlink"/>
@@ -5442,7 +5442,7 @@
             <w:noProof/>
             <w:webHidden/>
           </w:rPr>
-          <w:instrText xml:space="preserve"> PAGEREF _Toc243082378 \h </w:instrText>
+          <w:instrText xml:space="preserve"> PAGEREF _Toc243083383 \h </w:instrText>
         </w:r>
         <w:r>
           <w:rPr>
@@ -5488,7 +5488,7 @@
           <w14:ligatures w14:val="standardContextual"/>
         </w:rPr>
       </w:pPr>
-      <w:hyperlink w:anchor="_Toc243082379" w:history="1">
+      <w:hyperlink w:anchor="_Toc243083384" w:history="1">
         <w:r>
           <w:rPr>
             <w:rStyle w:val="Hyperlink"/>
@@ -5515,7 +5515,7 @@
             <w:noProof/>
             <w:webHidden/>
           </w:rPr>
-          <w:instrText xml:space="preserve"> PAGEREF _Toc243082379 \h </w:instrText>
+          <w:instrText xml:space="preserve"> PAGEREF _Toc243083384 \h </w:instrText>
         </w:r>
         <w:r>
           <w:rPr>
@@ -5561,7 +5561,7 @@
           <w14:ligatures w14:val="standardContextual"/>
         </w:rPr>
       </w:pPr>
-      <w:hyperlink w:anchor="_Toc243082380" w:history="1">
+      <w:hyperlink w:anchor="_Toc243083385" w:history="1">
         <w:r>
           <w:rPr>
             <w:rStyle w:val="Hyperlink"/>
@@ -5588,7 +5588,7 @@
             <w:noProof/>
             <w:webHidden/>
           </w:rPr>
-          <w:instrText xml:space="preserve"> PAGEREF _Toc243082380 \h </w:instrText>
+          <w:instrText xml:space="preserve"> PAGEREF _Toc243083385 \h </w:instrText>
         </w:r>
         <w:r>
           <w:rPr>
@@ -5634,7 +5634,7 @@
           <w14:ligatures w14:val="standardContextual"/>
         </w:rPr>
       </w:pPr>
-      <w:hyperlink w:anchor="_Toc243082381" w:history="1">
+      <w:hyperlink w:anchor="_Toc243083386" w:history="1">
         <w:r>
           <w:rPr>
             <w:rStyle w:val="Hyperlink"/>
@@ -5661,7 +5661,7 @@
             <w:noProof/>
             <w:webHidden/>
           </w:rPr>
-          <w:instrText xml:space="preserve"> PAGEREF _Toc243082381 \h </w:instrText>
+          <w:instrText xml:space="preserve"> PAGEREF _Toc243083386 \h </w:instrText>
         </w:r>
         <w:r>
           <w:rPr>
@@ -5707,7 +5707,7 @@
           <w14:ligatures w14:val="standardContextual"/>
         </w:rPr>
       </w:pPr>
-      <w:hyperlink w:anchor="_Toc243082382" w:history="1">
+      <w:hyperlink w:anchor="_Toc243083387" w:history="1">
         <w:r>
           <w:rPr>
             <w:rStyle w:val="Hyperlink"/>
@@ -5734,7 +5734,7 @@
             <w:noProof/>
             <w:webHidden/>
           </w:rPr>
-          <w:instrText xml:space="preserve"> PAGEREF _Toc243082382 \h </w:instrText>
+          <w:instrText xml:space="preserve"> PAGEREF _Toc243083387 \h </w:instrText>
         </w:r>
         <w:r>
           <w:rPr>
@@ -5780,7 +5780,7 @@
           <w14:ligatures w14:val="standardContextual"/>
         </w:rPr>
       </w:pPr>
-      <w:hyperlink w:anchor="_Toc243082383" w:history="1">
+      <w:hyperlink w:anchor="_Toc243083388" w:history="1">
         <w:r>
           <w:rPr>
             <w:rStyle w:val="Hyperlink"/>
@@ -5807,7 +5807,7 @@
             <w:noProof/>
             <w:webHidden/>
           </w:rPr>
-          <w:instrText xml:space="preserve"> PAGEREF _Toc243082383 \h </w:instrText>
+          <w:instrText xml:space="preserve"> PAGEREF _Toc243083388 \h </w:instrText>
         </w:r>
         <w:r>
           <w:rPr>
@@ -5853,7 +5853,7 @@
           <w14:ligatures w14:val="standardContextual"/>
         </w:rPr>
       </w:pPr>
-      <w:hyperlink w:anchor="_Toc243082384" w:history="1">
+      <w:hyperlink w:anchor="_Toc243083389" w:history="1">
         <w:r>
           <w:rPr>
             <w:rStyle w:val="Hyperlink"/>
@@ -5880,7 +5880,7 @@
             <w:noProof/>
             <w:webHidden/>
           </w:rPr>
-          <w:instrText xml:space="preserve"> PAGEREF _Toc243082384 \h </w:instrText>
+          <w:instrText xml:space="preserve"> PAGEREF _Toc243083389 \h </w:instrText>
         </w:r>
         <w:r>
           <w:rPr>
@@ -5926,7 +5926,7 @@
           <w14:ligatures w14:val="standardContextual"/>
         </w:rPr>
       </w:pPr>
-      <w:hyperlink w:anchor="_Toc243082385" w:history="1">
+      <w:hyperlink w:anchor="_Toc243083390" w:history="1">
         <w:r>
           <w:rPr>
             <w:rStyle w:val="Hyperlink"/>
@@ -5953,7 +5953,7 @@
             <w:noProof/>
             <w:webHidden/>
           </w:rPr>
-          <w:instrText xml:space="preserve"> PAGEREF _Toc243082385 \h </w:instrText>
+          <w:instrText xml:space="preserve"> PAGEREF _Toc243083390 \h </w:instrText>
         </w:r>
         <w:r>
           <w:rPr>
@@ -5999,7 +5999,7 @@
           <w14:ligatures w14:val="standardContextual"/>
         </w:rPr>
       </w:pPr>
-      <w:hyperlink w:anchor="_Toc243082386" w:history="1">
+      <w:hyperlink w:anchor="_Toc243083391" w:history="1">
         <w:r>
           <w:rPr>
             <w:rStyle w:val="Hyperlink"/>
@@ -6026,7 +6026,7 @@
             <w:noProof/>
             <w:webHidden/>
           </w:rPr>
-          <w:instrText xml:space="preserve"> PAGEREF _Toc243082386 \h </w:instrText>
+          <w:instrText xml:space="preserve"> PAGEREF _Toc243083391 \h </w:instrText>
         </w:r>
         <w:r>
           <w:rPr>
@@ -6072,7 +6072,7 @@
           <w14:ligatures w14:val="standardContextual"/>
         </w:rPr>
       </w:pPr>
-      <w:hyperlink w:anchor="_Toc243082387" w:history="1">
+      <w:hyperlink w:anchor="_Toc243083392" w:history="1">
         <w:r>
           <w:rPr>
             <w:rStyle w:val="Hyperlink"/>
@@ -6099,7 +6099,7 @@
             <w:noProof/>
             <w:webHidden/>
           </w:rPr>
-          <w:instrText xml:space="preserve"> PAGEREF _Toc243082387 \h </w:instrText>
+          <w:instrText xml:space="preserve"> PAGEREF _Toc243083392 \h </w:instrText>
         </w:r>
         <w:r>
           <w:rPr>
@@ -6145,7 +6145,7 @@
           <w14:ligatures w14:val="standardContextual"/>
         </w:rPr>
       </w:pPr>
-      <w:hyperlink w:anchor="_Toc243082388" w:history="1">
+      <w:hyperlink w:anchor="_Toc243083393" w:history="1">
         <w:r>
           <w:rPr>
             <w:rStyle w:val="Hyperlink"/>
@@ -6172,7 +6172,7 @@
             <w:noProof/>
             <w:webHidden/>
           </w:rPr>
-          <w:instrText xml:space="preserve"> PAGEREF _Toc243082388 \h </w:instrText>
+          <w:instrText xml:space="preserve"> PAGEREF _Toc243083393 \h </w:instrText>
         </w:r>
         <w:r>
           <w:rPr>
@@ -6218,7 +6218,7 @@
           <w14:ligatures w14:val="standardContextual"/>
         </w:rPr>
       </w:pPr>
-      <w:hyperlink w:anchor="_Toc243082389" w:history="1">
+      <w:hyperlink w:anchor="_Toc243083394" w:history="1">
         <w:r>
           <w:rPr>
             <w:rStyle w:val="Hyperlink"/>
@@ -6245,7 +6245,7 @@
             <w:noProof/>
             <w:webHidden/>
           </w:rPr>
-          <w:instrText xml:space="preserve"> PAGEREF _Toc243082389 \h </w:instrText>
+          <w:instrText xml:space="preserve"> PAGEREF _Toc243083394 \h </w:instrText>
         </w:r>
         <w:r>
           <w:rPr>
@@ -6291,7 +6291,7 @@
           <w14:ligatures w14:val="standardContextual"/>
         </w:rPr>
       </w:pPr>
-      <w:hyperlink w:anchor="_Toc243082390" w:history="1">
+      <w:hyperlink w:anchor="_Toc243083395" w:history="1">
         <w:r>
           <w:rPr>
             <w:rStyle w:val="Hyperlink"/>
@@ -6318,7 +6318,7 @@
             <w:noProof/>
             <w:webHidden/>
           </w:rPr>
-          <w:instrText xml:space="preserve"> PAGEREF _Toc243082390 \h </w:instrText>
+          <w:instrText xml:space="preserve"> PAGEREF _Toc243083395 \h </w:instrText>
         </w:r>
         <w:r>
           <w:rPr>
@@ -6364,7 +6364,7 @@
           <w14:ligatures w14:val="standardContextual"/>
         </w:rPr>
       </w:pPr>
-      <w:hyperlink w:anchor="_Toc243082391" w:history="1">
+      <w:hyperlink w:anchor="_Toc243083396" w:history="1">
         <w:r>
           <w:rPr>
             <w:rStyle w:val="Hyperlink"/>
@@ -6391,7 +6391,7 @@
             <w:noProof/>
             <w:webHidden/>
           </w:rPr>
-          <w:instrText xml:space="preserve"> PAGEREF _Toc243082391 \h </w:instrText>
+          <w:instrText xml:space="preserve"> PAGEREF _Toc243083396 \h </w:instrText>
         </w:r>
         <w:r>
           <w:rPr>
@@ -6437,7 +6437,7 @@
           <w14:ligatures w14:val="standardContextual"/>
         </w:rPr>
       </w:pPr>
-      <w:hyperlink w:anchor="_Toc243082392" w:history="1">
+      <w:hyperlink w:anchor="_Toc243083397" w:history="1">
         <w:r>
           <w:rPr>
             <w:rStyle w:val="Hyperlink"/>
@@ -6464,7 +6464,7 @@
             <w:noProof/>
             <w:webHidden/>
           </w:rPr>
-          <w:instrText xml:space="preserve"> PAGEREF _Toc243082392 \h </w:instrText>
+          <w:instrText xml:space="preserve"> PAGEREF _Toc243083397 \h </w:instrText>
         </w:r>
         <w:r>
           <w:rPr>
@@ -6510,7 +6510,7 @@
           <w14:ligatures w14:val="standardContextual"/>
         </w:rPr>
       </w:pPr>
-      <w:hyperlink w:anchor="_Toc243082393" w:history="1">
+      <w:hyperlink w:anchor="_Toc243083398" w:history="1">
         <w:r>
           <w:rPr>
             <w:rStyle w:val="Hyperlink"/>
@@ -6537,7 +6537,7 @@
             <w:noProof/>
             <w:webHidden/>
           </w:rPr>
-          <w:instrText xml:space="preserve"> PAGEREF _Toc243082393 \h </w:instrText>
+          <w:instrText xml:space="preserve"> PAGEREF _Toc243083398 \h </w:instrText>
         </w:r>
         <w:r>
           <w:rPr>
@@ -6583,7 +6583,7 @@
           <w14:ligatures w14:val="standardContextual"/>
         </w:rPr>
       </w:pPr>
-      <w:hyperlink w:anchor="_Toc243082394" w:history="1">
+      <w:hyperlink w:anchor="_Toc243083399" w:history="1">
         <w:r>
           <w:rPr>
             <w:rStyle w:val="Hyperlink"/>
@@ -6610,7 +6610,7 @@
             <w:noProof/>
             <w:webHidden/>
           </w:rPr>
-          <w:instrText xml:space="preserve"> PAGEREF _Toc243082394 \h </w:instrText>
+          <w:instrText xml:space="preserve"> PAGEREF _Toc243083399 \h </w:instrText>
         </w:r>
         <w:r>
           <w:rPr>
@@ -6656,7 +6656,7 @@
           <w14:ligatures w14:val="standardContextual"/>
         </w:rPr>
       </w:pPr>
-      <w:hyperlink w:anchor="_Toc243082395" w:history="1">
+      <w:hyperlink w:anchor="_Toc243083400" w:history="1">
         <w:r>
           <w:rPr>
             <w:rStyle w:val="Hyperlink"/>
@@ -6683,7 +6683,7 @@
             <w:noProof/>
             <w:webHidden/>
           </w:rPr>
-          <w:instrText xml:space="preserve"> PAGEREF _Toc243082395 \h </w:instrText>
+          <w:instrText xml:space="preserve"> PAGEREF _Toc243083400 \h </w:instrText>
         </w:r>
         <w:r>
           <w:rPr>
@@ -6729,7 +6729,7 @@
           <w14:ligatures w14:val="standardContextual"/>
         </w:rPr>
       </w:pPr>
-      <w:hyperlink w:anchor="_Toc243082396" w:history="1">
+      <w:hyperlink w:anchor="_Toc243083401" w:history="1">
         <w:r>
           <w:rPr>
             <w:rStyle w:val="Hyperlink"/>
@@ -6779,7 +6779,7 @@
             <w:noProof/>
             <w:webHidden/>
           </w:rPr>
-          <w:instrText xml:space="preserve"> PAGEREF _Toc243082396 \h </w:instrText>
+          <w:instrText xml:space="preserve"> PAGEREF _Toc243083401 \h </w:instrText>
         </w:r>
         <w:r>
           <w:rPr>
@@ -6831,7 +6831,7 @@
         <w:pStyle w:val="Ttulo1"/>
         <w:jc w:val="center"/>
       </w:pPr>
-      <w:bookmarkStart w:id="0" w:name="_Toc243082348"/>
+      <w:bookmarkStart w:id="0" w:name="_Toc243083353"/>
       <w:r>
         <w:lastRenderedPageBreak/>
         <w:t>INTRODUÇÃO</w:t>
@@ -6987,7 +6987,7 @@
       <w:pPr>
         <w:pStyle w:val="Ttulo1"/>
       </w:pPr>
-      <w:bookmarkStart w:id="1" w:name="_Toc243082349"/>
+      <w:bookmarkStart w:id="1" w:name="_Toc243083354"/>
       <w:r>
         <w:lastRenderedPageBreak/>
         <w:t>1 REFERENCIAL TEÓRICO</w:t>
@@ -6998,7 +6998,7 @@
       <w:pPr>
         <w:pStyle w:val="Ttulo2"/>
       </w:pPr>
-      <w:bookmarkStart w:id="2" w:name="_Toc243082350"/>
+      <w:bookmarkStart w:id="2" w:name="_Toc243083355"/>
       <w:r>
         <w:t>1.1 FORMAÇÃO DA SATISFAÇÃO E TEORIA DOS TRÊS FATORES</w:t>
       </w:r>
@@ -7033,7 +7033,7 @@
       <w:pPr>
         <w:pStyle w:val="Ttulo2"/>
       </w:pPr>
-      <w:bookmarkStart w:id="3" w:name="_Toc243082351"/>
+      <w:bookmarkStart w:id="3" w:name="_Toc243083356"/>
       <w:r>
         <w:t>1.2 AVALIAÇÕES ONLINE: COMPRESSÃO DAS NOTAS E VIESES DE RELATO</w:t>
       </w:r>
@@ -7069,7 +7069,7 @@
       <w:pPr>
         <w:pStyle w:val="Ttulo2"/>
       </w:pPr>
-      <w:bookmarkStart w:id="4" w:name="_Toc243082352"/>
+      <w:bookmarkStart w:id="4" w:name="_Toc243083357"/>
       <w:r>
         <w:t>1.3 AS AVALIAÇÕES DO AIRBNB E O SEU CONTEÚDO</w:t>
       </w:r>
@@ -7114,7 +7114,7 @@
       <w:pPr>
         <w:pStyle w:val="Ttulo2"/>
       </w:pPr>
-      <w:bookmarkStart w:id="5" w:name="_Toc243082353"/>
+      <w:bookmarkStart w:id="5" w:name="_Toc243083358"/>
       <w:r>
         <w:t>1.4 DETERMINANTES DE PREÇO E DE REPUTAÇÃO</w:t>
       </w:r>
@@ -7138,7 +7138,7 @@
       <w:pPr>
         <w:pStyle w:val="Ttulo2"/>
       </w:pPr>
-      <w:bookmarkStart w:id="6" w:name="_Toc243082354"/>
+      <w:bookmarkStart w:id="6" w:name="_Toc243083359"/>
       <w:r>
         <w:t>1.5 ANÁLISE DE SENTIMENTO POR ASPECTO E MODELOS DE LINGUAGEM</w:t>
       </w:r>
@@ -7178,7 +7178,7 @@
       <w:pPr>
         <w:pStyle w:val="Ttulo2"/>
       </w:pPr>
-      <w:bookmarkStart w:id="7" w:name="_Toc243082355"/>
+      <w:bookmarkStart w:id="7" w:name="_Toc243083360"/>
       <w:r>
         <w:t>1.6 MODELAGEM DE TÓPICOS</w:t>
       </w:r>
@@ -7217,7 +7217,7 @@
       <w:pPr>
         <w:pStyle w:val="Ttulo2"/>
       </w:pPr>
-      <w:bookmarkStart w:id="8" w:name="_Toc243082356"/>
+      <w:bookmarkStart w:id="8" w:name="_Toc243083361"/>
       <w:r>
         <w:t>1.7 VALIDAÇÃO, CONCORDÂNCIA E IMPORTÂNCIA RELATIVA</w:t>
       </w:r>
@@ -7269,7 +7269,7 @@
       <w:pPr>
         <w:pStyle w:val="Ttulo2"/>
       </w:pPr>
-      <w:bookmarkStart w:id="9" w:name="_Toc243082357"/>
+      <w:bookmarkStart w:id="9" w:name="_Toc243083362"/>
       <w:r>
         <w:t>1.8 BUSCA BIBLIOGRÁFICA</w:t>
       </w:r>
@@ -7283,23 +7283,17 @@
         <w:t>A revisão de literatura foi apoiada em busca bibliográfica estruturada nas bases Scopus, Web of Science e Google Acadêmico, realizada entre maio e outubro de 2026. Foram combinados termos em português e inglês relacionados ao Airbnb, às avaliações de hóspedes, à análise de sentimento por aspecto e à modelagem de tópicos. Para investigar a produção sobre o recorte geográfico, realizaram-se consultas específicas com “Airbnb” e “Rio de Janeiro”, posteriormente combinadas com termos de análise textual. Outras c</w:t>
       </w:r>
       <w:r>
-        <w:t xml:space="preserve">onsultas trataram da compressão das notas, da validação da análise por aspecto, da modelagem de tópicos e da teoria dos três fatores. Foram considerados artigos, dissertações e teses </w:t>
-      </w:r>
-      <w:r>
-        <w:rPr>
-          <w:highlight w:val="yellow"/>
-        </w:rPr>
-        <w:t>[PENDENTE: período de publicação considerado]</w:t>
-      </w:r>
-      <w:r>
-        <w:t>, selecionando-se trabalhos pertinentes às perguntas da pesquisa e aos métodos empregados. Excluíram-se duplicatas e estudos sem relação direta com o escopo. A busca foi complementada pelo exame das referências e das citações dos trabalhos selecionados. O Apêndice C lista as principais consultas.</w:t>
+        <w:t>onsultas trataram da compressão das notas, da validação da análise por aspecto, da modelagem de tópicos e da teoria dos três fatores. Foram considerados artigos, dissertações e teses, sem restrição de período de publicação, selecionando-se trabalhos pertinentes às perguntas da pesquisa e aos métodos empregados. Excluíram-se duplicatas e estudos sem relação direta com o escopo. A busca foi complementada pelo exame das referências e das citações dos trabalhos selecionados. O Apêndice C lista as principais con</w:t>
+      </w:r>
+      <w:r>
+        <w:t>sultas.</w:t>
       </w:r>
     </w:p>
     <w:p>
       <w:pPr>
         <w:pStyle w:val="Ttulo2"/>
       </w:pPr>
-      <w:bookmarkStart w:id="10" w:name="_Toc243082358"/>
+      <w:bookmarkStart w:id="10" w:name="_Toc243083363"/>
       <w:r>
         <w:t>1.9 LACUNA</w:t>
       </w:r>
@@ -7328,7 +7322,7 @@
       <w:pPr>
         <w:pStyle w:val="Ttulo1"/>
       </w:pPr>
-      <w:bookmarkStart w:id="11" w:name="_Toc243082359"/>
+      <w:bookmarkStart w:id="11" w:name="_Toc243083364"/>
       <w:r>
         <w:lastRenderedPageBreak/>
         <w:t>2 DADOS E MÉTODO</w:t>
@@ -7349,7 +7343,7 @@
         <w:keepNext/>
         <w:spacing w:before="120" w:after="80"/>
       </w:pPr>
-      <w:bookmarkStart w:id="12" w:name="_Toc243082397"/>
+      <w:bookmarkStart w:id="12" w:name="_Toc243083402"/>
       <w:r>
         <w:rPr>
           <w:b w:val="0"/>
@@ -7420,7 +7414,7 @@
           <w:noProof/>
         </w:rPr>
         <w:drawing>
-          <wp:inline distT="0" distB="0" distL="0" distR="0" wp14:anchorId="06E09104" wp14:editId="7027F08F">
+          <wp:inline distT="0" distB="0" distL="0" distR="0" wp14:anchorId="67C80E38" wp14:editId="00D6620C">
             <wp:extent cx="5299200" cy="3821405"/>
             <wp:effectExtent l="0" t="0" r="0" b="0"/>
             <wp:docPr id="1" name="Picture 1"/>
@@ -7471,7 +7465,7 @@
       <w:pPr>
         <w:pStyle w:val="Ttulo2"/>
       </w:pPr>
-      <w:bookmarkStart w:id="13" w:name="_Toc243082360"/>
+      <w:bookmarkStart w:id="13" w:name="_Toc243083365"/>
       <w:r>
         <w:t>2.1 BASE E RECORTE</w:t>
       </w:r>
@@ -7521,7 +7515,7 @@
       <w:pPr>
         <w:pStyle w:val="Ttulo2"/>
       </w:pPr>
-      <w:bookmarkStart w:id="14" w:name="_Toc243082361"/>
+      <w:bookmarkStart w:id="14" w:name="_Toc243083366"/>
       <w:r>
         <w:t>2.2 ASPECTOS ÉTICOS, AMBIENTE DE EXECUÇÃO E DISPONIBILIDADE</w:t>
       </w:r>
@@ -7633,14 +7627,14 @@
         <w:t>https://github.com/reirasdev/airbnb-reviews-topic-modelling-code</w:t>
       </w:r>
       <w:r>
-        <w:t>), licenciado sob a GNU Affero General Public License v3.0 (AGPLv3).</w:t>
+        <w:t>), licenciado sob a GNU General Public License v3.0 (GPLv3).</w:t>
       </w:r>
     </w:p>
     <w:p>
       <w:pPr>
         <w:pStyle w:val="Ttulo2"/>
       </w:pPr>
-      <w:bookmarkStart w:id="15" w:name="_Toc243082362"/>
+      <w:bookmarkStart w:id="15" w:name="_Toc243083367"/>
       <w:r>
         <w:t>2.3 O QUE A BASE PERMITE MEDIR</w:t>
       </w:r>
@@ -7752,7 +7746,7 @@
       <w:pPr>
         <w:pStyle w:val="Ttulo2"/>
       </w:pPr>
-      <w:bookmarkStart w:id="16" w:name="_Toc243082363"/>
+      <w:bookmarkStart w:id="16" w:name="_Toc243083368"/>
       <w:r>
         <w:t>2.4 MEDIÇÃO DO SENTIMENTO</w:t>
       </w:r>
@@ -7926,7 +7920,7 @@
       <w:pPr>
         <w:pStyle w:val="Ttulo2"/>
       </w:pPr>
-      <w:bookmarkStart w:id="17" w:name="_Toc243082364"/>
+      <w:bookmarkStart w:id="17" w:name="_Toc243083369"/>
       <w:r>
         <w:t>2.5 TÓPICOS E ASPECTOS</w:t>
       </w:r>
@@ -8070,7 +8064,7 @@
       <w:pPr>
         <w:pStyle w:val="Ttulo2"/>
       </w:pPr>
-      <w:bookmarkStart w:id="18" w:name="_Toc243082365"/>
+      <w:bookmarkStart w:id="18" w:name="_Toc243083370"/>
       <w:r>
         <w:t>2.6 PERFIL POR ANÚNCIO</w:t>
       </w:r>
@@ -8090,7 +8084,7 @@
         <w:keepNext/>
         <w:spacing w:before="120" w:after="80"/>
       </w:pPr>
-      <w:bookmarkStart w:id="19" w:name="_Toc243082408"/>
+      <w:bookmarkStart w:id="19" w:name="_Toc243083413"/>
       <w:r>
         <w:rPr>
           <w:b w:val="0"/>
@@ -8924,7 +8918,7 @@
       <w:pPr>
         <w:pStyle w:val="Ttulo2"/>
       </w:pPr>
-      <w:bookmarkStart w:id="20" w:name="_Toc243082366"/>
+      <w:bookmarkStart w:id="20" w:name="_Toc243083371"/>
       <w:r>
         <w:t>2.7 DESENHO ANALÍTICO</w:t>
       </w:r>
@@ -9026,7 +9020,7 @@
       <w:pPr>
         <w:pStyle w:val="Ttulo1"/>
       </w:pPr>
-      <w:bookmarkStart w:id="21" w:name="_Toc243082367"/>
+      <w:bookmarkStart w:id="21" w:name="_Toc243083372"/>
       <w:r>
         <w:lastRenderedPageBreak/>
         <w:t>3 VALIDAÇÃO DA MEDIÇÃO</w:t>
@@ -9048,7 +9042,7 @@
       <w:pPr>
         <w:pStyle w:val="Ttulo2"/>
       </w:pPr>
-      <w:bookmarkStart w:id="22" w:name="_Toc243082368"/>
+      <w:bookmarkStart w:id="22" w:name="_Toc243083373"/>
       <w:r>
         <w:t>3.1 EVIDÊNCIA DIRETA: FRASES ROTULADAS</w:t>
       </w:r>
@@ -9079,7 +9073,7 @@
         <w:keepNext/>
         <w:spacing w:before="120" w:after="80"/>
       </w:pPr>
-      <w:bookmarkStart w:id="23" w:name="_Toc243082409"/>
+      <w:bookmarkStart w:id="23" w:name="_Toc243083414"/>
       <w:r>
         <w:rPr>
           <w:b w:val="0"/>
@@ -9773,7 +9767,7 @@
         <w:keepNext/>
         <w:spacing w:before="120" w:after="80"/>
       </w:pPr>
-      <w:bookmarkStart w:id="24" w:name="_Toc243082410"/>
+      <w:bookmarkStart w:id="24" w:name="_Toc243083415"/>
       <w:r>
         <w:rPr>
           <w:b w:val="0"/>
@@ -10381,7 +10375,7 @@
       <w:pPr>
         <w:pStyle w:val="Ttulo2"/>
       </w:pPr>
-      <w:bookmarkStart w:id="25" w:name="_Toc243082369"/>
+      <w:bookmarkStart w:id="25" w:name="_Toc243083374"/>
       <w:r>
         <w:t>3.2 CONCORDÂNCIA ENTRE OS DOIS MODELOS</w:t>
       </w:r>
@@ -10403,7 +10397,7 @@
       <w:pPr>
         <w:pStyle w:val="Ttulo2"/>
       </w:pPr>
-      <w:bookmarkStart w:id="26" w:name="_Toc243082370"/>
+      <w:bookmarkStart w:id="26" w:name="_Toc243083375"/>
       <w:r>
         <w:t>3.3 REGRA DE ESCOLHA FIXADA DE ANTEMÃO E MODELO PRINCIPAL</w:t>
       </w:r>
@@ -10424,7 +10418,7 @@
       <w:pPr>
         <w:pStyle w:val="Ttulo2"/>
       </w:pPr>
-      <w:bookmarkStart w:id="27" w:name="_Toc243082371"/>
+      <w:bookmarkStart w:id="27" w:name="_Toc243083376"/>
       <w:r>
         <w:t>3.4 VALIDADE DE CONSTRUTO: CONCORDÂNCIA COM AS SUBNOTAS OFICIAIS</w:t>
       </w:r>
@@ -10444,7 +10438,7 @@
         <w:keepNext/>
         <w:spacing w:before="120" w:after="80"/>
       </w:pPr>
-      <w:bookmarkStart w:id="28" w:name="_Toc243082411"/>
+      <w:bookmarkStart w:id="28" w:name="_Toc243083416"/>
       <w:r>
         <w:rPr>
           <w:b w:val="0"/>
@@ -11665,7 +11659,7 @@
       <w:pPr>
         <w:pStyle w:val="Ttulo2"/>
       </w:pPr>
-      <w:bookmarkStart w:id="29" w:name="_Toc243082372"/>
+      <w:bookmarkStart w:id="29" w:name="_Toc243083377"/>
       <w:r>
         <w:t>3.5 CHECAGEM COM UM SEGUNDO MÉTODO DE TÓPICOS E COM UM SEGUNDO ANOTADOR</w:t>
       </w:r>
@@ -11688,7 +11682,7 @@
         <w:keepNext/>
         <w:spacing w:before="120" w:after="80"/>
       </w:pPr>
-      <w:bookmarkStart w:id="30" w:name="_Toc243082412"/>
+      <w:bookmarkStart w:id="30" w:name="_Toc243083417"/>
       <w:r>
         <w:rPr>
           <w:b w:val="0"/>
@@ -12513,7 +12507,7 @@
       <w:pPr>
         <w:pStyle w:val="Ttulo2"/>
       </w:pPr>
-      <w:bookmarkStart w:id="31" w:name="_Toc243082373"/>
+      <w:bookmarkStart w:id="31" w:name="_Toc243083378"/>
       <w:r>
         <w:t>3.6 CLASSIFICAÇÃO DOS ASPECTOS</w:t>
       </w:r>
@@ -12564,7 +12558,7 @@
         <w:keepNext/>
         <w:spacing w:before="120" w:after="80"/>
       </w:pPr>
-      <w:bookmarkStart w:id="32" w:name="_Toc243082413"/>
+      <w:bookmarkStart w:id="32" w:name="_Toc243083418"/>
       <w:r>
         <w:rPr>
           <w:b w:val="0"/>
@@ -14209,7 +14203,7 @@
       <w:pPr>
         <w:pStyle w:val="Ttulo1"/>
       </w:pPr>
-      <w:bookmarkStart w:id="33" w:name="_Toc243082374"/>
+      <w:bookmarkStart w:id="33" w:name="_Toc243083379"/>
       <w:r>
         <w:lastRenderedPageBreak/>
         <w:t>4 O QUE O TEXTO REVELA SOBRE A NOTA</w:t>
@@ -14228,7 +14222,7 @@
       <w:pPr>
         <w:pStyle w:val="Ttulo2"/>
       </w:pPr>
-      <w:bookmarkStart w:id="34" w:name="_Toc243082375"/>
+      <w:bookmarkStart w:id="34" w:name="_Toc243083380"/>
       <w:r>
         <w:t>4.1 IMPORTÂNCIA DOS ASPECTOS</w:t>
       </w:r>
@@ -14278,7 +14272,7 @@
         <w:keepNext/>
         <w:spacing w:before="120" w:after="80"/>
       </w:pPr>
-      <w:bookmarkStart w:id="35" w:name="_Toc243082414"/>
+      <w:bookmarkStart w:id="35" w:name="_Toc243083419"/>
       <w:r>
         <w:rPr>
           <w:b w:val="0"/>
@@ -15271,7 +15265,7 @@
         <w:keepNext/>
         <w:spacing w:before="120" w:after="80"/>
       </w:pPr>
-      <w:bookmarkStart w:id="36" w:name="_Toc243082398"/>
+      <w:bookmarkStart w:id="36" w:name="_Toc243083403"/>
       <w:r>
         <w:rPr>
           <w:b w:val="0"/>
@@ -15369,7 +15363,7 @@
           <w:noProof/>
         </w:rPr>
         <w:drawing>
-          <wp:inline distT="0" distB="0" distL="0" distR="0" wp14:anchorId="4744A14C" wp14:editId="2EECCA7C">
+          <wp:inline distT="0" distB="0" distL="0" distR="0" wp14:anchorId="3B7C28D2" wp14:editId="2536DE8D">
             <wp:extent cx="5472000" cy="3323018"/>
             <wp:effectExtent l="0" t="0" r="0" b="0"/>
             <wp:docPr id="2" name="Picture 2"/>
@@ -15456,7 +15450,7 @@
         <w:keepNext/>
         <w:spacing w:before="120" w:after="80"/>
       </w:pPr>
-      <w:bookmarkStart w:id="37" w:name="_Toc243082415"/>
+      <w:bookmarkStart w:id="37" w:name="_Toc243083420"/>
       <w:r>
         <w:rPr>
           <w:b w:val="0"/>
@@ -16556,7 +16550,7 @@
         <w:keepNext/>
         <w:spacing w:before="120" w:after="80"/>
       </w:pPr>
-      <w:bookmarkStart w:id="38" w:name="_Toc243082416"/>
+      <w:bookmarkStart w:id="38" w:name="_Toc243083421"/>
       <w:r>
         <w:rPr>
           <w:b w:val="0"/>
@@ -17896,7 +17890,7 @@
       <w:pPr>
         <w:pStyle w:val="Ttulo2"/>
       </w:pPr>
-      <w:bookmarkStart w:id="39" w:name="_Toc243082376"/>
+      <w:bookmarkStart w:id="39" w:name="_Toc243083381"/>
       <w:r>
         <w:lastRenderedPageBreak/>
         <w:t>4.2 QUEIXAS E ELOGIOS POR TÓPICO</w:t>
@@ -17929,7 +17923,7 @@
         <w:keepNext/>
         <w:spacing w:before="120" w:after="80"/>
       </w:pPr>
-      <w:bookmarkStart w:id="40" w:name="_Toc243082417"/>
+      <w:bookmarkStart w:id="40" w:name="_Toc243083422"/>
       <w:r>
         <w:rPr>
           <w:b w:val="0"/>
@@ -19159,7 +19153,7 @@
         <w:keepNext/>
         <w:spacing w:before="120" w:after="80"/>
       </w:pPr>
-      <w:bookmarkStart w:id="41" w:name="_Toc243082418"/>
+      <w:bookmarkStart w:id="41" w:name="_Toc243083423"/>
       <w:r>
         <w:rPr>
           <w:b w:val="0"/>
@@ -19884,7 +19878,7 @@
         <w:keepNext/>
         <w:spacing w:before="120" w:after="80"/>
       </w:pPr>
-      <w:bookmarkStart w:id="42" w:name="_Toc243082399"/>
+      <w:bookmarkStart w:id="42" w:name="_Toc243083404"/>
       <w:r>
         <w:rPr>
           <w:b w:val="0"/>
@@ -19955,7 +19949,7 @@
           <w:noProof/>
         </w:rPr>
         <w:drawing>
-          <wp:inline distT="0" distB="0" distL="0" distR="0" wp14:anchorId="4D20C3C6" wp14:editId="7D035CC4">
+          <wp:inline distT="0" distB="0" distL="0" distR="0" wp14:anchorId="4504997E" wp14:editId="5C81618B">
             <wp:extent cx="5472000" cy="5107200"/>
             <wp:effectExtent l="0" t="0" r="0" b="0"/>
             <wp:docPr id="3" name="Picture 3"/>
@@ -20057,7 +20051,7 @@
       <w:pPr>
         <w:pStyle w:val="Ttulo2"/>
       </w:pPr>
-      <w:bookmarkStart w:id="43" w:name="_Toc243082377"/>
+      <w:bookmarkStart w:id="43" w:name="_Toc243083382"/>
       <w:r>
         <w:t>4.3 CUIDADOS DE INTERPRETAÇÃO</w:t>
       </w:r>
@@ -20075,7 +20069,7 @@
       <w:pPr>
         <w:pStyle w:val="Ttulo1"/>
       </w:pPr>
-      <w:bookmarkStart w:id="44" w:name="_Toc243082378"/>
+      <w:bookmarkStart w:id="44" w:name="_Toc243083383"/>
       <w:r>
         <w:lastRenderedPageBreak/>
         <w:t>5 APLICAÇÃO: DIAGNÓSTICO POR ANÚNCIO</w:t>
@@ -20129,7 +20123,7 @@
         <w:keepNext/>
         <w:spacing w:before="120" w:after="80"/>
       </w:pPr>
-      <w:bookmarkStart w:id="45" w:name="_Toc243082400"/>
+      <w:bookmarkStart w:id="45" w:name="_Toc243083405"/>
       <w:r>
         <w:rPr>
           <w:b w:val="0"/>
@@ -20201,7 +20195,7 @@
           <w:noProof/>
         </w:rPr>
         <w:drawing>
-          <wp:inline distT="0" distB="0" distL="0" distR="0" wp14:anchorId="050AC33E" wp14:editId="08F0D4B4">
+          <wp:inline distT="0" distB="0" distL="0" distR="0" wp14:anchorId="6A880B7A" wp14:editId="002D3C70">
             <wp:extent cx="5760000" cy="6926400"/>
             <wp:effectExtent l="0" t="0" r="0" b="0"/>
             <wp:docPr id="4" name="Picture 4"/>
@@ -20252,7 +20246,7 @@
       <w:pPr>
         <w:pStyle w:val="Ttulo2"/>
       </w:pPr>
-      <w:bookmarkStart w:id="46" w:name="_Toc243082379"/>
+      <w:bookmarkStart w:id="46" w:name="_Toc243083384"/>
       <w:r>
         <w:t>5.1 PRODUTO TÉCNICO</w:t>
       </w:r>
@@ -20415,7 +20409,7 @@
         <w:t>https://github.com/reirasdev/airbnb-reviews-topic-modelling-code</w:t>
       </w:r>
       <w:r>
-        <w:t>, licenciado sob a GNU Affero General Public License v3.0 (AGPLv3). Os dados de origem estão sob a licença CC BY 4.0 do Inside Airbnb.</w:t>
+        <w:t>, licenciado sob a GNU General Public License v3.0 (GPLv3).Os dados de origem estão sob a licença CC BY 4.0 do Inside Airbnb.</w:t>
       </w:r>
     </w:p>
     <w:p>
@@ -20443,23 +20437,17 @@
         <w:t>Categoria e critérios da CAPES.</w:t>
       </w:r>
       <w:r>
-        <w:t xml:space="preserve"> Na taxonomia geral de produtos técnicos e tecnológicos da CAPES, a ferramenta se enquadra como software ou aplicativo (programa de computador). </w:t>
-      </w:r>
-      <w:r>
-        <w:rPr>
-          <w:highlight w:val="yellow"/>
-        </w:rPr>
-        <w:t>[PENDENTE: confirmar o enquadramento e o subtipo no documento da Área Interdisciplinar (área 45), à qual o programa pertence.]</w:t>
-      </w:r>
-      <w:r>
-        <w:t xml:space="preserve"> A aderência, critério obrigatório, decorre do vínculo com a área de concentração em Sistemas de Engenharia e com a linha de pesquisa Modelagem Computacional. A demanda é espontânea, pois o produto nasceu do problema descrito na Introdução, sem solicitação externa. A replicabilidade é possível, porque o código é aberto e os dados de origem são públicos. A inovação resulta da combinação de </w:t>
+        <w:t xml:space="preserve"> Na taxonomia geral de produtos técnicos e tecnológicos da CAPES, a ferramenta se enquadra como software ou aplicativo (programa de computador). Esse enquadramento é compatível com a categoria “Software/Aplicativo (Programa de computador)”, prevista na Ficha de Avaliação da Área Interdisciplinar (Área 45) para o quadriênio 2025–2028. O produto consiste em um programa que utiliza as tabelas produzidas pelo estudo para gerar relatórios de diagnóstico por anúncio, destinados ao apoio à gestão de hospedagens. A</w:t>
+      </w:r>
+      <w:r>
+        <w:t xml:space="preserve"> aderência, critério obrigatório, decorre do vínculo com a área de concentração em Sistemas de Engenharia e com a linha de pesquisa Modelagem Computacional. A demanda é espontânea, pois o produto nasceu do problema descrito na </w:t>
       </w:r>
       <w:r>
         <w:lastRenderedPageBreak/>
-        <w:t>métodos já estabelecidos (classificadores de sentimento, modelagem de tópicos e decomposição da importância) em um diagn</w:t>
-      </w:r>
-      <w:r>
-        <w:t>óstico por anúncio. O impacto é potencial.</w:t>
+        <w:t>Introdução, sem solicitação externa. A replicabilidade é possível, porque o código é aberto e os dados de origem são públicos. A inovação resulta da combinação de métodos já estabelecidos (classificadores de sentimento, modelagem de tópicos e decomposição da importância) em um diagnós</w:t>
+      </w:r>
+      <w:r>
+        <w:t>tico por anúncio. O impacto é potencial.</w:t>
       </w:r>
     </w:p>
     <w:p>
@@ -20480,7 +20468,7 @@
       <w:pPr>
         <w:pStyle w:val="Ttulo1"/>
       </w:pPr>
-      <w:bookmarkStart w:id="47" w:name="_Toc243082380"/>
+      <w:bookmarkStart w:id="47" w:name="_Toc243083385"/>
       <w:r>
         <w:lastRenderedPageBreak/>
         <w:t>6 UM ÍNDICE ÚNICO ACRESCENTA ALGO?</w:t>
@@ -20499,7 +20487,7 @@
       <w:pPr>
         <w:pStyle w:val="Ttulo2"/>
       </w:pPr>
-      <w:bookmarkStart w:id="48" w:name="_Toc243082381"/>
+      <w:bookmarkStart w:id="48" w:name="_Toc243083386"/>
       <w:r>
         <w:t>6.1 CONSTRUÇÃO DO ÍNDICE</w:t>
       </w:r>
@@ -20555,7 +20543,7 @@
       <w:pPr>
         <w:pStyle w:val="Ttulo2"/>
       </w:pPr>
-      <w:bookmarkStart w:id="49" w:name="_Toc243082382"/>
+      <w:bookmarkStart w:id="49" w:name="_Toc243083387"/>
       <w:r>
         <w:t>6.2 COMPRESSÃO DA NOTA OFICIAL E REORDENAMENTO</w:t>
       </w:r>
@@ -20575,7 +20563,7 @@
         <w:keepNext/>
         <w:spacing w:before="120" w:after="80"/>
       </w:pPr>
-      <w:bookmarkStart w:id="50" w:name="_Toc243082401"/>
+      <w:bookmarkStart w:id="50" w:name="_Toc243083406"/>
       <w:r>
         <w:rPr>
           <w:b w:val="0"/>
@@ -20655,7 +20643,7 @@
           <w:noProof/>
         </w:rPr>
         <w:drawing>
-          <wp:inline distT="0" distB="0" distL="0" distR="0" wp14:anchorId="1A1CB331" wp14:editId="5A13224F">
+          <wp:inline distT="0" distB="0" distL="0" distR="0" wp14:anchorId="6274447D" wp14:editId="21746B45">
             <wp:extent cx="5472000" cy="2485408"/>
             <wp:effectExtent l="0" t="0" r="0" b="0"/>
             <wp:docPr id="5" name="Picture 5"/>
@@ -20719,7 +20707,7 @@
         <w:keepNext/>
         <w:spacing w:before="120" w:after="80"/>
       </w:pPr>
-      <w:bookmarkStart w:id="51" w:name="_Toc243082419"/>
+      <w:bookmarkStart w:id="51" w:name="_Toc243083424"/>
       <w:r>
         <w:rPr>
           <w:b w:val="0"/>
@@ -21244,7 +21232,7 @@
       <w:pPr>
         <w:pStyle w:val="Ttulo2"/>
       </w:pPr>
-      <w:bookmarkStart w:id="52" w:name="_Toc243082383"/>
+      <w:bookmarkStart w:id="52" w:name="_Toc243083388"/>
       <w:r>
         <w:t>6.3 PODER EXPLICATIVO SOBRE OS ÍNDICES DE VOLUME</w:t>
       </w:r>
@@ -21298,7 +21286,7 @@
         <w:keepNext/>
         <w:spacing w:before="120" w:after="80"/>
       </w:pPr>
-      <w:bookmarkStart w:id="53" w:name="_Toc243082420"/>
+      <w:bookmarkStart w:id="53" w:name="_Toc243083425"/>
       <w:r>
         <w:rPr>
           <w:b w:val="0"/>
@@ -22300,7 +22288,7 @@
       <w:pPr>
         <w:pStyle w:val="Ttulo2"/>
       </w:pPr>
-      <w:bookmarkStart w:id="54" w:name="_Toc243082384"/>
+      <w:bookmarkStart w:id="54" w:name="_Toc243083389"/>
       <w:r>
         <w:lastRenderedPageBreak/>
         <w:t>6.4 MONOTONICIDADE E REORDENAMENTO</w:t>
@@ -22321,7 +22309,7 @@
         <w:keepNext/>
         <w:spacing w:before="120" w:after="80"/>
       </w:pPr>
-      <w:bookmarkStart w:id="55" w:name="_Toc243082421"/>
+      <w:bookmarkStart w:id="55" w:name="_Toc243083426"/>
       <w:r>
         <w:rPr>
           <w:b w:val="0"/>
@@ -23179,7 +23167,7 @@
       <w:pPr>
         <w:pStyle w:val="Ttulo2"/>
       </w:pPr>
-      <w:bookmarkStart w:id="56" w:name="_Toc243082385"/>
+      <w:bookmarkStart w:id="56" w:name="_Toc243083390"/>
       <w:r>
         <w:t>6.5 SENSIBILIDADE</w:t>
       </w:r>
@@ -23223,7 +23211,7 @@
       <w:pPr>
         <w:pStyle w:val="Ttulo2"/>
       </w:pPr>
-      <w:bookmarkStart w:id="57" w:name="_Toc243082386"/>
+      <w:bookmarkStart w:id="57" w:name="_Toc243083391"/>
       <w:r>
         <w:lastRenderedPageBreak/>
         <w:t>6.6 COMO LER O RESULTADO</w:t>
@@ -23245,7 +23233,7 @@
       <w:pPr>
         <w:pStyle w:val="Ttulo1"/>
       </w:pPr>
-      <w:bookmarkStart w:id="58" w:name="_Toc243082387"/>
+      <w:bookmarkStart w:id="58" w:name="_Toc243083392"/>
       <w:r>
         <w:lastRenderedPageBreak/>
         <w:t>7 DISCUSSÃO E LIMITAÇÕES</w:t>
@@ -23256,7 +23244,7 @@
       <w:pPr>
         <w:pStyle w:val="Ttulo2"/>
       </w:pPr>
-      <w:bookmarkStart w:id="59" w:name="_Toc243082388"/>
+      <w:bookmarkStart w:id="59" w:name="_Toc243083393"/>
       <w:r>
         <w:t>7.1 OS RESULTADOS À LUZ DA LITERATURA</w:t>
       </w:r>
@@ -23326,7 +23314,7 @@
       <w:pPr>
         <w:pStyle w:val="Ttulo2"/>
       </w:pPr>
-      <w:bookmarkStart w:id="60" w:name="_Toc243082389"/>
+      <w:bookmarkStart w:id="60" w:name="_Toc243083394"/>
       <w:r>
         <w:t>7.2 IMPLICAÇÕES PARA ANFITRIÕES E EMPRESAS GESTORAS</w:t>
       </w:r>
@@ -23347,7 +23335,7 @@
       <w:pPr>
         <w:pStyle w:val="Ttulo2"/>
       </w:pPr>
-      <w:bookmarkStart w:id="61" w:name="_Toc243082390"/>
+      <w:bookmarkStart w:id="61" w:name="_Toc243083395"/>
       <w:r>
         <w:t>7.3 LIMITAÇÕES</w:t>
       </w:r>
@@ -23432,7 +23420,7 @@
         <w:pStyle w:val="Ttulo1"/>
         <w:jc w:val="center"/>
       </w:pPr>
-      <w:bookmarkStart w:id="62" w:name="_Toc243082391"/>
+      <w:bookmarkStart w:id="62" w:name="_Toc243083396"/>
       <w:r>
         <w:lastRenderedPageBreak/>
         <w:t>CONCLUSÕES</w:t>
@@ -23537,7 +23525,7 @@
         <w:pStyle w:val="Ttulo1"/>
         <w:jc w:val="center"/>
       </w:pPr>
-      <w:bookmarkStart w:id="63" w:name="_Toc243082392"/>
+      <w:bookmarkStart w:id="63" w:name="_Toc243083397"/>
       <w:r>
         <w:lastRenderedPageBreak/>
         <w:t>REFERÊNCIAS</w:t>
@@ -24855,7 +24843,7 @@
         <w:pStyle w:val="Ttulo1"/>
         <w:jc w:val="center"/>
       </w:pPr>
-      <w:bookmarkStart w:id="64" w:name="_Toc243082393"/>
+      <w:bookmarkStart w:id="64" w:name="_Toc243083398"/>
       <w:r>
         <w:lastRenderedPageBreak/>
         <w:t>APÊNDICE A – REGISTRO DATADO DA REGRA DE ESCOLHA DO MODELO PRINCIPAL</w:t>
@@ -24920,7 +24908,7 @@
         <w:keepNext/>
         <w:spacing w:before="120" w:after="80"/>
       </w:pPr>
-      <w:bookmarkStart w:id="65" w:name="_Toc243082422"/>
+      <w:bookmarkStart w:id="65" w:name="_Toc243083427"/>
       <w:r>
         <w:rPr>
           <w:b w:val="0"/>
@@ -25464,7 +25452,7 @@
         <w:pStyle w:val="Ttulo1"/>
         <w:jc w:val="center"/>
       </w:pPr>
-      <w:bookmarkStart w:id="66" w:name="_Toc243082394"/>
+      <w:bookmarkStart w:id="66" w:name="_Toc243083399"/>
       <w:r>
         <w:lastRenderedPageBreak/>
         <w:t>APÊNDICE B – RELATÓRIOS DE DIAGNÓSTICO DOS TRÊS EXEMPLOS</w:t>
@@ -25485,7 +25473,7 @@
         <w:keepNext/>
         <w:spacing w:before="120" w:after="80"/>
       </w:pPr>
-      <w:bookmarkStart w:id="67" w:name="_Toc243082402"/>
+      <w:bookmarkStart w:id="67" w:name="_Toc243083407"/>
       <w:r>
         <w:rPr>
           <w:b w:val="0"/>
@@ -25564,7 +25552,7 @@
           <w:noProof/>
         </w:rPr>
         <w:drawing>
-          <wp:inline distT="0" distB="0" distL="0" distR="0" wp14:anchorId="2B1823CA" wp14:editId="5821D638">
+          <wp:inline distT="0" distB="0" distL="0" distR="0" wp14:anchorId="0A440199" wp14:editId="6DFE01A7">
             <wp:extent cx="5760000" cy="5348160"/>
             <wp:effectExtent l="0" t="0" r="0" b="0"/>
             <wp:docPr id="6" name="Picture 6"/>
@@ -25617,7 +25605,7 @@
         <w:keepNext/>
         <w:spacing w:before="120" w:after="80"/>
       </w:pPr>
-      <w:bookmarkStart w:id="68" w:name="_Toc243082403"/>
+      <w:bookmarkStart w:id="68" w:name="_Toc243083408"/>
       <w:r>
         <w:rPr>
           <w:b w:val="0"/>
@@ -25689,7 +25677,7 @@
           <w:noProof/>
         </w:rPr>
         <w:drawing>
-          <wp:inline distT="0" distB="0" distL="0" distR="0" wp14:anchorId="25241A61" wp14:editId="7514D4A0">
+          <wp:inline distT="0" distB="0" distL="0" distR="0" wp14:anchorId="449250EA" wp14:editId="3C36F48E">
             <wp:extent cx="5760000" cy="4708800"/>
             <wp:effectExtent l="0" t="0" r="0" b="0"/>
             <wp:docPr id="7" name="Picture 7"/>
@@ -25742,7 +25730,7 @@
         <w:keepNext/>
         <w:spacing w:before="120" w:after="80"/>
       </w:pPr>
-      <w:bookmarkStart w:id="69" w:name="_Toc243082404"/>
+      <w:bookmarkStart w:id="69" w:name="_Toc243083409"/>
       <w:r>
         <w:rPr>
           <w:b w:val="0"/>
@@ -25814,7 +25802,7 @@
           <w:noProof/>
         </w:rPr>
         <w:drawing>
-          <wp:inline distT="0" distB="0" distL="0" distR="0" wp14:anchorId="3B2DF2B7" wp14:editId="6CC5223B">
+          <wp:inline distT="0" distB="0" distL="0" distR="0" wp14:anchorId="2350B35F" wp14:editId="69FDF76F">
             <wp:extent cx="5760000" cy="6926400"/>
             <wp:effectExtent l="0" t="0" r="0" b="0"/>
             <wp:docPr id="8" name="Picture 8"/>
@@ -25867,7 +25855,7 @@
         <w:keepNext/>
         <w:spacing w:before="120" w:after="80"/>
       </w:pPr>
-      <w:bookmarkStart w:id="70" w:name="_Toc243082405"/>
+      <w:bookmarkStart w:id="70" w:name="_Toc243083410"/>
       <w:r>
         <w:rPr>
           <w:b w:val="0"/>
@@ -25947,7 +25935,7 @@
           <w:noProof/>
         </w:rPr>
         <w:drawing>
-          <wp:inline distT="0" distB="0" distL="0" distR="0" wp14:anchorId="61BF23C6" wp14:editId="7CCC43F5">
+          <wp:inline distT="0" distB="0" distL="0" distR="0" wp14:anchorId="4F0A58CE" wp14:editId="5AFDBDDC">
             <wp:extent cx="5760000" cy="3729600"/>
             <wp:effectExtent l="0" t="0" r="0" b="0"/>
             <wp:docPr id="9" name="Picture 9"/>
@@ -26000,7 +25988,7 @@
         <w:keepNext/>
         <w:spacing w:before="120" w:after="80"/>
       </w:pPr>
-      <w:bookmarkStart w:id="71" w:name="_Toc243082406"/>
+      <w:bookmarkStart w:id="71" w:name="_Toc243083411"/>
       <w:r>
         <w:rPr>
           <w:b w:val="0"/>
@@ -26072,7 +26060,7 @@
           <w:noProof/>
         </w:rPr>
         <w:drawing>
-          <wp:inline distT="0" distB="0" distL="0" distR="0" wp14:anchorId="435816D3" wp14:editId="25706A34">
+          <wp:inline distT="0" distB="0" distL="0" distR="0" wp14:anchorId="536997C2" wp14:editId="14EFCA77">
             <wp:extent cx="5760000" cy="5785920"/>
             <wp:effectExtent l="0" t="0" r="0" b="0"/>
             <wp:docPr id="10" name="Picture 10"/>
@@ -26125,7 +26113,7 @@
         <w:keepNext/>
         <w:spacing w:before="120" w:after="80"/>
       </w:pPr>
-      <w:bookmarkStart w:id="72" w:name="_Toc243082407"/>
+      <w:bookmarkStart w:id="72" w:name="_Toc243083412"/>
       <w:r>
         <w:rPr>
           <w:b w:val="0"/>
@@ -26197,7 +26185,7 @@
           <w:noProof/>
         </w:rPr>
         <w:drawing>
-          <wp:inline distT="0" distB="0" distL="0" distR="0" wp14:anchorId="64A726A7" wp14:editId="7B82C5BB">
+          <wp:inline distT="0" distB="0" distL="0" distR="0" wp14:anchorId="4E36FAAA" wp14:editId="2E3B37E1">
             <wp:extent cx="5760000" cy="3729600"/>
             <wp:effectExtent l="0" t="0" r="0" b="0"/>
             <wp:docPr id="11" name="Picture 11"/>
@@ -26249,7 +26237,7 @@
         <w:pStyle w:val="Ttulo1"/>
         <w:jc w:val="center"/>
       </w:pPr>
-      <w:bookmarkStart w:id="73" w:name="_Toc243082395"/>
+      <w:bookmarkStart w:id="73" w:name="_Toc243083400"/>
       <w:r>
         <w:lastRenderedPageBreak/>
         <w:t>APÊNDICE C – ESTRATÉGIAS DE BUSCA BIBLIOGRÁFICA</w:t>
@@ -26270,7 +26258,7 @@
         <w:keepNext/>
         <w:spacing w:before="120" w:after="80"/>
       </w:pPr>
-      <w:bookmarkStart w:id="74" w:name="_Toc243082423"/>
+      <w:bookmarkStart w:id="74" w:name="_Toc243083428"/>
       <w:r>
         <w:rPr>
           <w:b w:val="0"/>
@@ -27207,7 +27195,7 @@
         <w:pStyle w:val="Ttulo1"/>
         <w:jc w:val="center"/>
       </w:pPr>
-      <w:bookmarkStart w:id="75" w:name="_Toc243082396"/>
+      <w:bookmarkStart w:id="75" w:name="_Toc243083401"/>
       <w:r>
         <w:lastRenderedPageBreak/>
         <w:t xml:space="preserve">APÊNDICE D – GANHO DE </w:t>
@@ -27243,7 +27231,7 @@
         <w:keepNext/>
         <w:spacing w:before="120" w:after="80"/>
       </w:pPr>
-      <w:bookmarkStart w:id="76" w:name="_Toc243082424"/>
+      <w:bookmarkStart w:id="76" w:name="_Toc243083429"/>
       <w:r>
         <w:rPr>
           <w:b w:val="0"/>
@@ -29388,31 +29376,31 @@
       </w:rPr>
     </w:lvl>
   </w:abstractNum>
-  <w:num w:numId="1" w16cid:durableId="143398777">
+  <w:num w:numId="1" w16cid:durableId="2061590716">
     <w:abstractNumId w:val="8"/>
   </w:num>
-  <w:num w:numId="2" w16cid:durableId="814680589">
+  <w:num w:numId="2" w16cid:durableId="1632634619">
     <w:abstractNumId w:val="6"/>
   </w:num>
-  <w:num w:numId="3" w16cid:durableId="1690567420">
+  <w:num w:numId="3" w16cid:durableId="2041583033">
     <w:abstractNumId w:val="5"/>
   </w:num>
-  <w:num w:numId="4" w16cid:durableId="1324041843">
+  <w:num w:numId="4" w16cid:durableId="244413309">
     <w:abstractNumId w:val="4"/>
   </w:num>
-  <w:num w:numId="5" w16cid:durableId="267665611">
+  <w:num w:numId="5" w16cid:durableId="1488471170">
     <w:abstractNumId w:val="7"/>
   </w:num>
-  <w:num w:numId="6" w16cid:durableId="1128665790">
+  <w:num w:numId="6" w16cid:durableId="1079711288">
     <w:abstractNumId w:val="3"/>
   </w:num>
-  <w:num w:numId="7" w16cid:durableId="138308643">
+  <w:num w:numId="7" w16cid:durableId="278806398">
     <w:abstractNumId w:val="2"/>
   </w:num>
-  <w:num w:numId="8" w16cid:durableId="253369330">
+  <w:num w:numId="8" w16cid:durableId="1365986081">
     <w:abstractNumId w:val="1"/>
   </w:num>
-  <w:num w:numId="9" w16cid:durableId="1207722297">
+  <w:num w:numId="9" w16cid:durableId="1241256449">
     <w:abstractNumId w:val="0"/>
   </w:num>
 </w:numbering>
@@ -40836,14 +40824,14 @@
     <w:next w:val="Normal"/>
     <w:uiPriority w:val="99"/>
     <w:unhideWhenUsed/>
-    <w:rsid w:val="005F462B"/>
+    <w:rsid w:val="00324579"/>
   </w:style>
   <w:style w:type="character" w:styleId="Hyperlink">
     <w:name w:val="Hyperlink"/>
     <w:basedOn w:val="Fontepargpadro"/>
     <w:uiPriority w:val="99"/>
     <w:unhideWhenUsed/>
-    <w:rsid w:val="005F462B"/>
+    <w:rsid w:val="00324579"/>
     <w:rPr>
       <w:color w:val="0000FF" w:themeColor="hyperlink"/>
       <w:u w:val="single"/>
@@ -40856,7 +40844,7 @@
     <w:autoRedefine/>
     <w:uiPriority w:val="39"/>
     <w:unhideWhenUsed/>
-    <w:rsid w:val="005F462B"/>
+    <w:rsid w:val="00324579"/>
     <w:pPr>
       <w:spacing w:after="100"/>
     </w:pPr>
@@ -40868,7 +40856,7 @@
     <w:autoRedefine/>
     <w:uiPriority w:val="39"/>
     <w:unhideWhenUsed/>
-    <w:rsid w:val="005F462B"/>
+    <w:rsid w:val="00324579"/>
     <w:pPr>
       <w:spacing w:after="100"/>
       <w:ind w:left="240"/>

</xml_diff>

<commit_message>
Produto tecnico: categoria conferida no relatorio do GT de Producao Tecnica da CAPES (2019), nova referencia; docx e pdf atualizados
Co-Authored-By: Claude Sonnet 5.5 <noreply@anthropic.com>
</commit_message>
<xml_diff>
--- a/redacao/UCP/saida/Raphael_Eiras-Decomposicao_por_aspecto_do_sentimento_em_avaliacoes_do_airbnb_rj-ucp_2026-UCP.docx
+++ b/redacao/UCP/saida/Raphael_Eiras-Decomposicao_por_aspecto_do_sentimento_em_avaliacoes_do_airbnb_rj-ucp_2026-UCP.docx
@@ -504,7 +504,7 @@
       <w:r>
         <w:fldChar w:fldCharType="separate"/>
       </w:r>
-      <w:hyperlink w:anchor="_Toc243083402" w:history="1">
+      <w:hyperlink w:anchor="_Toc243083873" w:history="1">
         <w:r>
           <w:rPr>
             <w:rStyle w:val="Hyperlink"/>
@@ -531,7 +531,7 @@
             <w:noProof/>
             <w:webHidden/>
           </w:rPr>
-          <w:instrText xml:space="preserve"> PAGEREF _Toc243083402 \h </w:instrText>
+          <w:instrText xml:space="preserve"> PAGEREF _Toc243083873 \h </w:instrText>
         </w:r>
         <w:r>
           <w:rPr>
@@ -577,7 +577,7 @@
           <w14:ligatures w14:val="standardContextual"/>
         </w:rPr>
       </w:pPr>
-      <w:hyperlink w:anchor="_Toc243083403" w:history="1">
+      <w:hyperlink w:anchor="_Toc243083874" w:history="1">
         <w:r>
           <w:rPr>
             <w:rStyle w:val="Hyperlink"/>
@@ -627,7 +627,7 @@
             <w:noProof/>
             <w:webHidden/>
           </w:rPr>
-          <w:instrText xml:space="preserve"> PAGEREF _Toc243083403 \h </w:instrText>
+          <w:instrText xml:space="preserve"> PAGEREF _Toc243083874 \h </w:instrText>
         </w:r>
         <w:r>
           <w:rPr>
@@ -673,7 +673,7 @@
           <w14:ligatures w14:val="standardContextual"/>
         </w:rPr>
       </w:pPr>
-      <w:hyperlink w:anchor="_Toc243083404" w:history="1">
+      <w:hyperlink w:anchor="_Toc243083875" w:history="1">
         <w:r>
           <w:rPr>
             <w:rStyle w:val="Hyperlink"/>
@@ -700,7 +700,7 @@
             <w:noProof/>
             <w:webHidden/>
           </w:rPr>
-          <w:instrText xml:space="preserve"> PAGEREF _Toc243083404 \h </w:instrText>
+          <w:instrText xml:space="preserve"> PAGEREF _Toc243083875 \h </w:instrText>
         </w:r>
         <w:r>
           <w:rPr>
@@ -746,7 +746,7 @@
           <w14:ligatures w14:val="standardContextual"/>
         </w:rPr>
       </w:pPr>
-      <w:hyperlink w:anchor="_Toc243083405" w:history="1">
+      <w:hyperlink w:anchor="_Toc243083876" w:history="1">
         <w:r>
           <w:rPr>
             <w:rStyle w:val="Hyperlink"/>
@@ -773,7 +773,7 @@
             <w:noProof/>
             <w:webHidden/>
           </w:rPr>
-          <w:instrText xml:space="preserve"> PAGEREF _Toc243083405 \h </w:instrText>
+          <w:instrText xml:space="preserve"> PAGEREF _Toc243083876 \h </w:instrText>
         </w:r>
         <w:r>
           <w:rPr>
@@ -819,7 +819,7 @@
           <w14:ligatures w14:val="standardContextual"/>
         </w:rPr>
       </w:pPr>
-      <w:hyperlink w:anchor="_Toc243083406" w:history="1">
+      <w:hyperlink w:anchor="_Toc243083877" w:history="1">
         <w:r>
           <w:rPr>
             <w:rStyle w:val="Hyperlink"/>
@@ -846,7 +846,7 @@
             <w:noProof/>
             <w:webHidden/>
           </w:rPr>
-          <w:instrText xml:space="preserve"> PAGEREF _Toc243083406 \h </w:instrText>
+          <w:instrText xml:space="preserve"> PAGEREF _Toc243083877 \h </w:instrText>
         </w:r>
         <w:r>
           <w:rPr>
@@ -892,7 +892,7 @@
           <w14:ligatures w14:val="standardContextual"/>
         </w:rPr>
       </w:pPr>
-      <w:hyperlink w:anchor="_Toc243083407" w:history="1">
+      <w:hyperlink w:anchor="_Toc243083878" w:history="1">
         <w:r>
           <w:rPr>
             <w:rStyle w:val="Hyperlink"/>
@@ -919,7 +919,7 @@
             <w:noProof/>
             <w:webHidden/>
           </w:rPr>
-          <w:instrText xml:space="preserve"> PAGEREF _Toc243083407 \h </w:instrText>
+          <w:instrText xml:space="preserve"> PAGEREF _Toc243083878 \h </w:instrText>
         </w:r>
         <w:r>
           <w:rPr>
@@ -965,7 +965,7 @@
           <w14:ligatures w14:val="standardContextual"/>
         </w:rPr>
       </w:pPr>
-      <w:hyperlink w:anchor="_Toc243083408" w:history="1">
+      <w:hyperlink w:anchor="_Toc243083879" w:history="1">
         <w:r>
           <w:rPr>
             <w:rStyle w:val="Hyperlink"/>
@@ -992,7 +992,7 @@
             <w:noProof/>
             <w:webHidden/>
           </w:rPr>
-          <w:instrText xml:space="preserve"> PAGEREF _Toc243083408 \h </w:instrText>
+          <w:instrText xml:space="preserve"> PAGEREF _Toc243083879 \h </w:instrText>
         </w:r>
         <w:r>
           <w:rPr>
@@ -1038,7 +1038,7 @@
           <w14:ligatures w14:val="standardContextual"/>
         </w:rPr>
       </w:pPr>
-      <w:hyperlink w:anchor="_Toc243083409" w:history="1">
+      <w:hyperlink w:anchor="_Toc243083880" w:history="1">
         <w:r>
           <w:rPr>
             <w:rStyle w:val="Hyperlink"/>
@@ -1065,7 +1065,7 @@
             <w:noProof/>
             <w:webHidden/>
           </w:rPr>
-          <w:instrText xml:space="preserve"> PAGEREF _Toc243083409 \h </w:instrText>
+          <w:instrText xml:space="preserve"> PAGEREF _Toc243083880 \h </w:instrText>
         </w:r>
         <w:r>
           <w:rPr>
@@ -1111,7 +1111,7 @@
           <w14:ligatures w14:val="standardContextual"/>
         </w:rPr>
       </w:pPr>
-      <w:hyperlink w:anchor="_Toc243083410" w:history="1">
+      <w:hyperlink w:anchor="_Toc243083881" w:history="1">
         <w:r>
           <w:rPr>
             <w:rStyle w:val="Hyperlink"/>
@@ -1138,7 +1138,7 @@
             <w:noProof/>
             <w:webHidden/>
           </w:rPr>
-          <w:instrText xml:space="preserve"> PAGEREF _Toc243083410 \h </w:instrText>
+          <w:instrText xml:space="preserve"> PAGEREF _Toc243083881 \h </w:instrText>
         </w:r>
         <w:r>
           <w:rPr>
@@ -1184,7 +1184,7 @@
           <w14:ligatures w14:val="standardContextual"/>
         </w:rPr>
       </w:pPr>
-      <w:hyperlink w:anchor="_Toc243083411" w:history="1">
+      <w:hyperlink w:anchor="_Toc243083882" w:history="1">
         <w:r>
           <w:rPr>
             <w:rStyle w:val="Hyperlink"/>
@@ -1211,7 +1211,7 @@
             <w:noProof/>
             <w:webHidden/>
           </w:rPr>
-          <w:instrText xml:space="preserve"> PAGEREF _Toc243083411 \h </w:instrText>
+          <w:instrText xml:space="preserve"> PAGEREF _Toc243083882 \h </w:instrText>
         </w:r>
         <w:r>
           <w:rPr>
@@ -1257,7 +1257,7 @@
           <w14:ligatures w14:val="standardContextual"/>
         </w:rPr>
       </w:pPr>
-      <w:hyperlink w:anchor="_Toc243083412" w:history="1">
+      <w:hyperlink w:anchor="_Toc243083883" w:history="1">
         <w:r>
           <w:rPr>
             <w:rStyle w:val="Hyperlink"/>
@@ -1284,7 +1284,7 @@
             <w:noProof/>
             <w:webHidden/>
           </w:rPr>
-          <w:instrText xml:space="preserve"> PAGEREF _Toc243083412 \h </w:instrText>
+          <w:instrText xml:space="preserve"> PAGEREF _Toc243083883 \h </w:instrText>
         </w:r>
         <w:r>
           <w:rPr>
@@ -1361,7 +1361,7 @@
       <w:r>
         <w:fldChar w:fldCharType="separate"/>
       </w:r>
-      <w:hyperlink w:anchor="_Toc243083413" w:history="1">
+      <w:hyperlink w:anchor="_Toc243083884" w:history="1">
         <w:r>
           <w:rPr>
             <w:rStyle w:val="Hyperlink"/>
@@ -1388,7 +1388,7 @@
             <w:noProof/>
             <w:webHidden/>
           </w:rPr>
-          <w:instrText xml:space="preserve"> PAGEREF _Toc243083413 \h </w:instrText>
+          <w:instrText xml:space="preserve"> PAGEREF _Toc243083884 \h </w:instrText>
         </w:r>
         <w:r>
           <w:rPr>
@@ -1434,7 +1434,7 @@
           <w14:ligatures w14:val="standardContextual"/>
         </w:rPr>
       </w:pPr>
-      <w:hyperlink w:anchor="_Toc243083414" w:history="1">
+      <w:hyperlink w:anchor="_Toc243083885" w:history="1">
         <w:r>
           <w:rPr>
             <w:rStyle w:val="Hyperlink"/>
@@ -1461,7 +1461,7 @@
             <w:noProof/>
             <w:webHidden/>
           </w:rPr>
-          <w:instrText xml:space="preserve"> PAGEREF _Toc243083414 \h </w:instrText>
+          <w:instrText xml:space="preserve"> PAGEREF _Toc243083885 \h </w:instrText>
         </w:r>
         <w:r>
           <w:rPr>
@@ -1507,7 +1507,7 @@
           <w14:ligatures w14:val="standardContextual"/>
         </w:rPr>
       </w:pPr>
-      <w:hyperlink w:anchor="_Toc243083415" w:history="1">
+      <w:hyperlink w:anchor="_Toc243083886" w:history="1">
         <w:r>
           <w:rPr>
             <w:rStyle w:val="Hyperlink"/>
@@ -1534,7 +1534,7 @@
             <w:noProof/>
             <w:webHidden/>
           </w:rPr>
-          <w:instrText xml:space="preserve"> PAGEREF _Toc243083415 \h </w:instrText>
+          <w:instrText xml:space="preserve"> PAGEREF _Toc243083886 \h </w:instrText>
         </w:r>
         <w:r>
           <w:rPr>
@@ -1580,7 +1580,7 @@
           <w14:ligatures w14:val="standardContextual"/>
         </w:rPr>
       </w:pPr>
-      <w:hyperlink w:anchor="_Toc243083416" w:history="1">
+      <w:hyperlink w:anchor="_Toc243083887" w:history="1">
         <w:r>
           <w:rPr>
             <w:rStyle w:val="Hyperlink"/>
@@ -1607,7 +1607,7 @@
             <w:noProof/>
             <w:webHidden/>
           </w:rPr>
-          <w:instrText xml:space="preserve"> PAGEREF _Toc243083416 \h </w:instrText>
+          <w:instrText xml:space="preserve"> PAGEREF _Toc243083887 \h </w:instrText>
         </w:r>
         <w:r>
           <w:rPr>
@@ -1653,7 +1653,7 @@
           <w14:ligatures w14:val="standardContextual"/>
         </w:rPr>
       </w:pPr>
-      <w:hyperlink w:anchor="_Toc243083417" w:history="1">
+      <w:hyperlink w:anchor="_Toc243083888" w:history="1">
         <w:r>
           <w:rPr>
             <w:rStyle w:val="Hyperlink"/>
@@ -1703,7 +1703,7 @@
             <w:noProof/>
             <w:webHidden/>
           </w:rPr>
-          <w:instrText xml:space="preserve"> PAGEREF _Toc243083417 \h </w:instrText>
+          <w:instrText xml:space="preserve"> PAGEREF _Toc243083888 \h </w:instrText>
         </w:r>
         <w:r>
           <w:rPr>
@@ -1749,7 +1749,7 @@
           <w14:ligatures w14:val="standardContextual"/>
         </w:rPr>
       </w:pPr>
-      <w:hyperlink w:anchor="_Toc243083418" w:history="1">
+      <w:hyperlink w:anchor="_Toc243083889" w:history="1">
         <w:r>
           <w:rPr>
             <w:rStyle w:val="Hyperlink"/>
@@ -1776,7 +1776,7 @@
             <w:noProof/>
             <w:webHidden/>
           </w:rPr>
-          <w:instrText xml:space="preserve"> PAGEREF _Toc243083418 \h </w:instrText>
+          <w:instrText xml:space="preserve"> PAGEREF _Toc243083889 \h </w:instrText>
         </w:r>
         <w:r>
           <w:rPr>
@@ -1822,7 +1822,7 @@
           <w14:ligatures w14:val="standardContextual"/>
         </w:rPr>
       </w:pPr>
-      <w:hyperlink w:anchor="_Toc243083419" w:history="1">
+      <w:hyperlink w:anchor="_Toc243083890" w:history="1">
         <w:r>
           <w:rPr>
             <w:rStyle w:val="Hyperlink"/>
@@ -1872,7 +1872,7 @@
             <w:noProof/>
             <w:webHidden/>
           </w:rPr>
-          <w:instrText xml:space="preserve"> PAGEREF _Toc243083419 \h </w:instrText>
+          <w:instrText xml:space="preserve"> PAGEREF _Toc243083890 \h </w:instrText>
         </w:r>
         <w:r>
           <w:rPr>
@@ -1918,7 +1918,7 @@
           <w14:ligatures w14:val="standardContextual"/>
         </w:rPr>
       </w:pPr>
-      <w:hyperlink w:anchor="_Toc243083420" w:history="1">
+      <w:hyperlink w:anchor="_Toc243083891" w:history="1">
         <w:r>
           <w:rPr>
             <w:rStyle w:val="Hyperlink"/>
@@ -1945,7 +1945,7 @@
             <w:noProof/>
             <w:webHidden/>
           </w:rPr>
-          <w:instrText xml:space="preserve"> PAGEREF _Toc243083420 \h </w:instrText>
+          <w:instrText xml:space="preserve"> PAGEREF _Toc243083891 \h </w:instrText>
         </w:r>
         <w:r>
           <w:rPr>
@@ -1991,7 +1991,7 @@
           <w14:ligatures w14:val="standardContextual"/>
         </w:rPr>
       </w:pPr>
-      <w:hyperlink w:anchor="_Toc243083421" w:history="1">
+      <w:hyperlink w:anchor="_Toc243083892" w:history="1">
         <w:r>
           <w:rPr>
             <w:rStyle w:val="Hyperlink"/>
@@ -2041,7 +2041,7 @@
             <w:noProof/>
             <w:webHidden/>
           </w:rPr>
-          <w:instrText xml:space="preserve"> PAGEREF _Toc243083421 \h </w:instrText>
+          <w:instrText xml:space="preserve"> PAGEREF _Toc243083892 \h </w:instrText>
         </w:r>
         <w:r>
           <w:rPr>
@@ -2087,7 +2087,7 @@
           <w14:ligatures w14:val="standardContextual"/>
         </w:rPr>
       </w:pPr>
-      <w:hyperlink w:anchor="_Toc243083422" w:history="1">
+      <w:hyperlink w:anchor="_Toc243083893" w:history="1">
         <w:r>
           <w:rPr>
             <w:rStyle w:val="Hyperlink"/>
@@ -2114,7 +2114,7 @@
             <w:noProof/>
             <w:webHidden/>
           </w:rPr>
-          <w:instrText xml:space="preserve"> PAGEREF _Toc243083422 \h </w:instrText>
+          <w:instrText xml:space="preserve"> PAGEREF _Toc243083893 \h </w:instrText>
         </w:r>
         <w:r>
           <w:rPr>
@@ -2160,7 +2160,7 @@
           <w14:ligatures w14:val="standardContextual"/>
         </w:rPr>
       </w:pPr>
-      <w:hyperlink w:anchor="_Toc243083423" w:history="1">
+      <w:hyperlink w:anchor="_Toc243083894" w:history="1">
         <w:r>
           <w:rPr>
             <w:rStyle w:val="Hyperlink"/>
@@ -2187,7 +2187,7 @@
             <w:noProof/>
             <w:webHidden/>
           </w:rPr>
-          <w:instrText xml:space="preserve"> PAGEREF _Toc243083423 \h </w:instrText>
+          <w:instrText xml:space="preserve"> PAGEREF _Toc243083894 \h </w:instrText>
         </w:r>
         <w:r>
           <w:rPr>
@@ -2233,7 +2233,7 @@
           <w14:ligatures w14:val="standardContextual"/>
         </w:rPr>
       </w:pPr>
-      <w:hyperlink w:anchor="_Toc243083424" w:history="1">
+      <w:hyperlink w:anchor="_Toc243083895" w:history="1">
         <w:r>
           <w:rPr>
             <w:rStyle w:val="Hyperlink"/>
@@ -2260,7 +2260,7 @@
             <w:noProof/>
             <w:webHidden/>
           </w:rPr>
-          <w:instrText xml:space="preserve"> PAGEREF _Toc243083424 \h </w:instrText>
+          <w:instrText xml:space="preserve"> PAGEREF _Toc243083895 \h </w:instrText>
         </w:r>
         <w:r>
           <w:rPr>
@@ -2306,7 +2306,7 @@
           <w14:ligatures w14:val="standardContextual"/>
         </w:rPr>
       </w:pPr>
-      <w:hyperlink w:anchor="_Toc243083425" w:history="1">
+      <w:hyperlink w:anchor="_Toc243083896" w:history="1">
         <w:r>
           <w:rPr>
             <w:rStyle w:val="Hyperlink"/>
@@ -2356,7 +2356,7 @@
             <w:noProof/>
             <w:webHidden/>
           </w:rPr>
-          <w:instrText xml:space="preserve"> PAGEREF _Toc243083425 \h </w:instrText>
+          <w:instrText xml:space="preserve"> PAGEREF _Toc243083896 \h </w:instrText>
         </w:r>
         <w:r>
           <w:rPr>
@@ -2402,7 +2402,7 @@
           <w14:ligatures w14:val="standardContextual"/>
         </w:rPr>
       </w:pPr>
-      <w:hyperlink w:anchor="_Toc243083426" w:history="1">
+      <w:hyperlink w:anchor="_Toc243083897" w:history="1">
         <w:r>
           <w:rPr>
             <w:rStyle w:val="Hyperlink"/>
@@ -2429,7 +2429,7 @@
             <w:noProof/>
             <w:webHidden/>
           </w:rPr>
-          <w:instrText xml:space="preserve"> PAGEREF _Toc243083426 \h </w:instrText>
+          <w:instrText xml:space="preserve"> PAGEREF _Toc243083897 \h </w:instrText>
         </w:r>
         <w:r>
           <w:rPr>
@@ -2475,7 +2475,7 @@
           <w14:ligatures w14:val="standardContextual"/>
         </w:rPr>
       </w:pPr>
-      <w:hyperlink w:anchor="_Toc243083427" w:history="1">
+      <w:hyperlink w:anchor="_Toc243083898" w:history="1">
         <w:r>
           <w:rPr>
             <w:rStyle w:val="Hyperlink"/>
@@ -2502,7 +2502,7 @@
             <w:noProof/>
             <w:webHidden/>
           </w:rPr>
-          <w:instrText xml:space="preserve"> PAGEREF _Toc243083427 \h </w:instrText>
+          <w:instrText xml:space="preserve"> PAGEREF _Toc243083898 \h </w:instrText>
         </w:r>
         <w:r>
           <w:rPr>
@@ -2548,7 +2548,7 @@
           <w14:ligatures w14:val="standardContextual"/>
         </w:rPr>
       </w:pPr>
-      <w:hyperlink w:anchor="_Toc243083428" w:history="1">
+      <w:hyperlink w:anchor="_Toc243083899" w:history="1">
         <w:r>
           <w:rPr>
             <w:rStyle w:val="Hyperlink"/>
@@ -2575,7 +2575,7 @@
             <w:noProof/>
             <w:webHidden/>
           </w:rPr>
-          <w:instrText xml:space="preserve"> PAGEREF _Toc243083428 \h </w:instrText>
+          <w:instrText xml:space="preserve"> PAGEREF _Toc243083899 \h </w:instrText>
         </w:r>
         <w:r>
           <w:rPr>
@@ -2621,7 +2621,7 @@
           <w14:ligatures w14:val="standardContextual"/>
         </w:rPr>
       </w:pPr>
-      <w:hyperlink w:anchor="_Toc243083429" w:history="1">
+      <w:hyperlink w:anchor="_Toc243083900" w:history="1">
         <w:r>
           <w:rPr>
             <w:rStyle w:val="Hyperlink"/>
@@ -2671,7 +2671,7 @@
             <w:noProof/>
             <w:webHidden/>
           </w:rPr>
-          <w:instrText xml:space="preserve"> PAGEREF _Toc243083429 \h </w:instrText>
+          <w:instrText xml:space="preserve"> PAGEREF _Toc243083900 \h </w:instrText>
         </w:r>
         <w:r>
           <w:rPr>
@@ -3225,7 +3225,7 @@
       <w:r>
         <w:fldChar w:fldCharType="separate"/>
       </w:r>
-      <w:hyperlink w:anchor="_Toc243083353" w:history="1">
+      <w:hyperlink w:anchor="_Toc243083824" w:history="1">
         <w:r>
           <w:rPr>
             <w:rStyle w:val="Hyperlink"/>
@@ -3252,7 +3252,7 @@
             <w:noProof/>
             <w:webHidden/>
           </w:rPr>
-          <w:instrText xml:space="preserve"> PAGEREF _Toc243083353 \h </w:instrText>
+          <w:instrText xml:space="preserve"> PAGEREF _Toc243083824 \h </w:instrText>
         </w:r>
         <w:r>
           <w:rPr>
@@ -3298,7 +3298,7 @@
           <w14:ligatures w14:val="standardContextual"/>
         </w:rPr>
       </w:pPr>
-      <w:hyperlink w:anchor="_Toc243083354" w:history="1">
+      <w:hyperlink w:anchor="_Toc243083825" w:history="1">
         <w:r>
           <w:rPr>
             <w:rStyle w:val="Hyperlink"/>
@@ -3325,7 +3325,7 @@
             <w:noProof/>
             <w:webHidden/>
           </w:rPr>
-          <w:instrText xml:space="preserve"> PAGEREF _Toc243083354 \h </w:instrText>
+          <w:instrText xml:space="preserve"> PAGEREF _Toc243083825 \h </w:instrText>
         </w:r>
         <w:r>
           <w:rPr>
@@ -3371,7 +3371,7 @@
           <w14:ligatures w14:val="standardContextual"/>
         </w:rPr>
       </w:pPr>
-      <w:hyperlink w:anchor="_Toc243083355" w:history="1">
+      <w:hyperlink w:anchor="_Toc243083826" w:history="1">
         <w:r>
           <w:rPr>
             <w:rStyle w:val="Hyperlink"/>
@@ -3398,7 +3398,7 @@
             <w:noProof/>
             <w:webHidden/>
           </w:rPr>
-          <w:instrText xml:space="preserve"> PAGEREF _Toc243083355 \h </w:instrText>
+          <w:instrText xml:space="preserve"> PAGEREF _Toc243083826 \h </w:instrText>
         </w:r>
         <w:r>
           <w:rPr>
@@ -3444,7 +3444,7 @@
           <w14:ligatures w14:val="standardContextual"/>
         </w:rPr>
       </w:pPr>
-      <w:hyperlink w:anchor="_Toc243083356" w:history="1">
+      <w:hyperlink w:anchor="_Toc243083827" w:history="1">
         <w:r>
           <w:rPr>
             <w:rStyle w:val="Hyperlink"/>
@@ -3471,7 +3471,7 @@
             <w:noProof/>
             <w:webHidden/>
           </w:rPr>
-          <w:instrText xml:space="preserve"> PAGEREF _Toc243083356 \h </w:instrText>
+          <w:instrText xml:space="preserve"> PAGEREF _Toc243083827 \h </w:instrText>
         </w:r>
         <w:r>
           <w:rPr>
@@ -3517,7 +3517,7 @@
           <w14:ligatures w14:val="standardContextual"/>
         </w:rPr>
       </w:pPr>
-      <w:hyperlink w:anchor="_Toc243083357" w:history="1">
+      <w:hyperlink w:anchor="_Toc243083828" w:history="1">
         <w:r>
           <w:rPr>
             <w:rStyle w:val="Hyperlink"/>
@@ -3544,7 +3544,7 @@
             <w:noProof/>
             <w:webHidden/>
           </w:rPr>
-          <w:instrText xml:space="preserve"> PAGEREF _Toc243083357 \h </w:instrText>
+          <w:instrText xml:space="preserve"> PAGEREF _Toc243083828 \h </w:instrText>
         </w:r>
         <w:r>
           <w:rPr>
@@ -3590,7 +3590,7 @@
           <w14:ligatures w14:val="standardContextual"/>
         </w:rPr>
       </w:pPr>
-      <w:hyperlink w:anchor="_Toc243083358" w:history="1">
+      <w:hyperlink w:anchor="_Toc243083829" w:history="1">
         <w:r>
           <w:rPr>
             <w:rStyle w:val="Hyperlink"/>
@@ -3617,7 +3617,7 @@
             <w:noProof/>
             <w:webHidden/>
           </w:rPr>
-          <w:instrText xml:space="preserve"> PAGEREF _Toc243083358 \h </w:instrText>
+          <w:instrText xml:space="preserve"> PAGEREF _Toc243083829 \h </w:instrText>
         </w:r>
         <w:r>
           <w:rPr>
@@ -3663,7 +3663,7 @@
           <w14:ligatures w14:val="standardContextual"/>
         </w:rPr>
       </w:pPr>
-      <w:hyperlink w:anchor="_Toc243083359" w:history="1">
+      <w:hyperlink w:anchor="_Toc243083830" w:history="1">
         <w:r>
           <w:rPr>
             <w:rStyle w:val="Hyperlink"/>
@@ -3690,7 +3690,7 @@
             <w:noProof/>
             <w:webHidden/>
           </w:rPr>
-          <w:instrText xml:space="preserve"> PAGEREF _Toc243083359 \h </w:instrText>
+          <w:instrText xml:space="preserve"> PAGEREF _Toc243083830 \h </w:instrText>
         </w:r>
         <w:r>
           <w:rPr>
@@ -3736,7 +3736,7 @@
           <w14:ligatures w14:val="standardContextual"/>
         </w:rPr>
       </w:pPr>
-      <w:hyperlink w:anchor="_Toc243083360" w:history="1">
+      <w:hyperlink w:anchor="_Toc243083831" w:history="1">
         <w:r>
           <w:rPr>
             <w:rStyle w:val="Hyperlink"/>
@@ -3763,7 +3763,7 @@
             <w:noProof/>
             <w:webHidden/>
           </w:rPr>
-          <w:instrText xml:space="preserve"> PAGEREF _Toc243083360 \h </w:instrText>
+          <w:instrText xml:space="preserve"> PAGEREF _Toc243083831 \h </w:instrText>
         </w:r>
         <w:r>
           <w:rPr>
@@ -3809,7 +3809,7 @@
           <w14:ligatures w14:val="standardContextual"/>
         </w:rPr>
       </w:pPr>
-      <w:hyperlink w:anchor="_Toc243083361" w:history="1">
+      <w:hyperlink w:anchor="_Toc243083832" w:history="1">
         <w:r>
           <w:rPr>
             <w:rStyle w:val="Hyperlink"/>
@@ -3836,7 +3836,7 @@
             <w:noProof/>
             <w:webHidden/>
           </w:rPr>
-          <w:instrText xml:space="preserve"> PAGEREF _Toc243083361 \h </w:instrText>
+          <w:instrText xml:space="preserve"> PAGEREF _Toc243083832 \h </w:instrText>
         </w:r>
         <w:r>
           <w:rPr>
@@ -3882,7 +3882,7 @@
           <w14:ligatures w14:val="standardContextual"/>
         </w:rPr>
       </w:pPr>
-      <w:hyperlink w:anchor="_Toc243083362" w:history="1">
+      <w:hyperlink w:anchor="_Toc243083833" w:history="1">
         <w:r>
           <w:rPr>
             <w:rStyle w:val="Hyperlink"/>
@@ -3909,7 +3909,7 @@
             <w:noProof/>
             <w:webHidden/>
           </w:rPr>
-          <w:instrText xml:space="preserve"> PAGEREF _Toc243083362 \h </w:instrText>
+          <w:instrText xml:space="preserve"> PAGEREF _Toc243083833 \h </w:instrText>
         </w:r>
         <w:r>
           <w:rPr>
@@ -3955,7 +3955,7 @@
           <w14:ligatures w14:val="standardContextual"/>
         </w:rPr>
       </w:pPr>
-      <w:hyperlink w:anchor="_Toc243083363" w:history="1">
+      <w:hyperlink w:anchor="_Toc243083834" w:history="1">
         <w:r>
           <w:rPr>
             <w:rStyle w:val="Hyperlink"/>
@@ -3982,7 +3982,7 @@
             <w:noProof/>
             <w:webHidden/>
           </w:rPr>
-          <w:instrText xml:space="preserve"> PAGEREF _Toc243083363 \h </w:instrText>
+          <w:instrText xml:space="preserve"> PAGEREF _Toc243083834 \h </w:instrText>
         </w:r>
         <w:r>
           <w:rPr>
@@ -4028,7 +4028,7 @@
           <w14:ligatures w14:val="standardContextual"/>
         </w:rPr>
       </w:pPr>
-      <w:hyperlink w:anchor="_Toc243083364" w:history="1">
+      <w:hyperlink w:anchor="_Toc243083835" w:history="1">
         <w:r>
           <w:rPr>
             <w:rStyle w:val="Hyperlink"/>
@@ -4055,7 +4055,7 @@
             <w:noProof/>
             <w:webHidden/>
           </w:rPr>
-          <w:instrText xml:space="preserve"> PAGEREF _Toc243083364 \h </w:instrText>
+          <w:instrText xml:space="preserve"> PAGEREF _Toc243083835 \h </w:instrText>
         </w:r>
         <w:r>
           <w:rPr>
@@ -4101,7 +4101,7 @@
           <w14:ligatures w14:val="standardContextual"/>
         </w:rPr>
       </w:pPr>
-      <w:hyperlink w:anchor="_Toc243083365" w:history="1">
+      <w:hyperlink w:anchor="_Toc243083836" w:history="1">
         <w:r>
           <w:rPr>
             <w:rStyle w:val="Hyperlink"/>
@@ -4128,7 +4128,7 @@
             <w:noProof/>
             <w:webHidden/>
           </w:rPr>
-          <w:instrText xml:space="preserve"> PAGEREF _Toc243083365 \h </w:instrText>
+          <w:instrText xml:space="preserve"> PAGEREF _Toc243083836 \h </w:instrText>
         </w:r>
         <w:r>
           <w:rPr>
@@ -4174,7 +4174,7 @@
           <w14:ligatures w14:val="standardContextual"/>
         </w:rPr>
       </w:pPr>
-      <w:hyperlink w:anchor="_Toc243083366" w:history="1">
+      <w:hyperlink w:anchor="_Toc243083837" w:history="1">
         <w:r>
           <w:rPr>
             <w:rStyle w:val="Hyperlink"/>
@@ -4201,7 +4201,7 @@
             <w:noProof/>
             <w:webHidden/>
           </w:rPr>
-          <w:instrText xml:space="preserve"> PAGEREF _Toc243083366 \h </w:instrText>
+          <w:instrText xml:space="preserve"> PAGEREF _Toc243083837 \h </w:instrText>
         </w:r>
         <w:r>
           <w:rPr>
@@ -4247,7 +4247,7 @@
           <w14:ligatures w14:val="standardContextual"/>
         </w:rPr>
       </w:pPr>
-      <w:hyperlink w:anchor="_Toc243083367" w:history="1">
+      <w:hyperlink w:anchor="_Toc243083838" w:history="1">
         <w:r>
           <w:rPr>
             <w:rStyle w:val="Hyperlink"/>
@@ -4274,7 +4274,7 @@
             <w:noProof/>
             <w:webHidden/>
           </w:rPr>
-          <w:instrText xml:space="preserve"> PAGEREF _Toc243083367 \h </w:instrText>
+          <w:instrText xml:space="preserve"> PAGEREF _Toc243083838 \h </w:instrText>
         </w:r>
         <w:r>
           <w:rPr>
@@ -4320,7 +4320,7 @@
           <w14:ligatures w14:val="standardContextual"/>
         </w:rPr>
       </w:pPr>
-      <w:hyperlink w:anchor="_Toc243083368" w:history="1">
+      <w:hyperlink w:anchor="_Toc243083839" w:history="1">
         <w:r>
           <w:rPr>
             <w:rStyle w:val="Hyperlink"/>
@@ -4347,7 +4347,7 @@
             <w:noProof/>
             <w:webHidden/>
           </w:rPr>
-          <w:instrText xml:space="preserve"> PAGEREF _Toc243083368 \h </w:instrText>
+          <w:instrText xml:space="preserve"> PAGEREF _Toc243083839 \h </w:instrText>
         </w:r>
         <w:r>
           <w:rPr>
@@ -4393,7 +4393,7 @@
           <w14:ligatures w14:val="standardContextual"/>
         </w:rPr>
       </w:pPr>
-      <w:hyperlink w:anchor="_Toc243083369" w:history="1">
+      <w:hyperlink w:anchor="_Toc243083840" w:history="1">
         <w:r>
           <w:rPr>
             <w:rStyle w:val="Hyperlink"/>
@@ -4420,7 +4420,7 @@
             <w:noProof/>
             <w:webHidden/>
           </w:rPr>
-          <w:instrText xml:space="preserve"> PAGEREF _Toc243083369 \h </w:instrText>
+          <w:instrText xml:space="preserve"> PAGEREF _Toc243083840 \h </w:instrText>
         </w:r>
         <w:r>
           <w:rPr>
@@ -4466,7 +4466,7 @@
           <w14:ligatures w14:val="standardContextual"/>
         </w:rPr>
       </w:pPr>
-      <w:hyperlink w:anchor="_Toc243083370" w:history="1">
+      <w:hyperlink w:anchor="_Toc243083841" w:history="1">
         <w:r>
           <w:rPr>
             <w:rStyle w:val="Hyperlink"/>
@@ -4493,7 +4493,7 @@
             <w:noProof/>
             <w:webHidden/>
           </w:rPr>
-          <w:instrText xml:space="preserve"> PAGEREF _Toc243083370 \h </w:instrText>
+          <w:instrText xml:space="preserve"> PAGEREF _Toc243083841 \h </w:instrText>
         </w:r>
         <w:r>
           <w:rPr>
@@ -4539,7 +4539,7 @@
           <w14:ligatures w14:val="standardContextual"/>
         </w:rPr>
       </w:pPr>
-      <w:hyperlink w:anchor="_Toc243083371" w:history="1">
+      <w:hyperlink w:anchor="_Toc243083842" w:history="1">
         <w:r>
           <w:rPr>
             <w:rStyle w:val="Hyperlink"/>
@@ -4566,7 +4566,7 @@
             <w:noProof/>
             <w:webHidden/>
           </w:rPr>
-          <w:instrText xml:space="preserve"> PAGEREF _Toc243083371 \h </w:instrText>
+          <w:instrText xml:space="preserve"> PAGEREF _Toc243083842 \h </w:instrText>
         </w:r>
         <w:r>
           <w:rPr>
@@ -4612,7 +4612,7 @@
           <w14:ligatures w14:val="standardContextual"/>
         </w:rPr>
       </w:pPr>
-      <w:hyperlink w:anchor="_Toc243083372" w:history="1">
+      <w:hyperlink w:anchor="_Toc243083843" w:history="1">
         <w:r>
           <w:rPr>
             <w:rStyle w:val="Hyperlink"/>
@@ -4639,7 +4639,7 @@
             <w:noProof/>
             <w:webHidden/>
           </w:rPr>
-          <w:instrText xml:space="preserve"> PAGEREF _Toc243083372 \h </w:instrText>
+          <w:instrText xml:space="preserve"> PAGEREF _Toc243083843 \h </w:instrText>
         </w:r>
         <w:r>
           <w:rPr>
@@ -4685,7 +4685,7 @@
           <w14:ligatures w14:val="standardContextual"/>
         </w:rPr>
       </w:pPr>
-      <w:hyperlink w:anchor="_Toc243083373" w:history="1">
+      <w:hyperlink w:anchor="_Toc243083844" w:history="1">
         <w:r>
           <w:rPr>
             <w:rStyle w:val="Hyperlink"/>
@@ -4712,7 +4712,7 @@
             <w:noProof/>
             <w:webHidden/>
           </w:rPr>
-          <w:instrText xml:space="preserve"> PAGEREF _Toc243083373 \h </w:instrText>
+          <w:instrText xml:space="preserve"> PAGEREF _Toc243083844 \h </w:instrText>
         </w:r>
         <w:r>
           <w:rPr>
@@ -4758,7 +4758,7 @@
           <w14:ligatures w14:val="standardContextual"/>
         </w:rPr>
       </w:pPr>
-      <w:hyperlink w:anchor="_Toc243083374" w:history="1">
+      <w:hyperlink w:anchor="_Toc243083845" w:history="1">
         <w:r>
           <w:rPr>
             <w:rStyle w:val="Hyperlink"/>
@@ -4785,7 +4785,7 @@
             <w:noProof/>
             <w:webHidden/>
           </w:rPr>
-          <w:instrText xml:space="preserve"> PAGEREF _Toc243083374 \h </w:instrText>
+          <w:instrText xml:space="preserve"> PAGEREF _Toc243083845 \h </w:instrText>
         </w:r>
         <w:r>
           <w:rPr>
@@ -4831,7 +4831,7 @@
           <w14:ligatures w14:val="standardContextual"/>
         </w:rPr>
       </w:pPr>
-      <w:hyperlink w:anchor="_Toc243083375" w:history="1">
+      <w:hyperlink w:anchor="_Toc243083846" w:history="1">
         <w:r>
           <w:rPr>
             <w:rStyle w:val="Hyperlink"/>
@@ -4858,7 +4858,7 @@
             <w:noProof/>
             <w:webHidden/>
           </w:rPr>
-          <w:instrText xml:space="preserve"> PAGEREF _Toc243083375 \h </w:instrText>
+          <w:instrText xml:space="preserve"> PAGEREF _Toc243083846 \h </w:instrText>
         </w:r>
         <w:r>
           <w:rPr>
@@ -4904,7 +4904,7 @@
           <w14:ligatures w14:val="standardContextual"/>
         </w:rPr>
       </w:pPr>
-      <w:hyperlink w:anchor="_Toc243083376" w:history="1">
+      <w:hyperlink w:anchor="_Toc243083847" w:history="1">
         <w:r>
           <w:rPr>
             <w:rStyle w:val="Hyperlink"/>
@@ -4931,7 +4931,7 @@
             <w:noProof/>
             <w:webHidden/>
           </w:rPr>
-          <w:instrText xml:space="preserve"> PAGEREF _Toc243083376 \h </w:instrText>
+          <w:instrText xml:space="preserve"> PAGEREF _Toc243083847 \h </w:instrText>
         </w:r>
         <w:r>
           <w:rPr>
@@ -4977,7 +4977,7 @@
           <w14:ligatures w14:val="standardContextual"/>
         </w:rPr>
       </w:pPr>
-      <w:hyperlink w:anchor="_Toc243083377" w:history="1">
+      <w:hyperlink w:anchor="_Toc243083848" w:history="1">
         <w:r>
           <w:rPr>
             <w:rStyle w:val="Hyperlink"/>
@@ -5004,7 +5004,7 @@
             <w:noProof/>
             <w:webHidden/>
           </w:rPr>
-          <w:instrText xml:space="preserve"> PAGEREF _Toc243083377 \h </w:instrText>
+          <w:instrText xml:space="preserve"> PAGEREF _Toc243083848 \h </w:instrText>
         </w:r>
         <w:r>
           <w:rPr>
@@ -5050,7 +5050,7 @@
           <w14:ligatures w14:val="standardContextual"/>
         </w:rPr>
       </w:pPr>
-      <w:hyperlink w:anchor="_Toc243083378" w:history="1">
+      <w:hyperlink w:anchor="_Toc243083849" w:history="1">
         <w:r>
           <w:rPr>
             <w:rStyle w:val="Hyperlink"/>
@@ -5077,7 +5077,7 @@
             <w:noProof/>
             <w:webHidden/>
           </w:rPr>
-          <w:instrText xml:space="preserve"> PAGEREF _Toc243083378 \h </w:instrText>
+          <w:instrText xml:space="preserve"> PAGEREF _Toc243083849 \h </w:instrText>
         </w:r>
         <w:r>
           <w:rPr>
@@ -5123,7 +5123,7 @@
           <w14:ligatures w14:val="standardContextual"/>
         </w:rPr>
       </w:pPr>
-      <w:hyperlink w:anchor="_Toc243083379" w:history="1">
+      <w:hyperlink w:anchor="_Toc243083850" w:history="1">
         <w:r>
           <w:rPr>
             <w:rStyle w:val="Hyperlink"/>
@@ -5150,7 +5150,7 @@
             <w:noProof/>
             <w:webHidden/>
           </w:rPr>
-          <w:instrText xml:space="preserve"> PAGEREF _Toc243083379 \h </w:instrText>
+          <w:instrText xml:space="preserve"> PAGEREF _Toc243083850 \h </w:instrText>
         </w:r>
         <w:r>
           <w:rPr>
@@ -5196,7 +5196,7 @@
           <w14:ligatures w14:val="standardContextual"/>
         </w:rPr>
       </w:pPr>
-      <w:hyperlink w:anchor="_Toc243083380" w:history="1">
+      <w:hyperlink w:anchor="_Toc243083851" w:history="1">
         <w:r>
           <w:rPr>
             <w:rStyle w:val="Hyperlink"/>
@@ -5223,7 +5223,7 @@
             <w:noProof/>
             <w:webHidden/>
           </w:rPr>
-          <w:instrText xml:space="preserve"> PAGEREF _Toc243083380 \h </w:instrText>
+          <w:instrText xml:space="preserve"> PAGEREF _Toc243083851 \h </w:instrText>
         </w:r>
         <w:r>
           <w:rPr>
@@ -5269,7 +5269,7 @@
           <w14:ligatures w14:val="standardContextual"/>
         </w:rPr>
       </w:pPr>
-      <w:hyperlink w:anchor="_Toc243083381" w:history="1">
+      <w:hyperlink w:anchor="_Toc243083852" w:history="1">
         <w:r>
           <w:rPr>
             <w:rStyle w:val="Hyperlink"/>
@@ -5296,7 +5296,7 @@
             <w:noProof/>
             <w:webHidden/>
           </w:rPr>
-          <w:instrText xml:space="preserve"> PAGEREF _Toc243083381 \h </w:instrText>
+          <w:instrText xml:space="preserve"> PAGEREF _Toc243083852 \h </w:instrText>
         </w:r>
         <w:r>
           <w:rPr>
@@ -5342,7 +5342,7 @@
           <w14:ligatures w14:val="standardContextual"/>
         </w:rPr>
       </w:pPr>
-      <w:hyperlink w:anchor="_Toc243083382" w:history="1">
+      <w:hyperlink w:anchor="_Toc243083853" w:history="1">
         <w:r>
           <w:rPr>
             <w:rStyle w:val="Hyperlink"/>
@@ -5369,7 +5369,7 @@
             <w:noProof/>
             <w:webHidden/>
           </w:rPr>
-          <w:instrText xml:space="preserve"> PAGEREF _Toc243083382 \h </w:instrText>
+          <w:instrText xml:space="preserve"> PAGEREF _Toc243083853 \h </w:instrText>
         </w:r>
         <w:r>
           <w:rPr>
@@ -5415,7 +5415,7 @@
           <w14:ligatures w14:val="standardContextual"/>
         </w:rPr>
       </w:pPr>
-      <w:hyperlink w:anchor="_Toc243083383" w:history="1">
+      <w:hyperlink w:anchor="_Toc243083854" w:history="1">
         <w:r>
           <w:rPr>
             <w:rStyle w:val="Hyperlink"/>
@@ -5442,7 +5442,7 @@
             <w:noProof/>
             <w:webHidden/>
           </w:rPr>
-          <w:instrText xml:space="preserve"> PAGEREF _Toc243083383 \h </w:instrText>
+          <w:instrText xml:space="preserve"> PAGEREF _Toc243083854 \h </w:instrText>
         </w:r>
         <w:r>
           <w:rPr>
@@ -5488,7 +5488,7 @@
           <w14:ligatures w14:val="standardContextual"/>
         </w:rPr>
       </w:pPr>
-      <w:hyperlink w:anchor="_Toc243083384" w:history="1">
+      <w:hyperlink w:anchor="_Toc243083855" w:history="1">
         <w:r>
           <w:rPr>
             <w:rStyle w:val="Hyperlink"/>
@@ -5515,7 +5515,7 @@
             <w:noProof/>
             <w:webHidden/>
           </w:rPr>
-          <w:instrText xml:space="preserve"> PAGEREF _Toc243083384 \h </w:instrText>
+          <w:instrText xml:space="preserve"> PAGEREF _Toc243083855 \h </w:instrText>
         </w:r>
         <w:r>
           <w:rPr>
@@ -5561,7 +5561,7 @@
           <w14:ligatures w14:val="standardContextual"/>
         </w:rPr>
       </w:pPr>
-      <w:hyperlink w:anchor="_Toc243083385" w:history="1">
+      <w:hyperlink w:anchor="_Toc243083856" w:history="1">
         <w:r>
           <w:rPr>
             <w:rStyle w:val="Hyperlink"/>
@@ -5588,7 +5588,7 @@
             <w:noProof/>
             <w:webHidden/>
           </w:rPr>
-          <w:instrText xml:space="preserve"> PAGEREF _Toc243083385 \h </w:instrText>
+          <w:instrText xml:space="preserve"> PAGEREF _Toc243083856 \h </w:instrText>
         </w:r>
         <w:r>
           <w:rPr>
@@ -5634,7 +5634,7 @@
           <w14:ligatures w14:val="standardContextual"/>
         </w:rPr>
       </w:pPr>
-      <w:hyperlink w:anchor="_Toc243083386" w:history="1">
+      <w:hyperlink w:anchor="_Toc243083857" w:history="1">
         <w:r>
           <w:rPr>
             <w:rStyle w:val="Hyperlink"/>
@@ -5661,7 +5661,7 @@
             <w:noProof/>
             <w:webHidden/>
           </w:rPr>
-          <w:instrText xml:space="preserve"> PAGEREF _Toc243083386 \h </w:instrText>
+          <w:instrText xml:space="preserve"> PAGEREF _Toc243083857 \h </w:instrText>
         </w:r>
         <w:r>
           <w:rPr>
@@ -5707,7 +5707,7 @@
           <w14:ligatures w14:val="standardContextual"/>
         </w:rPr>
       </w:pPr>
-      <w:hyperlink w:anchor="_Toc243083387" w:history="1">
+      <w:hyperlink w:anchor="_Toc243083858" w:history="1">
         <w:r>
           <w:rPr>
             <w:rStyle w:val="Hyperlink"/>
@@ -5734,7 +5734,7 @@
             <w:noProof/>
             <w:webHidden/>
           </w:rPr>
-          <w:instrText xml:space="preserve"> PAGEREF _Toc243083387 \h </w:instrText>
+          <w:instrText xml:space="preserve"> PAGEREF _Toc243083858 \h </w:instrText>
         </w:r>
         <w:r>
           <w:rPr>
@@ -5780,7 +5780,7 @@
           <w14:ligatures w14:val="standardContextual"/>
         </w:rPr>
       </w:pPr>
-      <w:hyperlink w:anchor="_Toc243083388" w:history="1">
+      <w:hyperlink w:anchor="_Toc243083859" w:history="1">
         <w:r>
           <w:rPr>
             <w:rStyle w:val="Hyperlink"/>
@@ -5807,7 +5807,7 @@
             <w:noProof/>
             <w:webHidden/>
           </w:rPr>
-          <w:instrText xml:space="preserve"> PAGEREF _Toc243083388 \h </w:instrText>
+          <w:instrText xml:space="preserve"> PAGEREF _Toc243083859 \h </w:instrText>
         </w:r>
         <w:r>
           <w:rPr>
@@ -5853,7 +5853,7 @@
           <w14:ligatures w14:val="standardContextual"/>
         </w:rPr>
       </w:pPr>
-      <w:hyperlink w:anchor="_Toc243083389" w:history="1">
+      <w:hyperlink w:anchor="_Toc243083860" w:history="1">
         <w:r>
           <w:rPr>
             <w:rStyle w:val="Hyperlink"/>
@@ -5880,7 +5880,7 @@
             <w:noProof/>
             <w:webHidden/>
           </w:rPr>
-          <w:instrText xml:space="preserve"> PAGEREF _Toc243083389 \h </w:instrText>
+          <w:instrText xml:space="preserve"> PAGEREF _Toc243083860 \h </w:instrText>
         </w:r>
         <w:r>
           <w:rPr>
@@ -5926,7 +5926,7 @@
           <w14:ligatures w14:val="standardContextual"/>
         </w:rPr>
       </w:pPr>
-      <w:hyperlink w:anchor="_Toc243083390" w:history="1">
+      <w:hyperlink w:anchor="_Toc243083861" w:history="1">
         <w:r>
           <w:rPr>
             <w:rStyle w:val="Hyperlink"/>
@@ -5953,7 +5953,7 @@
             <w:noProof/>
             <w:webHidden/>
           </w:rPr>
-          <w:instrText xml:space="preserve"> PAGEREF _Toc243083390 \h </w:instrText>
+          <w:instrText xml:space="preserve"> PAGEREF _Toc243083861 \h </w:instrText>
         </w:r>
         <w:r>
           <w:rPr>
@@ -5999,7 +5999,7 @@
           <w14:ligatures w14:val="standardContextual"/>
         </w:rPr>
       </w:pPr>
-      <w:hyperlink w:anchor="_Toc243083391" w:history="1">
+      <w:hyperlink w:anchor="_Toc243083862" w:history="1">
         <w:r>
           <w:rPr>
             <w:rStyle w:val="Hyperlink"/>
@@ -6026,7 +6026,7 @@
             <w:noProof/>
             <w:webHidden/>
           </w:rPr>
-          <w:instrText xml:space="preserve"> PAGEREF _Toc243083391 \h </w:instrText>
+          <w:instrText xml:space="preserve"> PAGEREF _Toc243083862 \h </w:instrText>
         </w:r>
         <w:r>
           <w:rPr>
@@ -6072,7 +6072,7 @@
           <w14:ligatures w14:val="standardContextual"/>
         </w:rPr>
       </w:pPr>
-      <w:hyperlink w:anchor="_Toc243083392" w:history="1">
+      <w:hyperlink w:anchor="_Toc243083863" w:history="1">
         <w:r>
           <w:rPr>
             <w:rStyle w:val="Hyperlink"/>
@@ -6099,7 +6099,7 @@
             <w:noProof/>
             <w:webHidden/>
           </w:rPr>
-          <w:instrText xml:space="preserve"> PAGEREF _Toc243083392 \h </w:instrText>
+          <w:instrText xml:space="preserve"> PAGEREF _Toc243083863 \h </w:instrText>
         </w:r>
         <w:r>
           <w:rPr>
@@ -6145,7 +6145,7 @@
           <w14:ligatures w14:val="standardContextual"/>
         </w:rPr>
       </w:pPr>
-      <w:hyperlink w:anchor="_Toc243083393" w:history="1">
+      <w:hyperlink w:anchor="_Toc243083864" w:history="1">
         <w:r>
           <w:rPr>
             <w:rStyle w:val="Hyperlink"/>
@@ -6172,7 +6172,7 @@
             <w:noProof/>
             <w:webHidden/>
           </w:rPr>
-          <w:instrText xml:space="preserve"> PAGEREF _Toc243083393 \h </w:instrText>
+          <w:instrText xml:space="preserve"> PAGEREF _Toc243083864 \h </w:instrText>
         </w:r>
         <w:r>
           <w:rPr>
@@ -6218,7 +6218,7 @@
           <w14:ligatures w14:val="standardContextual"/>
         </w:rPr>
       </w:pPr>
-      <w:hyperlink w:anchor="_Toc243083394" w:history="1">
+      <w:hyperlink w:anchor="_Toc243083865" w:history="1">
         <w:r>
           <w:rPr>
             <w:rStyle w:val="Hyperlink"/>
@@ -6245,7 +6245,7 @@
             <w:noProof/>
             <w:webHidden/>
           </w:rPr>
-          <w:instrText xml:space="preserve"> PAGEREF _Toc243083394 \h </w:instrText>
+          <w:instrText xml:space="preserve"> PAGEREF _Toc243083865 \h </w:instrText>
         </w:r>
         <w:r>
           <w:rPr>
@@ -6291,7 +6291,7 @@
           <w14:ligatures w14:val="standardContextual"/>
         </w:rPr>
       </w:pPr>
-      <w:hyperlink w:anchor="_Toc243083395" w:history="1">
+      <w:hyperlink w:anchor="_Toc243083866" w:history="1">
         <w:r>
           <w:rPr>
             <w:rStyle w:val="Hyperlink"/>
@@ -6318,7 +6318,7 @@
             <w:noProof/>
             <w:webHidden/>
           </w:rPr>
-          <w:instrText xml:space="preserve"> PAGEREF _Toc243083395 \h </w:instrText>
+          <w:instrText xml:space="preserve"> PAGEREF _Toc243083866 \h </w:instrText>
         </w:r>
         <w:r>
           <w:rPr>
@@ -6364,7 +6364,7 @@
           <w14:ligatures w14:val="standardContextual"/>
         </w:rPr>
       </w:pPr>
-      <w:hyperlink w:anchor="_Toc243083396" w:history="1">
+      <w:hyperlink w:anchor="_Toc243083867" w:history="1">
         <w:r>
           <w:rPr>
             <w:rStyle w:val="Hyperlink"/>
@@ -6391,7 +6391,7 @@
             <w:noProof/>
             <w:webHidden/>
           </w:rPr>
-          <w:instrText xml:space="preserve"> PAGEREF _Toc243083396 \h </w:instrText>
+          <w:instrText xml:space="preserve"> PAGEREF _Toc243083867 \h </w:instrText>
         </w:r>
         <w:r>
           <w:rPr>
@@ -6437,7 +6437,7 @@
           <w14:ligatures w14:val="standardContextual"/>
         </w:rPr>
       </w:pPr>
-      <w:hyperlink w:anchor="_Toc243083397" w:history="1">
+      <w:hyperlink w:anchor="_Toc243083868" w:history="1">
         <w:r>
           <w:rPr>
             <w:rStyle w:val="Hyperlink"/>
@@ -6464,7 +6464,7 @@
             <w:noProof/>
             <w:webHidden/>
           </w:rPr>
-          <w:instrText xml:space="preserve"> PAGEREF _Toc243083397 \h </w:instrText>
+          <w:instrText xml:space="preserve"> PAGEREF _Toc243083868 \h </w:instrText>
         </w:r>
         <w:r>
           <w:rPr>
@@ -6510,7 +6510,7 @@
           <w14:ligatures w14:val="standardContextual"/>
         </w:rPr>
       </w:pPr>
-      <w:hyperlink w:anchor="_Toc243083398" w:history="1">
+      <w:hyperlink w:anchor="_Toc243083869" w:history="1">
         <w:r>
           <w:rPr>
             <w:rStyle w:val="Hyperlink"/>
@@ -6537,7 +6537,7 @@
             <w:noProof/>
             <w:webHidden/>
           </w:rPr>
-          <w:instrText xml:space="preserve"> PAGEREF _Toc243083398 \h </w:instrText>
+          <w:instrText xml:space="preserve"> PAGEREF _Toc243083869 \h </w:instrText>
         </w:r>
         <w:r>
           <w:rPr>
@@ -6583,7 +6583,7 @@
           <w14:ligatures w14:val="standardContextual"/>
         </w:rPr>
       </w:pPr>
-      <w:hyperlink w:anchor="_Toc243083399" w:history="1">
+      <w:hyperlink w:anchor="_Toc243083870" w:history="1">
         <w:r>
           <w:rPr>
             <w:rStyle w:val="Hyperlink"/>
@@ -6610,7 +6610,7 @@
             <w:noProof/>
             <w:webHidden/>
           </w:rPr>
-          <w:instrText xml:space="preserve"> PAGEREF _Toc243083399 \h </w:instrText>
+          <w:instrText xml:space="preserve"> PAGEREF _Toc243083870 \h </w:instrText>
         </w:r>
         <w:r>
           <w:rPr>
@@ -6656,7 +6656,7 @@
           <w14:ligatures w14:val="standardContextual"/>
         </w:rPr>
       </w:pPr>
-      <w:hyperlink w:anchor="_Toc243083400" w:history="1">
+      <w:hyperlink w:anchor="_Toc243083871" w:history="1">
         <w:r>
           <w:rPr>
             <w:rStyle w:val="Hyperlink"/>
@@ -6683,7 +6683,7 @@
             <w:noProof/>
             <w:webHidden/>
           </w:rPr>
-          <w:instrText xml:space="preserve"> PAGEREF _Toc243083400 \h </w:instrText>
+          <w:instrText xml:space="preserve"> PAGEREF _Toc243083871 \h </w:instrText>
         </w:r>
         <w:r>
           <w:rPr>
@@ -6729,7 +6729,7 @@
           <w14:ligatures w14:val="standardContextual"/>
         </w:rPr>
       </w:pPr>
-      <w:hyperlink w:anchor="_Toc243083401" w:history="1">
+      <w:hyperlink w:anchor="_Toc243083872" w:history="1">
         <w:r>
           <w:rPr>
             <w:rStyle w:val="Hyperlink"/>
@@ -6779,7 +6779,7 @@
             <w:noProof/>
             <w:webHidden/>
           </w:rPr>
-          <w:instrText xml:space="preserve"> PAGEREF _Toc243083401 \h </w:instrText>
+          <w:instrText xml:space="preserve"> PAGEREF _Toc243083872 \h </w:instrText>
         </w:r>
         <w:r>
           <w:rPr>
@@ -6831,7 +6831,7 @@
         <w:pStyle w:val="Ttulo1"/>
         <w:jc w:val="center"/>
       </w:pPr>
-      <w:bookmarkStart w:id="0" w:name="_Toc243083353"/>
+      <w:bookmarkStart w:id="0" w:name="_Toc243083824"/>
       <w:r>
         <w:lastRenderedPageBreak/>
         <w:t>INTRODUÇÃO</w:t>
@@ -6987,7 +6987,7 @@
       <w:pPr>
         <w:pStyle w:val="Ttulo1"/>
       </w:pPr>
-      <w:bookmarkStart w:id="1" w:name="_Toc243083354"/>
+      <w:bookmarkStart w:id="1" w:name="_Toc243083825"/>
       <w:r>
         <w:lastRenderedPageBreak/>
         <w:t>1 REFERENCIAL TEÓRICO</w:t>
@@ -6998,7 +6998,7 @@
       <w:pPr>
         <w:pStyle w:val="Ttulo2"/>
       </w:pPr>
-      <w:bookmarkStart w:id="2" w:name="_Toc243083355"/>
+      <w:bookmarkStart w:id="2" w:name="_Toc243083826"/>
       <w:r>
         <w:t>1.1 FORMAÇÃO DA SATISFAÇÃO E TEORIA DOS TRÊS FATORES</w:t>
       </w:r>
@@ -7033,7 +7033,7 @@
       <w:pPr>
         <w:pStyle w:val="Ttulo2"/>
       </w:pPr>
-      <w:bookmarkStart w:id="3" w:name="_Toc243083356"/>
+      <w:bookmarkStart w:id="3" w:name="_Toc243083827"/>
       <w:r>
         <w:t>1.2 AVALIAÇÕES ONLINE: COMPRESSÃO DAS NOTAS E VIESES DE RELATO</w:t>
       </w:r>
@@ -7069,7 +7069,7 @@
       <w:pPr>
         <w:pStyle w:val="Ttulo2"/>
       </w:pPr>
-      <w:bookmarkStart w:id="4" w:name="_Toc243083357"/>
+      <w:bookmarkStart w:id="4" w:name="_Toc243083828"/>
       <w:r>
         <w:t>1.3 AS AVALIAÇÕES DO AIRBNB E O SEU CONTEÚDO</w:t>
       </w:r>
@@ -7114,7 +7114,7 @@
       <w:pPr>
         <w:pStyle w:val="Ttulo2"/>
       </w:pPr>
-      <w:bookmarkStart w:id="5" w:name="_Toc243083358"/>
+      <w:bookmarkStart w:id="5" w:name="_Toc243083829"/>
       <w:r>
         <w:t>1.4 DETERMINANTES DE PREÇO E DE REPUTAÇÃO</w:t>
       </w:r>
@@ -7138,7 +7138,7 @@
       <w:pPr>
         <w:pStyle w:val="Ttulo2"/>
       </w:pPr>
-      <w:bookmarkStart w:id="6" w:name="_Toc243083359"/>
+      <w:bookmarkStart w:id="6" w:name="_Toc243083830"/>
       <w:r>
         <w:t>1.5 ANÁLISE DE SENTIMENTO POR ASPECTO E MODELOS DE LINGUAGEM</w:t>
       </w:r>
@@ -7178,7 +7178,7 @@
       <w:pPr>
         <w:pStyle w:val="Ttulo2"/>
       </w:pPr>
-      <w:bookmarkStart w:id="7" w:name="_Toc243083360"/>
+      <w:bookmarkStart w:id="7" w:name="_Toc243083831"/>
       <w:r>
         <w:t>1.6 MODELAGEM DE TÓPICOS</w:t>
       </w:r>
@@ -7217,7 +7217,7 @@
       <w:pPr>
         <w:pStyle w:val="Ttulo2"/>
       </w:pPr>
-      <w:bookmarkStart w:id="8" w:name="_Toc243083361"/>
+      <w:bookmarkStart w:id="8" w:name="_Toc243083832"/>
       <w:r>
         <w:t>1.7 VALIDAÇÃO, CONCORDÂNCIA E IMPORTÂNCIA RELATIVA</w:t>
       </w:r>
@@ -7269,7 +7269,7 @@
       <w:pPr>
         <w:pStyle w:val="Ttulo2"/>
       </w:pPr>
-      <w:bookmarkStart w:id="9" w:name="_Toc243083362"/>
+      <w:bookmarkStart w:id="9" w:name="_Toc243083833"/>
       <w:r>
         <w:t>1.8 BUSCA BIBLIOGRÁFICA</w:t>
       </w:r>
@@ -7293,7 +7293,7 @@
       <w:pPr>
         <w:pStyle w:val="Ttulo2"/>
       </w:pPr>
-      <w:bookmarkStart w:id="10" w:name="_Toc243083363"/>
+      <w:bookmarkStart w:id="10" w:name="_Toc243083834"/>
       <w:r>
         <w:t>1.9 LACUNA</w:t>
       </w:r>
@@ -7322,7 +7322,7 @@
       <w:pPr>
         <w:pStyle w:val="Ttulo1"/>
       </w:pPr>
-      <w:bookmarkStart w:id="11" w:name="_Toc243083364"/>
+      <w:bookmarkStart w:id="11" w:name="_Toc243083835"/>
       <w:r>
         <w:lastRenderedPageBreak/>
         <w:t>2 DADOS E MÉTODO</w:t>
@@ -7343,7 +7343,7 @@
         <w:keepNext/>
         <w:spacing w:before="120" w:after="80"/>
       </w:pPr>
-      <w:bookmarkStart w:id="12" w:name="_Toc243083402"/>
+      <w:bookmarkStart w:id="12" w:name="_Toc243083873"/>
       <w:r>
         <w:rPr>
           <w:b w:val="0"/>
@@ -7414,7 +7414,7 @@
           <w:noProof/>
         </w:rPr>
         <w:drawing>
-          <wp:inline distT="0" distB="0" distL="0" distR="0" wp14:anchorId="67C80E38" wp14:editId="00D6620C">
+          <wp:inline distT="0" distB="0" distL="0" distR="0" wp14:anchorId="0BB03658" wp14:editId="02217FCD">
             <wp:extent cx="5299200" cy="3821405"/>
             <wp:effectExtent l="0" t="0" r="0" b="0"/>
             <wp:docPr id="1" name="Picture 1"/>
@@ -7465,7 +7465,7 @@
       <w:pPr>
         <w:pStyle w:val="Ttulo2"/>
       </w:pPr>
-      <w:bookmarkStart w:id="13" w:name="_Toc243083365"/>
+      <w:bookmarkStart w:id="13" w:name="_Toc243083836"/>
       <w:r>
         <w:t>2.1 BASE E RECORTE</w:t>
       </w:r>
@@ -7515,7 +7515,7 @@
       <w:pPr>
         <w:pStyle w:val="Ttulo2"/>
       </w:pPr>
-      <w:bookmarkStart w:id="14" w:name="_Toc243083366"/>
+      <w:bookmarkStart w:id="14" w:name="_Toc243083837"/>
       <w:r>
         <w:t>2.2 ASPECTOS ÉTICOS, AMBIENTE DE EXECUÇÃO E DISPONIBILIDADE</w:t>
       </w:r>
@@ -7634,7 +7634,7 @@
       <w:pPr>
         <w:pStyle w:val="Ttulo2"/>
       </w:pPr>
-      <w:bookmarkStart w:id="15" w:name="_Toc243083367"/>
+      <w:bookmarkStart w:id="15" w:name="_Toc243083838"/>
       <w:r>
         <w:t>2.3 O QUE A BASE PERMITE MEDIR</w:t>
       </w:r>
@@ -7746,7 +7746,7 @@
       <w:pPr>
         <w:pStyle w:val="Ttulo2"/>
       </w:pPr>
-      <w:bookmarkStart w:id="16" w:name="_Toc243083368"/>
+      <w:bookmarkStart w:id="16" w:name="_Toc243083839"/>
       <w:r>
         <w:t>2.4 MEDIÇÃO DO SENTIMENTO</w:t>
       </w:r>
@@ -7920,7 +7920,7 @@
       <w:pPr>
         <w:pStyle w:val="Ttulo2"/>
       </w:pPr>
-      <w:bookmarkStart w:id="17" w:name="_Toc243083369"/>
+      <w:bookmarkStart w:id="17" w:name="_Toc243083840"/>
       <w:r>
         <w:t>2.5 TÓPICOS E ASPECTOS</w:t>
       </w:r>
@@ -8064,7 +8064,7 @@
       <w:pPr>
         <w:pStyle w:val="Ttulo2"/>
       </w:pPr>
-      <w:bookmarkStart w:id="18" w:name="_Toc243083370"/>
+      <w:bookmarkStart w:id="18" w:name="_Toc243083841"/>
       <w:r>
         <w:t>2.6 PERFIL POR ANÚNCIO</w:t>
       </w:r>
@@ -8084,7 +8084,7 @@
         <w:keepNext/>
         <w:spacing w:before="120" w:after="80"/>
       </w:pPr>
-      <w:bookmarkStart w:id="19" w:name="_Toc243083413"/>
+      <w:bookmarkStart w:id="19" w:name="_Toc243083884"/>
       <w:r>
         <w:rPr>
           <w:b w:val="0"/>
@@ -8918,7 +8918,7 @@
       <w:pPr>
         <w:pStyle w:val="Ttulo2"/>
       </w:pPr>
-      <w:bookmarkStart w:id="20" w:name="_Toc243083371"/>
+      <w:bookmarkStart w:id="20" w:name="_Toc243083842"/>
       <w:r>
         <w:t>2.7 DESENHO ANALÍTICO</w:t>
       </w:r>
@@ -9020,7 +9020,7 @@
       <w:pPr>
         <w:pStyle w:val="Ttulo1"/>
       </w:pPr>
-      <w:bookmarkStart w:id="21" w:name="_Toc243083372"/>
+      <w:bookmarkStart w:id="21" w:name="_Toc243083843"/>
       <w:r>
         <w:lastRenderedPageBreak/>
         <w:t>3 VALIDAÇÃO DA MEDIÇÃO</w:t>
@@ -9042,7 +9042,7 @@
       <w:pPr>
         <w:pStyle w:val="Ttulo2"/>
       </w:pPr>
-      <w:bookmarkStart w:id="22" w:name="_Toc243083373"/>
+      <w:bookmarkStart w:id="22" w:name="_Toc243083844"/>
       <w:r>
         <w:t>3.1 EVIDÊNCIA DIRETA: FRASES ROTULADAS</w:t>
       </w:r>
@@ -9073,7 +9073,7 @@
         <w:keepNext/>
         <w:spacing w:before="120" w:after="80"/>
       </w:pPr>
-      <w:bookmarkStart w:id="23" w:name="_Toc243083414"/>
+      <w:bookmarkStart w:id="23" w:name="_Toc243083885"/>
       <w:r>
         <w:rPr>
           <w:b w:val="0"/>
@@ -9767,7 +9767,7 @@
         <w:keepNext/>
         <w:spacing w:before="120" w:after="80"/>
       </w:pPr>
-      <w:bookmarkStart w:id="24" w:name="_Toc243083415"/>
+      <w:bookmarkStart w:id="24" w:name="_Toc243083886"/>
       <w:r>
         <w:rPr>
           <w:b w:val="0"/>
@@ -10375,7 +10375,7 @@
       <w:pPr>
         <w:pStyle w:val="Ttulo2"/>
       </w:pPr>
-      <w:bookmarkStart w:id="25" w:name="_Toc243083374"/>
+      <w:bookmarkStart w:id="25" w:name="_Toc243083845"/>
       <w:r>
         <w:t>3.2 CONCORDÂNCIA ENTRE OS DOIS MODELOS</w:t>
       </w:r>
@@ -10397,7 +10397,7 @@
       <w:pPr>
         <w:pStyle w:val="Ttulo2"/>
       </w:pPr>
-      <w:bookmarkStart w:id="26" w:name="_Toc243083375"/>
+      <w:bookmarkStart w:id="26" w:name="_Toc243083846"/>
       <w:r>
         <w:t>3.3 REGRA DE ESCOLHA FIXADA DE ANTEMÃO E MODELO PRINCIPAL</w:t>
       </w:r>
@@ -10418,7 +10418,7 @@
       <w:pPr>
         <w:pStyle w:val="Ttulo2"/>
       </w:pPr>
-      <w:bookmarkStart w:id="27" w:name="_Toc243083376"/>
+      <w:bookmarkStart w:id="27" w:name="_Toc243083847"/>
       <w:r>
         <w:t>3.4 VALIDADE DE CONSTRUTO: CONCORDÂNCIA COM AS SUBNOTAS OFICIAIS</w:t>
       </w:r>
@@ -10438,7 +10438,7 @@
         <w:keepNext/>
         <w:spacing w:before="120" w:after="80"/>
       </w:pPr>
-      <w:bookmarkStart w:id="28" w:name="_Toc243083416"/>
+      <w:bookmarkStart w:id="28" w:name="_Toc243083887"/>
       <w:r>
         <w:rPr>
           <w:b w:val="0"/>
@@ -11659,7 +11659,7 @@
       <w:pPr>
         <w:pStyle w:val="Ttulo2"/>
       </w:pPr>
-      <w:bookmarkStart w:id="29" w:name="_Toc243083377"/>
+      <w:bookmarkStart w:id="29" w:name="_Toc243083848"/>
       <w:r>
         <w:t>3.5 CHECAGEM COM UM SEGUNDO MÉTODO DE TÓPICOS E COM UM SEGUNDO ANOTADOR</w:t>
       </w:r>
@@ -11682,7 +11682,7 @@
         <w:keepNext/>
         <w:spacing w:before="120" w:after="80"/>
       </w:pPr>
-      <w:bookmarkStart w:id="30" w:name="_Toc243083417"/>
+      <w:bookmarkStart w:id="30" w:name="_Toc243083888"/>
       <w:r>
         <w:rPr>
           <w:b w:val="0"/>
@@ -12507,7 +12507,7 @@
       <w:pPr>
         <w:pStyle w:val="Ttulo2"/>
       </w:pPr>
-      <w:bookmarkStart w:id="31" w:name="_Toc243083378"/>
+      <w:bookmarkStart w:id="31" w:name="_Toc243083849"/>
       <w:r>
         <w:t>3.6 CLASSIFICAÇÃO DOS ASPECTOS</w:t>
       </w:r>
@@ -12558,7 +12558,7 @@
         <w:keepNext/>
         <w:spacing w:before="120" w:after="80"/>
       </w:pPr>
-      <w:bookmarkStart w:id="32" w:name="_Toc243083418"/>
+      <w:bookmarkStart w:id="32" w:name="_Toc243083889"/>
       <w:r>
         <w:rPr>
           <w:b w:val="0"/>
@@ -14203,7 +14203,7 @@
       <w:pPr>
         <w:pStyle w:val="Ttulo1"/>
       </w:pPr>
-      <w:bookmarkStart w:id="33" w:name="_Toc243083379"/>
+      <w:bookmarkStart w:id="33" w:name="_Toc243083850"/>
       <w:r>
         <w:lastRenderedPageBreak/>
         <w:t>4 O QUE O TEXTO REVELA SOBRE A NOTA</w:t>
@@ -14222,7 +14222,7 @@
       <w:pPr>
         <w:pStyle w:val="Ttulo2"/>
       </w:pPr>
-      <w:bookmarkStart w:id="34" w:name="_Toc243083380"/>
+      <w:bookmarkStart w:id="34" w:name="_Toc243083851"/>
       <w:r>
         <w:t>4.1 IMPORTÂNCIA DOS ASPECTOS</w:t>
       </w:r>
@@ -14272,7 +14272,7 @@
         <w:keepNext/>
         <w:spacing w:before="120" w:after="80"/>
       </w:pPr>
-      <w:bookmarkStart w:id="35" w:name="_Toc243083419"/>
+      <w:bookmarkStart w:id="35" w:name="_Toc243083890"/>
       <w:r>
         <w:rPr>
           <w:b w:val="0"/>
@@ -15265,7 +15265,7 @@
         <w:keepNext/>
         <w:spacing w:before="120" w:after="80"/>
       </w:pPr>
-      <w:bookmarkStart w:id="36" w:name="_Toc243083403"/>
+      <w:bookmarkStart w:id="36" w:name="_Toc243083874"/>
       <w:r>
         <w:rPr>
           <w:b w:val="0"/>
@@ -15363,7 +15363,7 @@
           <w:noProof/>
         </w:rPr>
         <w:drawing>
-          <wp:inline distT="0" distB="0" distL="0" distR="0" wp14:anchorId="3B7C28D2" wp14:editId="2536DE8D">
+          <wp:inline distT="0" distB="0" distL="0" distR="0" wp14:anchorId="5A3086EE" wp14:editId="12B53FCB">
             <wp:extent cx="5472000" cy="3323018"/>
             <wp:effectExtent l="0" t="0" r="0" b="0"/>
             <wp:docPr id="2" name="Picture 2"/>
@@ -15450,7 +15450,7 @@
         <w:keepNext/>
         <w:spacing w:before="120" w:after="80"/>
       </w:pPr>
-      <w:bookmarkStart w:id="37" w:name="_Toc243083420"/>
+      <w:bookmarkStart w:id="37" w:name="_Toc243083891"/>
       <w:r>
         <w:rPr>
           <w:b w:val="0"/>
@@ -16550,7 +16550,7 @@
         <w:keepNext/>
         <w:spacing w:before="120" w:after="80"/>
       </w:pPr>
-      <w:bookmarkStart w:id="38" w:name="_Toc243083421"/>
+      <w:bookmarkStart w:id="38" w:name="_Toc243083892"/>
       <w:r>
         <w:rPr>
           <w:b w:val="0"/>
@@ -17890,7 +17890,7 @@
       <w:pPr>
         <w:pStyle w:val="Ttulo2"/>
       </w:pPr>
-      <w:bookmarkStart w:id="39" w:name="_Toc243083381"/>
+      <w:bookmarkStart w:id="39" w:name="_Toc243083852"/>
       <w:r>
         <w:lastRenderedPageBreak/>
         <w:t>4.2 QUEIXAS E ELOGIOS POR TÓPICO</w:t>
@@ -17923,7 +17923,7 @@
         <w:keepNext/>
         <w:spacing w:before="120" w:after="80"/>
       </w:pPr>
-      <w:bookmarkStart w:id="40" w:name="_Toc243083422"/>
+      <w:bookmarkStart w:id="40" w:name="_Toc243083893"/>
       <w:r>
         <w:rPr>
           <w:b w:val="0"/>
@@ -19153,7 +19153,7 @@
         <w:keepNext/>
         <w:spacing w:before="120" w:after="80"/>
       </w:pPr>
-      <w:bookmarkStart w:id="41" w:name="_Toc243083423"/>
+      <w:bookmarkStart w:id="41" w:name="_Toc243083894"/>
       <w:r>
         <w:rPr>
           <w:b w:val="0"/>
@@ -19878,7 +19878,7 @@
         <w:keepNext/>
         <w:spacing w:before="120" w:after="80"/>
       </w:pPr>
-      <w:bookmarkStart w:id="42" w:name="_Toc243083404"/>
+      <w:bookmarkStart w:id="42" w:name="_Toc243083875"/>
       <w:r>
         <w:rPr>
           <w:b w:val="0"/>
@@ -19949,7 +19949,7 @@
           <w:noProof/>
         </w:rPr>
         <w:drawing>
-          <wp:inline distT="0" distB="0" distL="0" distR="0" wp14:anchorId="4504997E" wp14:editId="5C81618B">
+          <wp:inline distT="0" distB="0" distL="0" distR="0" wp14:anchorId="4E5D055E" wp14:editId="61A3D0F2">
             <wp:extent cx="5472000" cy="5107200"/>
             <wp:effectExtent l="0" t="0" r="0" b="0"/>
             <wp:docPr id="3" name="Picture 3"/>
@@ -20051,7 +20051,7 @@
       <w:pPr>
         <w:pStyle w:val="Ttulo2"/>
       </w:pPr>
-      <w:bookmarkStart w:id="43" w:name="_Toc243083382"/>
+      <w:bookmarkStart w:id="43" w:name="_Toc243083853"/>
       <w:r>
         <w:t>4.3 CUIDADOS DE INTERPRETAÇÃO</w:t>
       </w:r>
@@ -20069,7 +20069,7 @@
       <w:pPr>
         <w:pStyle w:val="Ttulo1"/>
       </w:pPr>
-      <w:bookmarkStart w:id="44" w:name="_Toc243083383"/>
+      <w:bookmarkStart w:id="44" w:name="_Toc243083854"/>
       <w:r>
         <w:lastRenderedPageBreak/>
         <w:t>5 APLICAÇÃO: DIAGNÓSTICO POR ANÚNCIO</w:t>
@@ -20123,7 +20123,7 @@
         <w:keepNext/>
         <w:spacing w:before="120" w:after="80"/>
       </w:pPr>
-      <w:bookmarkStart w:id="45" w:name="_Toc243083405"/>
+      <w:bookmarkStart w:id="45" w:name="_Toc243083876"/>
       <w:r>
         <w:rPr>
           <w:b w:val="0"/>
@@ -20195,7 +20195,7 @@
           <w:noProof/>
         </w:rPr>
         <w:drawing>
-          <wp:inline distT="0" distB="0" distL="0" distR="0" wp14:anchorId="6A880B7A" wp14:editId="002D3C70">
+          <wp:inline distT="0" distB="0" distL="0" distR="0" wp14:anchorId="6493C009" wp14:editId="133AF73C">
             <wp:extent cx="5760000" cy="6926400"/>
             <wp:effectExtent l="0" t="0" r="0" b="0"/>
             <wp:docPr id="4" name="Picture 4"/>
@@ -20246,7 +20246,7 @@
       <w:pPr>
         <w:pStyle w:val="Ttulo2"/>
       </w:pPr>
-      <w:bookmarkStart w:id="46" w:name="_Toc243083384"/>
+      <w:bookmarkStart w:id="46" w:name="_Toc243083855"/>
       <w:r>
         <w:t>5.1 PRODUTO TÉCNICO</w:t>
       </w:r>
@@ -20437,17 +20437,23 @@
         <w:t>Categoria e critérios da CAPES.</w:t>
       </w:r>
       <w:r>
-        <w:t xml:space="preserve"> Na taxonomia geral de produtos técnicos e tecnológicos da CAPES, a ferramenta se enquadra como software ou aplicativo (programa de computador). Esse enquadramento é compatível com a categoria “Software/Aplicativo (Programa de computador)”, prevista na Ficha de Avaliação da Área Interdisciplinar (Área 45) para o quadriênio 2025–2028. O produto consiste em um programa que utiliza as tabelas produzidas pelo estudo para gerar relatórios de diagnóstico por anúncio, destinados ao apoio à gestão de hospedagens. A</w:t>
-      </w:r>
-      <w:r>
-        <w:t xml:space="preserve"> aderência, critério obrigatório, decorre do vínculo com a área de concentração em Sistemas de Engenharia e com a linha de pesquisa Modelagem Computacional. A demanda é espontânea, pois o produto nasceu do problema descrito na </w:t>
+        <w:t xml:space="preserve"> Na taxonomia geral de produtos técnicos e tecnológicos da CAPES </w:t>
+      </w:r>
+      <w:r>
+        <w:t>(CAPES, 2019)</w:t>
+      </w:r>
+      <w:r>
+        <w:t>, a ferramenta se enquadra como software ou aplicativo (programa de computador). Esse enquadramento corresponde à categoria “Software/Aplicativo (Programa de computador)”, que o relatório do grupo de trabalho define como um conjunto de instruções a serem usadas por um computador para obter um determinado resultado, e que consta na Ficha de Avaliação da Área Interdisciplinar (Área 45) para o quadriênio 2025–2028. O produto consiste em um programa que utiliza as tabelas produzidas pelo estudo para gerar relat</w:t>
+      </w:r>
+      <w:r>
+        <w:t xml:space="preserve">órios de diagnóstico por anúncio, destinados ao apoio à gestão de hospedagens. A aderência, critério obrigatório, decorre do vínculo com a área de </w:t>
       </w:r>
       <w:r>
         <w:lastRenderedPageBreak/>
-        <w:t>Introdução, sem solicitação externa. A replicabilidade é possível, porque o código é aberto e os dados de origem são públicos. A inovação resulta da combinação de métodos já estabelecidos (classificadores de sentimento, modelagem de tópicos e decomposição da importância) em um diagnós</w:t>
-      </w:r>
-      <w:r>
-        <w:t>tico por anúncio. O impacto é potencial.</w:t>
+        <w:t xml:space="preserve">concentração em Sistemas de Engenharia e com a linha de pesquisa Modelagem Computacional. A demanda é espontânea, pois o produto nasceu do problema descrito na Introdução, sem solicitação externa. A replicabilidade é possível, porque o código é aberto e os dados de origem são públicos. A inovação resulta da combinação de métodos já estabelecidos (classificadores </w:t>
+      </w:r>
+      <w:r>
+        <w:t>de sentimento, modelagem de tópicos e decomposição da importância) em um diagnóstico por anúncio. O impacto é potencial.</w:t>
       </w:r>
     </w:p>
     <w:p>
@@ -20468,7 +20474,7 @@
       <w:pPr>
         <w:pStyle w:val="Ttulo1"/>
       </w:pPr>
-      <w:bookmarkStart w:id="47" w:name="_Toc243083385"/>
+      <w:bookmarkStart w:id="47" w:name="_Toc243083856"/>
       <w:r>
         <w:lastRenderedPageBreak/>
         <w:t>6 UM ÍNDICE ÚNICO ACRESCENTA ALGO?</w:t>
@@ -20487,7 +20493,7 @@
       <w:pPr>
         <w:pStyle w:val="Ttulo2"/>
       </w:pPr>
-      <w:bookmarkStart w:id="48" w:name="_Toc243083386"/>
+      <w:bookmarkStart w:id="48" w:name="_Toc243083857"/>
       <w:r>
         <w:t>6.1 CONSTRUÇÃO DO ÍNDICE</w:t>
       </w:r>
@@ -20543,7 +20549,7 @@
       <w:pPr>
         <w:pStyle w:val="Ttulo2"/>
       </w:pPr>
-      <w:bookmarkStart w:id="49" w:name="_Toc243083387"/>
+      <w:bookmarkStart w:id="49" w:name="_Toc243083858"/>
       <w:r>
         <w:t>6.2 COMPRESSÃO DA NOTA OFICIAL E REORDENAMENTO</w:t>
       </w:r>
@@ -20563,7 +20569,7 @@
         <w:keepNext/>
         <w:spacing w:before="120" w:after="80"/>
       </w:pPr>
-      <w:bookmarkStart w:id="50" w:name="_Toc243083406"/>
+      <w:bookmarkStart w:id="50" w:name="_Toc243083877"/>
       <w:r>
         <w:rPr>
           <w:b w:val="0"/>
@@ -20643,7 +20649,7 @@
           <w:noProof/>
         </w:rPr>
         <w:drawing>
-          <wp:inline distT="0" distB="0" distL="0" distR="0" wp14:anchorId="6274447D" wp14:editId="21746B45">
+          <wp:inline distT="0" distB="0" distL="0" distR="0" wp14:anchorId="582B63BB" wp14:editId="139DD9D9">
             <wp:extent cx="5472000" cy="2485408"/>
             <wp:effectExtent l="0" t="0" r="0" b="0"/>
             <wp:docPr id="5" name="Picture 5"/>
@@ -20707,7 +20713,7 @@
         <w:keepNext/>
         <w:spacing w:before="120" w:after="80"/>
       </w:pPr>
-      <w:bookmarkStart w:id="51" w:name="_Toc243083424"/>
+      <w:bookmarkStart w:id="51" w:name="_Toc243083895"/>
       <w:r>
         <w:rPr>
           <w:b w:val="0"/>
@@ -21232,7 +21238,7 @@
       <w:pPr>
         <w:pStyle w:val="Ttulo2"/>
       </w:pPr>
-      <w:bookmarkStart w:id="52" w:name="_Toc243083388"/>
+      <w:bookmarkStart w:id="52" w:name="_Toc243083859"/>
       <w:r>
         <w:t>6.3 PODER EXPLICATIVO SOBRE OS ÍNDICES DE VOLUME</w:t>
       </w:r>
@@ -21286,7 +21292,7 @@
         <w:keepNext/>
         <w:spacing w:before="120" w:after="80"/>
       </w:pPr>
-      <w:bookmarkStart w:id="53" w:name="_Toc243083425"/>
+      <w:bookmarkStart w:id="53" w:name="_Toc243083896"/>
       <w:r>
         <w:rPr>
           <w:b w:val="0"/>
@@ -22288,7 +22294,7 @@
       <w:pPr>
         <w:pStyle w:val="Ttulo2"/>
       </w:pPr>
-      <w:bookmarkStart w:id="54" w:name="_Toc243083389"/>
+      <w:bookmarkStart w:id="54" w:name="_Toc243083860"/>
       <w:r>
         <w:lastRenderedPageBreak/>
         <w:t>6.4 MONOTONICIDADE E REORDENAMENTO</w:t>
@@ -22309,7 +22315,7 @@
         <w:keepNext/>
         <w:spacing w:before="120" w:after="80"/>
       </w:pPr>
-      <w:bookmarkStart w:id="55" w:name="_Toc243083426"/>
+      <w:bookmarkStart w:id="55" w:name="_Toc243083897"/>
       <w:r>
         <w:rPr>
           <w:b w:val="0"/>
@@ -23167,7 +23173,7 @@
       <w:pPr>
         <w:pStyle w:val="Ttulo2"/>
       </w:pPr>
-      <w:bookmarkStart w:id="56" w:name="_Toc243083390"/>
+      <w:bookmarkStart w:id="56" w:name="_Toc243083861"/>
       <w:r>
         <w:t>6.5 SENSIBILIDADE</w:t>
       </w:r>
@@ -23211,7 +23217,7 @@
       <w:pPr>
         <w:pStyle w:val="Ttulo2"/>
       </w:pPr>
-      <w:bookmarkStart w:id="57" w:name="_Toc243083391"/>
+      <w:bookmarkStart w:id="57" w:name="_Toc243083862"/>
       <w:r>
         <w:lastRenderedPageBreak/>
         <w:t>6.6 COMO LER O RESULTADO</w:t>
@@ -23233,7 +23239,7 @@
       <w:pPr>
         <w:pStyle w:val="Ttulo1"/>
       </w:pPr>
-      <w:bookmarkStart w:id="58" w:name="_Toc243083392"/>
+      <w:bookmarkStart w:id="58" w:name="_Toc243083863"/>
       <w:r>
         <w:lastRenderedPageBreak/>
         <w:t>7 DISCUSSÃO E LIMITAÇÕES</w:t>
@@ -23244,7 +23250,7 @@
       <w:pPr>
         <w:pStyle w:val="Ttulo2"/>
       </w:pPr>
-      <w:bookmarkStart w:id="59" w:name="_Toc243083393"/>
+      <w:bookmarkStart w:id="59" w:name="_Toc243083864"/>
       <w:r>
         <w:t>7.1 OS RESULTADOS À LUZ DA LITERATURA</w:t>
       </w:r>
@@ -23314,7 +23320,7 @@
       <w:pPr>
         <w:pStyle w:val="Ttulo2"/>
       </w:pPr>
-      <w:bookmarkStart w:id="60" w:name="_Toc243083394"/>
+      <w:bookmarkStart w:id="60" w:name="_Toc243083865"/>
       <w:r>
         <w:t>7.2 IMPLICAÇÕES PARA ANFITRIÕES E EMPRESAS GESTORAS</w:t>
       </w:r>
@@ -23335,7 +23341,7 @@
       <w:pPr>
         <w:pStyle w:val="Ttulo2"/>
       </w:pPr>
-      <w:bookmarkStart w:id="61" w:name="_Toc243083395"/>
+      <w:bookmarkStart w:id="61" w:name="_Toc243083866"/>
       <w:r>
         <w:t>7.3 LIMITAÇÕES</w:t>
       </w:r>
@@ -23420,7 +23426,7 @@
         <w:pStyle w:val="Ttulo1"/>
         <w:jc w:val="center"/>
       </w:pPr>
-      <w:bookmarkStart w:id="62" w:name="_Toc243083396"/>
+      <w:bookmarkStart w:id="62" w:name="_Toc243083867"/>
       <w:r>
         <w:lastRenderedPageBreak/>
         <w:t>CONCLUSÕES</w:t>
@@ -23525,7 +23531,7 @@
         <w:pStyle w:val="Ttulo1"/>
         <w:jc w:val="center"/>
       </w:pPr>
-      <w:bookmarkStart w:id="63" w:name="_Toc243083397"/>
+      <w:bookmarkStart w:id="63" w:name="_Toc243083868"/>
       <w:r>
         <w:lastRenderedPageBreak/>
         <w:t>REFERÊNCIAS</w:t>
@@ -23663,6 +23669,23 @@
         <w:pStyle w:val="Referncia"/>
       </w:pPr>
       <w:r>
+        <w:t xml:space="preserve">CAPES. </w:t>
+      </w:r>
+      <w:r>
+        <w:rPr>
+          <w:b/>
+        </w:rPr>
+        <w:t>Produção técnica: relatório de grupo de trabalho</w:t>
+      </w:r>
+      <w:r>
+        <w:t>. Brasília: CAPES, 2019.</w:t>
+      </w:r>
+    </w:p>
+    <w:p>
+      <w:pPr>
+        <w:pStyle w:val="Referncia"/>
+      </w:pPr>
+      <w:r>
         <w:t xml:space="preserve">CARDIFF NLP. </w:t>
       </w:r>
       <w:r>
@@ -23706,10 +23729,7 @@
         <w:pStyle w:val="Referncia"/>
       </w:pPr>
       <w:r>
-        <w:t>CHENG, Mingming; JIN, Xin.</w:t>
-      </w:r>
-      <w:r>
-        <w:t xml:space="preserve"> What do Airbnb users care about? An analysis of online review comments. </w:t>
+        <w:t xml:space="preserve">CHENG, Mingming; JIN, Xin. What do Airbnb users care about? An analysis of online review comments. </w:t>
       </w:r>
       <w:r>
         <w:rPr>
@@ -23925,7 +23945,10 @@
         <w:pStyle w:val="Referncia"/>
       </w:pPr>
       <w:r>
-        <w:t xml:space="preserve">EFRON, Bradley; MORRIS, Carl. Data Analysis Using Stein's Estimator and its Generalizations. </w:t>
+        <w:t>EFRON, Bradley; MORRIS, Carl.</w:t>
+      </w:r>
+      <w:r>
+        <w:t xml:space="preserve"> Data Analysis Using Stein's Estimator and its Generalizations. </w:t>
       </w:r>
       <w:r>
         <w:rPr>
@@ -23976,10 +23999,7 @@
         <w:pStyle w:val="Referncia"/>
       </w:pPr>
       <w:r>
-        <w:t>FRADKIN, Andrey; GREWAL, Elena; HOLTZ, David.</w:t>
-      </w:r>
-      <w:r>
-        <w:t xml:space="preserve"> Reciprocity and Unveiling in Two-Sided Reputation Systems: Evidence from an Experiment on Airbnb. </w:t>
+        <w:t xml:space="preserve">FRADKIN, Andrey; GREWAL, Elena; HOLTZ, David. Reciprocity and Unveiling in Two-Sided Reputation Systems: Evidence from an Experiment on Airbnb. </w:t>
       </w:r>
       <w:r>
         <w:rPr>
@@ -24022,10 +24042,10 @@
         <w:pStyle w:val="Referncia"/>
       </w:pPr>
       <w:r>
-        <w:t>FÜLLER, Johann; MATZLER, Kurt.</w:t>
-      </w:r>
-      <w:r>
-        <w:t xml:space="preserve"> Customer delight and market segmentation: an application of the three-factor theory of customer satisfaction on life style groups. </w:t>
+        <w:t>FÜLLER, Johann; MATZLER, Kurt</w:t>
+      </w:r>
+      <w:r>
+        <w:t xml:space="preserve">. Customer delight and market segmentation: an application of the three-factor theory of customer satisfaction on life style groups. </w:t>
       </w:r>
       <w:r>
         <w:rPr>
@@ -24843,7 +24863,7 @@
         <w:pStyle w:val="Ttulo1"/>
         <w:jc w:val="center"/>
       </w:pPr>
-      <w:bookmarkStart w:id="64" w:name="_Toc243083398"/>
+      <w:bookmarkStart w:id="64" w:name="_Toc243083869"/>
       <w:r>
         <w:lastRenderedPageBreak/>
         <w:t>APÊNDICE A – REGISTRO DATADO DA REGRA DE ESCOLHA DO MODELO PRINCIPAL</w:t>
@@ -24908,7 +24928,7 @@
         <w:keepNext/>
         <w:spacing w:before="120" w:after="80"/>
       </w:pPr>
-      <w:bookmarkStart w:id="65" w:name="_Toc243083427"/>
+      <w:bookmarkStart w:id="65" w:name="_Toc243083898"/>
       <w:r>
         <w:rPr>
           <w:b w:val="0"/>
@@ -25452,7 +25472,7 @@
         <w:pStyle w:val="Ttulo1"/>
         <w:jc w:val="center"/>
       </w:pPr>
-      <w:bookmarkStart w:id="66" w:name="_Toc243083399"/>
+      <w:bookmarkStart w:id="66" w:name="_Toc243083870"/>
       <w:r>
         <w:lastRenderedPageBreak/>
         <w:t>APÊNDICE B – RELATÓRIOS DE DIAGNÓSTICO DOS TRÊS EXEMPLOS</w:t>
@@ -25473,7 +25493,7 @@
         <w:keepNext/>
         <w:spacing w:before="120" w:after="80"/>
       </w:pPr>
-      <w:bookmarkStart w:id="67" w:name="_Toc243083407"/>
+      <w:bookmarkStart w:id="67" w:name="_Toc243083878"/>
       <w:r>
         <w:rPr>
           <w:b w:val="0"/>
@@ -25552,7 +25572,7 @@
           <w:noProof/>
         </w:rPr>
         <w:drawing>
-          <wp:inline distT="0" distB="0" distL="0" distR="0" wp14:anchorId="0A440199" wp14:editId="6DFE01A7">
+          <wp:inline distT="0" distB="0" distL="0" distR="0" wp14:anchorId="29BB164D" wp14:editId="095351DB">
             <wp:extent cx="5760000" cy="5348160"/>
             <wp:effectExtent l="0" t="0" r="0" b="0"/>
             <wp:docPr id="6" name="Picture 6"/>
@@ -25605,7 +25625,7 @@
         <w:keepNext/>
         <w:spacing w:before="120" w:after="80"/>
       </w:pPr>
-      <w:bookmarkStart w:id="68" w:name="_Toc243083408"/>
+      <w:bookmarkStart w:id="68" w:name="_Toc243083879"/>
       <w:r>
         <w:rPr>
           <w:b w:val="0"/>
@@ -25677,7 +25697,7 @@
           <w:noProof/>
         </w:rPr>
         <w:drawing>
-          <wp:inline distT="0" distB="0" distL="0" distR="0" wp14:anchorId="449250EA" wp14:editId="3C36F48E">
+          <wp:inline distT="0" distB="0" distL="0" distR="0" wp14:anchorId="5C77F5C8" wp14:editId="011CCE7B">
             <wp:extent cx="5760000" cy="4708800"/>
             <wp:effectExtent l="0" t="0" r="0" b="0"/>
             <wp:docPr id="7" name="Picture 7"/>
@@ -25730,7 +25750,7 @@
         <w:keepNext/>
         <w:spacing w:before="120" w:after="80"/>
       </w:pPr>
-      <w:bookmarkStart w:id="69" w:name="_Toc243083409"/>
+      <w:bookmarkStart w:id="69" w:name="_Toc243083880"/>
       <w:r>
         <w:rPr>
           <w:b w:val="0"/>
@@ -25802,7 +25822,7 @@
           <w:noProof/>
         </w:rPr>
         <w:drawing>
-          <wp:inline distT="0" distB="0" distL="0" distR="0" wp14:anchorId="2350B35F" wp14:editId="69FDF76F">
+          <wp:inline distT="0" distB="0" distL="0" distR="0" wp14:anchorId="4929E979" wp14:editId="67EEA7EA">
             <wp:extent cx="5760000" cy="6926400"/>
             <wp:effectExtent l="0" t="0" r="0" b="0"/>
             <wp:docPr id="8" name="Picture 8"/>
@@ -25855,7 +25875,7 @@
         <w:keepNext/>
         <w:spacing w:before="120" w:after="80"/>
       </w:pPr>
-      <w:bookmarkStart w:id="70" w:name="_Toc243083410"/>
+      <w:bookmarkStart w:id="70" w:name="_Toc243083881"/>
       <w:r>
         <w:rPr>
           <w:b w:val="0"/>
@@ -25935,7 +25955,7 @@
           <w:noProof/>
         </w:rPr>
         <w:drawing>
-          <wp:inline distT="0" distB="0" distL="0" distR="0" wp14:anchorId="4F0A58CE" wp14:editId="5AFDBDDC">
+          <wp:inline distT="0" distB="0" distL="0" distR="0" wp14:anchorId="49ACA2F6" wp14:editId="7EF480DE">
             <wp:extent cx="5760000" cy="3729600"/>
             <wp:effectExtent l="0" t="0" r="0" b="0"/>
             <wp:docPr id="9" name="Picture 9"/>
@@ -25988,7 +26008,7 @@
         <w:keepNext/>
         <w:spacing w:before="120" w:after="80"/>
       </w:pPr>
-      <w:bookmarkStart w:id="71" w:name="_Toc243083411"/>
+      <w:bookmarkStart w:id="71" w:name="_Toc243083882"/>
       <w:r>
         <w:rPr>
           <w:b w:val="0"/>
@@ -26060,7 +26080,7 @@
           <w:noProof/>
         </w:rPr>
         <w:drawing>
-          <wp:inline distT="0" distB="0" distL="0" distR="0" wp14:anchorId="536997C2" wp14:editId="14EFCA77">
+          <wp:inline distT="0" distB="0" distL="0" distR="0" wp14:anchorId="0500CC1F" wp14:editId="0AA38453">
             <wp:extent cx="5760000" cy="5785920"/>
             <wp:effectExtent l="0" t="0" r="0" b="0"/>
             <wp:docPr id="10" name="Picture 10"/>
@@ -26113,7 +26133,7 @@
         <w:keepNext/>
         <w:spacing w:before="120" w:after="80"/>
       </w:pPr>
-      <w:bookmarkStart w:id="72" w:name="_Toc243083412"/>
+      <w:bookmarkStart w:id="72" w:name="_Toc243083883"/>
       <w:r>
         <w:rPr>
           <w:b w:val="0"/>
@@ -26185,7 +26205,7 @@
           <w:noProof/>
         </w:rPr>
         <w:drawing>
-          <wp:inline distT="0" distB="0" distL="0" distR="0" wp14:anchorId="4E36FAAA" wp14:editId="2E3B37E1">
+          <wp:inline distT="0" distB="0" distL="0" distR="0" wp14:anchorId="3E182D6F" wp14:editId="4093C787">
             <wp:extent cx="5760000" cy="3729600"/>
             <wp:effectExtent l="0" t="0" r="0" b="0"/>
             <wp:docPr id="11" name="Picture 11"/>
@@ -26237,7 +26257,7 @@
         <w:pStyle w:val="Ttulo1"/>
         <w:jc w:val="center"/>
       </w:pPr>
-      <w:bookmarkStart w:id="73" w:name="_Toc243083400"/>
+      <w:bookmarkStart w:id="73" w:name="_Toc243083871"/>
       <w:r>
         <w:lastRenderedPageBreak/>
         <w:t>APÊNDICE C – ESTRATÉGIAS DE BUSCA BIBLIOGRÁFICA</w:t>
@@ -26258,7 +26278,7 @@
         <w:keepNext/>
         <w:spacing w:before="120" w:after="80"/>
       </w:pPr>
-      <w:bookmarkStart w:id="74" w:name="_Toc243083428"/>
+      <w:bookmarkStart w:id="74" w:name="_Toc243083899"/>
       <w:r>
         <w:rPr>
           <w:b w:val="0"/>
@@ -27195,7 +27215,7 @@
         <w:pStyle w:val="Ttulo1"/>
         <w:jc w:val="center"/>
       </w:pPr>
-      <w:bookmarkStart w:id="75" w:name="_Toc243083401"/>
+      <w:bookmarkStart w:id="75" w:name="_Toc243083872"/>
       <w:r>
         <w:lastRenderedPageBreak/>
         <w:t xml:space="preserve">APÊNDICE D – GANHO DE </w:t>
@@ -27231,7 +27251,7 @@
         <w:keepNext/>
         <w:spacing w:before="120" w:after="80"/>
       </w:pPr>
-      <w:bookmarkStart w:id="76" w:name="_Toc243083429"/>
+      <w:bookmarkStart w:id="76" w:name="_Toc243083900"/>
       <w:r>
         <w:rPr>
           <w:b w:val="0"/>
@@ -29376,31 +29396,31 @@
       </w:rPr>
     </w:lvl>
   </w:abstractNum>
-  <w:num w:numId="1" w16cid:durableId="2061590716">
+  <w:num w:numId="1" w16cid:durableId="1717967800">
     <w:abstractNumId w:val="8"/>
   </w:num>
-  <w:num w:numId="2" w16cid:durableId="1632634619">
+  <w:num w:numId="2" w16cid:durableId="1298148737">
     <w:abstractNumId w:val="6"/>
   </w:num>
-  <w:num w:numId="3" w16cid:durableId="2041583033">
+  <w:num w:numId="3" w16cid:durableId="1814443041">
     <w:abstractNumId w:val="5"/>
   </w:num>
-  <w:num w:numId="4" w16cid:durableId="244413309">
+  <w:num w:numId="4" w16cid:durableId="1434981959">
     <w:abstractNumId w:val="4"/>
   </w:num>
-  <w:num w:numId="5" w16cid:durableId="1488471170">
+  <w:num w:numId="5" w16cid:durableId="954024363">
     <w:abstractNumId w:val="7"/>
   </w:num>
-  <w:num w:numId="6" w16cid:durableId="1079711288">
+  <w:num w:numId="6" w16cid:durableId="136651707">
     <w:abstractNumId w:val="3"/>
   </w:num>
-  <w:num w:numId="7" w16cid:durableId="278806398">
+  <w:num w:numId="7" w16cid:durableId="968587418">
     <w:abstractNumId w:val="2"/>
   </w:num>
-  <w:num w:numId="8" w16cid:durableId="1365986081">
+  <w:num w:numId="8" w16cid:durableId="1615284553">
     <w:abstractNumId w:val="1"/>
   </w:num>
-  <w:num w:numId="9" w16cid:durableId="1241256449">
+  <w:num w:numId="9" w16cid:durableId="246233656">
     <w:abstractNumId w:val="0"/>
   </w:num>
 </w:numbering>
@@ -40824,14 +40844,14 @@
     <w:next w:val="Normal"/>
     <w:uiPriority w:val="99"/>
     <w:unhideWhenUsed/>
-    <w:rsid w:val="00324579"/>
+    <w:rsid w:val="00DF5DF4"/>
   </w:style>
   <w:style w:type="character" w:styleId="Hyperlink">
     <w:name w:val="Hyperlink"/>
     <w:basedOn w:val="Fontepargpadro"/>
     <w:uiPriority w:val="99"/>
     <w:unhideWhenUsed/>
-    <w:rsid w:val="00324579"/>
+    <w:rsid w:val="00DF5DF4"/>
     <w:rPr>
       <w:color w:val="0000FF" w:themeColor="hyperlink"/>
       <w:u w:val="single"/>
@@ -40844,7 +40864,7 @@
     <w:autoRedefine/>
     <w:uiPriority w:val="39"/>
     <w:unhideWhenUsed/>
-    <w:rsid w:val="00324579"/>
+    <w:rsid w:val="00DF5DF4"/>
     <w:pPr>
       <w:spacing w:after="100"/>
     </w:pPr>
@@ -40856,7 +40876,7 @@
     <w:autoRedefine/>
     <w:uiPriority w:val="39"/>
     <w:unhideWhenUsed/>
-    <w:rsid w:val="00324579"/>
+    <w:rsid w:val="00DF5DF4"/>
     <w:pPr>
       <w:spacing w:after="100"/>
       <w:ind w:left="240"/>

</xml_diff>